<commit_message>
Cambios Objetivos Especificos 1.5
</commit_message>
<xml_diff>
--- a/Capstone/Fase 1/1.5_GuiaEstudiante_Fase 1_Definicion Proyecto APT.docx
+++ b/Capstone/Fase 1/1.5_GuiaEstudiante_Fase 1_Definicion Proyecto APT.docx
@@ -228,47 +228,101 @@
               </wp:anchor>
             </w:drawing>
           </mc:Choice>
-          <mc:Fallback xmlns:cr="http://schemas.microsoft.com/office/comments/2020/reactions" xmlns="http://schemas.microsoft.com/office/tasks/2019/documenttasks" xmlns:dgm="http://schemas.openxmlformats.org/drawingml/2006/diagram" xmlns:lc="http://schemas.openxmlformats.org/drawingml/2006/lockedCanvas" xmlns:c="http://schemas.openxmlformats.org/drawingml/2006/chart" xmlns:pic="http://schemas.openxmlformats.org/drawingml/2006/picture" xmlns:a="http://schemas.openxmlformats.org/drawingml/2006/main" xmlns:sl="http://schemas.openxmlformats.org/schemaLibrary/2006/main">
-            <w:drawing>
-              <wp:anchor allowOverlap="1" behindDoc="0" distB="0" distT="0" distL="114300" distR="114300" hidden="0" layoutInCell="1" locked="0" relativeHeight="0" simplePos="0">
-                <wp:simplePos x="0" y="0"/>
-                <wp:positionH relativeFrom="column">
-                  <wp:posOffset>-435397</wp:posOffset>
-                </wp:positionH>
-                <wp:positionV relativeFrom="paragraph">
-                  <wp:posOffset>33444</wp:posOffset>
-                </wp:positionV>
-                <wp:extent cx="6580505" cy="1486535"/>
-                <wp:effectExtent b="0" l="0" r="0" t="0"/>
-                <wp:wrapNone/>
-                <wp:docPr id="50" name="image2.png"/>
-                <a:graphic>
-                  <a:graphicData uri="http://schemas.openxmlformats.org/drawingml/2006/picture">
-                    <pic:pic>
-                      <pic:nvPicPr>
-                        <pic:cNvPr id="0" name="image2.png"/>
-                        <pic:cNvPicPr preferRelativeResize="0"/>
-                      </pic:nvPicPr>
-                      <pic:blipFill>
-                        <a:blip r:embed="rId8"/>
-                        <a:srcRect/>
-                        <a:stretch>
-                          <a:fillRect/>
-                        </a:stretch>
-                      </pic:blipFill>
-                      <pic:spPr>
-                        <a:xfrm>
-                          <a:off x="0" y="0"/>
-                          <a:ext cx="6580505" cy="1486535"/>
-                        </a:xfrm>
-                        <a:prstGeom prst="rect"/>
-                        <a:ln/>
-                      </pic:spPr>
-                    </pic:pic>
-                  </a:graphicData>
-                </a:graphic>
-              </wp:anchor>
-            </w:drawing>
+          <mc:Fallback>
+            <w:pict>
+              <v:group w14:anchorId="421BF155" id="Grupo 50" o:spid="_x0000_s1026" style="position:absolute;margin-left:-34.3pt;margin-top:2.65pt;width:518.15pt;height:117.05pt;z-index:251658240" coordorigin="20557,30367" coordsize="65805,14865" o:gfxdata="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">
+                <v:group id="Grupo 519026344" o:spid="_x0000_s1027" style="position:absolute;left:20557;top:30367;width:65805;height:14865" coordorigin="20557,30367" coordsize="65805,14865" o:gfxdata="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">
+                  <v:rect id="Rectángulo 1695655511" o:spid="_x0000_s1028" style="position:absolute;left:20557;top:30367;width:65805;height:14865;visibility:visible;mso-wrap-style:square;v-text-anchor:middle" o:gfxdata="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" filled="f" stroked="f">
+                    <v:textbox inset="2.53958mm,2.53958mm,2.53958mm,2.53958mm">
+                      <w:txbxContent>
+                        <w:p>
+                          <w:pPr>
+                            <w:spacing w:after="0" w:line="240" w:lineRule="auto"/>
+                            <w:textDirection w:val="btLr"/>
+                          </w:pPr>
+                        </w:p>
+                      </w:txbxContent>
+                    </v:textbox>
+                  </v:rect>
+                  <v:group id="Grupo 759712461" o:spid="_x0000_s1029" style="position:absolute;left:20557;top:30367;width:65805;height:14865" coordsize="59034,14868" o:gfxdata="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">
+                    <v:rect id="Rectángulo 1925025504" o:spid="_x0000_s1030" style="position:absolute;width:59034;height:14868;visibility:visible;mso-wrap-style:square;v-text-anchor:middle" o:gfxdata="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" filled="f" stroked="f">
+                      <v:textbox inset="2.53958mm,2.53958mm,2.53958mm,2.53958mm">
+                        <w:txbxContent>
+                          <w:p>
+                            <w:pPr>
+                              <w:spacing w:after="0" w:line="240" w:lineRule="auto"/>
+                              <w:textDirection w:val="btLr"/>
+                            </w:pPr>
+                          </w:p>
+                        </w:txbxContent>
+                      </v:textbox>
+                    </v:rect>
+                    <v:rect id="Rectángulo 1602987639" o:spid="_x0000_s1031" style="position:absolute;left:10247;top:2391;width:48787;height:12363;visibility:visible;mso-wrap-style:square;v-text-anchor:top" o:gfxdata="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" filled="f" stroked="f">
+                      <v:textbox inset="2.53958mm,1.2694mm,2.53958mm,1.2694mm">
+                        <w:txbxContent>
+                          <w:p>
+                            <w:pPr>
+                              <w:spacing w:after="0" w:line="240" w:lineRule="auto"/>
+                              <w:textDirection w:val="btLr"/>
+                            </w:pPr>
+                          </w:p>
+                          <w:p>
+                            <w:pPr>
+                              <w:spacing w:after="0" w:line="240" w:lineRule="auto"/>
+                              <w:textDirection w:val="btLr"/>
+                            </w:pPr>
+                            <w:r>
+                              <w:rPr>
+                                <w:b/>
+                                <w:color w:val="1F3864"/>
+                                <w:sz w:val="48"/>
+                              </w:rPr>
+                              <w:t xml:space="preserve">Guía1. Definición Proyecto APT </w:t>
+                            </w:r>
+                          </w:p>
+                          <w:p>
+                            <w:pPr>
+                              <w:spacing w:after="0" w:line="240" w:lineRule="auto"/>
+                              <w:textDirection w:val="btLr"/>
+                            </w:pPr>
+                            <w:r>
+                              <w:rPr>
+                                <w:b/>
+                                <w:color w:val="1F3864"/>
+                                <w:sz w:val="48"/>
+                              </w:rPr>
+                              <w:t xml:space="preserve">Asignatura </w:t>
+                            </w:r>
+                            <w:proofErr w:type="spellStart"/>
+                            <w:r>
+                              <w:rPr>
+                                <w:b/>
+                                <w:color w:val="1F3864"/>
+                                <w:sz w:val="48"/>
+                              </w:rPr>
+                              <w:t>Capstone</w:t>
+                            </w:r>
+                            <w:proofErr w:type="spellEnd"/>
+                          </w:p>
+                        </w:txbxContent>
+                      </v:textbox>
+                    </v:rect>
+                    <v:rect id="Rectángulo 1534757086" o:spid="_x0000_s1032" style="position:absolute;width:9931;height:14868;visibility:visible;mso-wrap-style:square;v-text-anchor:middle" o:gfxdata="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" fillcolor="#1f3864" stroked="f">
+                      <v:textbox inset="2.53958mm,2.53958mm,2.53958mm,2.53958mm">
+                        <w:txbxContent>
+                          <w:p>
+                            <w:pPr>
+                              <w:spacing w:after="0" w:line="240" w:lineRule="auto"/>
+                              <w:textDirection w:val="btLr"/>
+                            </w:pPr>
+                          </w:p>
+                        </w:txbxContent>
+                      </v:textbox>
+                    </v:rect>
+                  </v:group>
+                </v:group>
+              </v:group>
+            </w:pict>
           </mc:Fallback>
         </mc:AlternateContent>
       </w:r>
@@ -1763,151 +1817,671 @@
           </w:tcPr>
           <w:p>
             <w:pPr>
+              <w:jc w:val="both"/>
+              <w:rPr>
+                <w:b/>
+                <w:bCs/>
+                <w:iCs/>
+                <w:color w:val="548DD4"/>
+                <w:sz w:val="20"/>
+                <w:szCs w:val="20"/>
+              </w:rPr>
+            </w:pPr>
+          </w:p>
+          <w:p>
+            <w:pPr>
+              <w:jc w:val="both"/>
+              <w:rPr>
+                <w:b/>
+                <w:bCs/>
+                <w:iCs/>
+                <w:color w:val="548DD4"/>
+                <w:sz w:val="20"/>
+                <w:szCs w:val="20"/>
+              </w:rPr>
+            </w:pPr>
+            <w:r>
+              <w:rPr>
+                <w:b/>
+                <w:bCs/>
+                <w:iCs/>
+                <w:color w:val="548DD4"/>
+                <w:sz w:val="20"/>
+                <w:szCs w:val="20"/>
+              </w:rPr>
+              <w:t xml:space="preserve">1.- </w:t>
+            </w:r>
+            <w:r>
+              <w:rPr>
+                <w:b/>
+                <w:bCs/>
+                <w:iCs/>
+                <w:color w:val="548DD4"/>
+                <w:sz w:val="20"/>
+                <w:szCs w:val="20"/>
+              </w:rPr>
+              <w:t>Analizar la problemática y definir requisitos funcionales</w:t>
+            </w:r>
+          </w:p>
+          <w:p>
+            <w:pPr>
+              <w:pStyle w:val="Prrafodelista"/>
               <w:numPr>
                 <w:ilvl w:val="0"/>
-                <w:numId w:val="8"/>
+                <w:numId w:val="12"/>
               </w:numPr>
-              <w:spacing w:after="0"/>
               <w:jc w:val="both"/>
               <w:rPr>
-                <w:i/>
-                <w:color w:val="548DD4"/>
-                <w:sz w:val="20"/>
-                <w:szCs w:val="20"/>
-              </w:rPr>
-            </w:pPr>
-            <w:r>
-              <w:rPr>
-                <w:i/>
-                <w:color w:val="548DD4"/>
-                <w:sz w:val="20"/>
-                <w:szCs w:val="20"/>
-              </w:rPr>
-              <w:t>Analizar la problemática de adherencia a los tratamientos médicos y definir los requisitos funcionales de la aplicación.</w:t>
-            </w:r>
-          </w:p>
-          <w:p>
-            <w:pPr>
+                <w:iCs/>
+                <w:color w:val="548DD4"/>
+                <w:sz w:val="20"/>
+                <w:szCs w:val="20"/>
+              </w:rPr>
+            </w:pPr>
+            <w:r>
+              <w:rPr>
+                <w:b/>
+                <w:bCs/>
+                <w:iCs/>
+                <w:color w:val="548DD4"/>
+                <w:sz w:val="20"/>
+                <w:szCs w:val="20"/>
+              </w:rPr>
+              <w:t>Acción:</w:t>
+            </w:r>
+            <w:r>
+              <w:rPr>
+                <w:iCs/>
+                <w:color w:val="548DD4"/>
+                <w:sz w:val="20"/>
+                <w:szCs w:val="20"/>
+              </w:rPr>
+              <w:t xml:space="preserve"> Investigar las dificultades en la toma eficaz de medicamentos en adultos mayores y personas con polifarmacia, elaborando un documento de requisitos funcionales.</w:t>
+            </w:r>
+          </w:p>
+          <w:p>
+            <w:pPr>
+              <w:pStyle w:val="Prrafodelista"/>
               <w:numPr>
                 <w:ilvl w:val="0"/>
-                <w:numId w:val="8"/>
+                <w:numId w:val="12"/>
               </w:numPr>
-              <w:spacing w:after="0"/>
               <w:jc w:val="both"/>
               <w:rPr>
-                <w:i/>
-                <w:color w:val="548DD4"/>
-                <w:sz w:val="20"/>
-                <w:szCs w:val="20"/>
-              </w:rPr>
-            </w:pPr>
-            <w:r>
-              <w:rPr>
-                <w:i/>
-                <w:color w:val="548DD4"/>
-                <w:sz w:val="20"/>
-                <w:szCs w:val="20"/>
-              </w:rPr>
-              <w:t>Diseñar la estructura de la base de datos para el registro de usuarios, medicamentos, dosis y horarios.</w:t>
-            </w:r>
-          </w:p>
-          <w:p>
-            <w:pPr>
+                <w:iCs/>
+                <w:color w:val="548DD4"/>
+                <w:sz w:val="20"/>
+                <w:szCs w:val="20"/>
+              </w:rPr>
+            </w:pPr>
+            <w:r>
+              <w:rPr>
+                <w:b/>
+                <w:bCs/>
+                <w:iCs/>
+                <w:color w:val="548DD4"/>
+                <w:sz w:val="20"/>
+                <w:szCs w:val="20"/>
+              </w:rPr>
+              <w:t>Verificación:</w:t>
+            </w:r>
+            <w:r>
+              <w:rPr>
+                <w:iCs/>
+                <w:color w:val="548DD4"/>
+                <w:sz w:val="20"/>
+                <w:szCs w:val="20"/>
+              </w:rPr>
+              <w:t xml:space="preserve"> Validación del documento por el equipo de trabajo y comparación con la problemática planteada.</w:t>
+            </w:r>
+          </w:p>
+          <w:p>
+            <w:pPr>
+              <w:jc w:val="both"/>
+              <w:rPr>
+                <w:b/>
+                <w:bCs/>
+                <w:iCs/>
+                <w:color w:val="548DD4"/>
+                <w:sz w:val="20"/>
+                <w:szCs w:val="20"/>
+              </w:rPr>
+            </w:pPr>
+            <w:r>
+              <w:rPr>
+                <w:b/>
+                <w:bCs/>
+                <w:iCs/>
+                <w:color w:val="548DD4"/>
+                <w:sz w:val="20"/>
+                <w:szCs w:val="20"/>
+              </w:rPr>
+              <w:t xml:space="preserve">2.- </w:t>
+            </w:r>
+            <w:r>
+              <w:rPr>
+                <w:b/>
+                <w:bCs/>
+                <w:iCs/>
+                <w:color w:val="548DD4"/>
+                <w:sz w:val="20"/>
+                <w:szCs w:val="20"/>
+              </w:rPr>
+              <w:t>Diseñar la estructura de la base de datos</w:t>
+            </w:r>
+          </w:p>
+          <w:p>
+            <w:pPr>
+              <w:pStyle w:val="Prrafodelista"/>
               <w:numPr>
                 <w:ilvl w:val="0"/>
-                <w:numId w:val="6"/>
+                <w:numId w:val="13"/>
               </w:numPr>
-              <w:spacing w:after="0"/>
               <w:jc w:val="both"/>
               <w:rPr>
-                <w:i/>
-                <w:color w:val="548DD4"/>
-                <w:sz w:val="20"/>
-                <w:szCs w:val="20"/>
-              </w:rPr>
-            </w:pPr>
-            <w:r>
-              <w:rPr>
-                <w:i/>
-                <w:color w:val="548DD4"/>
-                <w:sz w:val="20"/>
-                <w:szCs w:val="20"/>
-              </w:rPr>
-              <w:t>Desarrollar la aplicación móvil implementando las funciones principales: registro de medicamentos, generación de alertas y notificaciones.</w:t>
-            </w:r>
-          </w:p>
-          <w:p>
-            <w:pPr>
+                <w:iCs/>
+                <w:color w:val="548DD4"/>
+                <w:sz w:val="20"/>
+                <w:szCs w:val="20"/>
+              </w:rPr>
+            </w:pPr>
+            <w:r>
+              <w:rPr>
+                <w:b/>
+                <w:bCs/>
+                <w:iCs/>
+                <w:color w:val="548DD4"/>
+                <w:sz w:val="20"/>
+                <w:szCs w:val="20"/>
+              </w:rPr>
+              <w:t>Acción:</w:t>
+            </w:r>
+            <w:r>
+              <w:rPr>
+                <w:iCs/>
+                <w:color w:val="548DD4"/>
+                <w:sz w:val="20"/>
+                <w:szCs w:val="20"/>
+              </w:rPr>
+              <w:t xml:space="preserve"> Crear un modelo de base de datos que registre usuarios, medicamentos, dosis y horarios.</w:t>
+            </w:r>
+          </w:p>
+          <w:p>
+            <w:pPr>
+              <w:pStyle w:val="Prrafodelista"/>
               <w:numPr>
                 <w:ilvl w:val="0"/>
-                <w:numId w:val="4"/>
+                <w:numId w:val="13"/>
               </w:numPr>
-              <w:spacing w:after="0"/>
               <w:jc w:val="both"/>
               <w:rPr>
-                <w:i/>
-                <w:color w:val="548DD4"/>
-                <w:sz w:val="20"/>
-                <w:szCs w:val="20"/>
-              </w:rPr>
-            </w:pPr>
-            <w:r>
-              <w:rPr>
-                <w:i/>
-                <w:color w:val="548DD4"/>
-                <w:sz w:val="20"/>
-                <w:szCs w:val="20"/>
-              </w:rPr>
-              <w:t>Incorporar la opción de envío de alertas a cuidadores o familiares para reforzar el acompañamiento en la toma de medicamentos.</w:t>
-            </w:r>
-          </w:p>
-          <w:p>
-            <w:pPr>
+                <w:iCs/>
+                <w:color w:val="548DD4"/>
+                <w:sz w:val="20"/>
+                <w:szCs w:val="20"/>
+              </w:rPr>
+            </w:pPr>
+            <w:r>
+              <w:rPr>
+                <w:b/>
+                <w:bCs/>
+                <w:iCs/>
+                <w:color w:val="548DD4"/>
+                <w:sz w:val="20"/>
+                <w:szCs w:val="20"/>
+              </w:rPr>
+              <w:t>Verificación:</w:t>
+            </w:r>
+            <w:r>
+              <w:rPr>
+                <w:iCs/>
+                <w:color w:val="548DD4"/>
+                <w:sz w:val="20"/>
+                <w:szCs w:val="20"/>
+              </w:rPr>
+              <w:t xml:space="preserve"> Implementación de al menos 4 entidades principales con relaciones correctas, probadas mediante consultas funcionales.</w:t>
+            </w:r>
+          </w:p>
+          <w:p>
+            <w:pPr>
+              <w:jc w:val="both"/>
+              <w:rPr>
+                <w:b/>
+                <w:bCs/>
+                <w:iCs/>
+                <w:color w:val="548DD4"/>
+                <w:sz w:val="20"/>
+                <w:szCs w:val="20"/>
+              </w:rPr>
+            </w:pPr>
+            <w:r>
+              <w:rPr>
+                <w:b/>
+                <w:bCs/>
+                <w:iCs/>
+                <w:color w:val="548DD4"/>
+                <w:sz w:val="20"/>
+                <w:szCs w:val="20"/>
+              </w:rPr>
+              <w:t xml:space="preserve">3.- </w:t>
+            </w:r>
+            <w:r>
+              <w:rPr>
+                <w:b/>
+                <w:bCs/>
+                <w:iCs/>
+                <w:color w:val="548DD4"/>
+                <w:sz w:val="20"/>
+                <w:szCs w:val="20"/>
+              </w:rPr>
+              <w:t>Desarrollar la aplicación móvil con funciones principales</w:t>
+            </w:r>
+          </w:p>
+          <w:p>
+            <w:pPr>
+              <w:pStyle w:val="Prrafodelista"/>
               <w:numPr>
                 <w:ilvl w:val="0"/>
-                <w:numId w:val="4"/>
+                <w:numId w:val="14"/>
               </w:numPr>
-              <w:spacing w:after="0"/>
               <w:jc w:val="both"/>
               <w:rPr>
-                <w:i/>
-                <w:color w:val="548DD4"/>
-                <w:sz w:val="20"/>
-                <w:szCs w:val="20"/>
-              </w:rPr>
-            </w:pPr>
-            <w:r>
-              <w:rPr>
-                <w:i/>
-                <w:color w:val="548DD4"/>
-                <w:sz w:val="20"/>
-                <w:szCs w:val="20"/>
-              </w:rPr>
-              <w:t>Probar y validar la aplicación con casos de uso simulados, asegurando su correcto funcionamiento y usabilidad.</w:t>
-            </w:r>
-          </w:p>
-          <w:p>
-            <w:pPr>
+                <w:iCs/>
+                <w:color w:val="548DD4"/>
+                <w:sz w:val="20"/>
+                <w:szCs w:val="20"/>
+              </w:rPr>
+            </w:pPr>
+            <w:r>
+              <w:rPr>
+                <w:b/>
+                <w:bCs/>
+                <w:iCs/>
+                <w:color w:val="548DD4"/>
+                <w:sz w:val="20"/>
+                <w:szCs w:val="20"/>
+              </w:rPr>
+              <w:t>Acción:</w:t>
+            </w:r>
+            <w:r>
+              <w:rPr>
+                <w:iCs/>
+                <w:color w:val="548DD4"/>
+                <w:sz w:val="20"/>
+                <w:szCs w:val="20"/>
+              </w:rPr>
+              <w:t xml:space="preserve"> Programar los módulos de registro de medicamentos, generación de alertas y notificaciones.</w:t>
+            </w:r>
+          </w:p>
+          <w:p>
+            <w:pPr>
+              <w:pStyle w:val="Prrafodelista"/>
               <w:numPr>
                 <w:ilvl w:val="0"/>
-                <w:numId w:val="7"/>
+                <w:numId w:val="14"/>
               </w:numPr>
               <w:jc w:val="both"/>
               <w:rPr>
-                <w:i/>
-                <w:color w:val="548DD4"/>
-                <w:sz w:val="20"/>
-                <w:szCs w:val="20"/>
-              </w:rPr>
-            </w:pPr>
-            <w:r>
-              <w:rPr>
-                <w:i/>
-                <w:color w:val="548DD4"/>
-                <w:sz w:val="20"/>
-                <w:szCs w:val="20"/>
-              </w:rPr>
-              <w:t>Documentar el proceso de desarrollo y los resultados obtenidos para evaluar el cumplimiento de los objetivos planteados.</w:t>
+                <w:iCs/>
+                <w:color w:val="548DD4"/>
+                <w:sz w:val="20"/>
+                <w:szCs w:val="20"/>
+              </w:rPr>
+            </w:pPr>
+            <w:r>
+              <w:rPr>
+                <w:b/>
+                <w:bCs/>
+                <w:iCs/>
+                <w:color w:val="548DD4"/>
+                <w:sz w:val="20"/>
+                <w:szCs w:val="20"/>
+              </w:rPr>
+              <w:t>Verificación:</w:t>
+            </w:r>
+            <w:r>
+              <w:rPr>
+                <w:iCs/>
+                <w:color w:val="548DD4"/>
+                <w:sz w:val="20"/>
+                <w:szCs w:val="20"/>
+              </w:rPr>
+              <w:t xml:space="preserve"> Permitir el registro de al menos 10 medicamentos y comprobar que las notificaciones se activen en un simulador móvil.</w:t>
+            </w:r>
+          </w:p>
+          <w:p>
+            <w:pPr>
+              <w:jc w:val="both"/>
+              <w:rPr>
+                <w:b/>
+                <w:bCs/>
+                <w:iCs/>
+                <w:color w:val="548DD4"/>
+                <w:sz w:val="20"/>
+                <w:szCs w:val="20"/>
+              </w:rPr>
+            </w:pPr>
+          </w:p>
+          <w:p>
+            <w:pPr>
+              <w:jc w:val="both"/>
+              <w:rPr>
+                <w:b/>
+                <w:bCs/>
+                <w:iCs/>
+                <w:color w:val="548DD4"/>
+                <w:sz w:val="20"/>
+                <w:szCs w:val="20"/>
+              </w:rPr>
+            </w:pPr>
+            <w:r>
+              <w:rPr>
+                <w:b/>
+                <w:bCs/>
+                <w:iCs/>
+                <w:color w:val="548DD4"/>
+                <w:sz w:val="20"/>
+                <w:szCs w:val="20"/>
+              </w:rPr>
+              <w:lastRenderedPageBreak/>
+              <w:t xml:space="preserve">4.- </w:t>
+            </w:r>
+            <w:r>
+              <w:rPr>
+                <w:b/>
+                <w:bCs/>
+                <w:iCs/>
+                <w:color w:val="548DD4"/>
+                <w:sz w:val="20"/>
+                <w:szCs w:val="20"/>
+              </w:rPr>
+              <w:t>Incorporar alertas a cuidadores o familiares</w:t>
+            </w:r>
+          </w:p>
+          <w:p>
+            <w:pPr>
+              <w:pStyle w:val="Prrafodelista"/>
+              <w:numPr>
+                <w:ilvl w:val="0"/>
+                <w:numId w:val="15"/>
+              </w:numPr>
+              <w:jc w:val="both"/>
+              <w:rPr>
+                <w:iCs/>
+                <w:color w:val="548DD4"/>
+                <w:sz w:val="20"/>
+                <w:szCs w:val="20"/>
+              </w:rPr>
+            </w:pPr>
+            <w:r>
+              <w:rPr>
+                <w:b/>
+                <w:bCs/>
+                <w:iCs/>
+                <w:color w:val="548DD4"/>
+                <w:sz w:val="20"/>
+                <w:szCs w:val="20"/>
+              </w:rPr>
+              <w:t>Acción:</w:t>
+            </w:r>
+            <w:r>
+              <w:rPr>
+                <w:iCs/>
+                <w:color w:val="548DD4"/>
+                <w:sz w:val="20"/>
+                <w:szCs w:val="20"/>
+              </w:rPr>
+              <w:t xml:space="preserve"> Implementar una funcionalidad que envíe notificaciones a un contacto externo cuando el usuario no confirme la toma.</w:t>
+            </w:r>
+          </w:p>
+          <w:p>
+            <w:pPr>
+              <w:pStyle w:val="Prrafodelista"/>
+              <w:numPr>
+                <w:ilvl w:val="0"/>
+                <w:numId w:val="15"/>
+              </w:numPr>
+              <w:jc w:val="both"/>
+              <w:rPr>
+                <w:iCs/>
+                <w:color w:val="548DD4"/>
+                <w:sz w:val="20"/>
+                <w:szCs w:val="20"/>
+              </w:rPr>
+            </w:pPr>
+            <w:r>
+              <w:rPr>
+                <w:b/>
+                <w:bCs/>
+                <w:iCs/>
+                <w:color w:val="548DD4"/>
+                <w:sz w:val="20"/>
+                <w:szCs w:val="20"/>
+              </w:rPr>
+              <w:t>Verificación:</w:t>
+            </w:r>
+            <w:r>
+              <w:rPr>
+                <w:iCs/>
+                <w:color w:val="548DD4"/>
+                <w:sz w:val="20"/>
+                <w:szCs w:val="20"/>
+              </w:rPr>
+              <w:t xml:space="preserve"> Realizar pruebas en las que al menos un usuario externo reciba las alertas en condiciones simuladas.</w:t>
+            </w:r>
+          </w:p>
+          <w:p>
+            <w:pPr>
+              <w:jc w:val="both"/>
+              <w:rPr>
+                <w:b/>
+                <w:bCs/>
+                <w:iCs/>
+                <w:color w:val="548DD4"/>
+                <w:sz w:val="20"/>
+                <w:szCs w:val="20"/>
+              </w:rPr>
+            </w:pPr>
+            <w:r>
+              <w:rPr>
+                <w:b/>
+                <w:bCs/>
+                <w:iCs/>
+                <w:color w:val="548DD4"/>
+                <w:sz w:val="20"/>
+                <w:szCs w:val="20"/>
+              </w:rPr>
+              <w:t xml:space="preserve">5.- </w:t>
+            </w:r>
+            <w:r>
+              <w:rPr>
+                <w:b/>
+                <w:bCs/>
+                <w:iCs/>
+                <w:color w:val="548DD4"/>
+                <w:sz w:val="20"/>
+                <w:szCs w:val="20"/>
+              </w:rPr>
+              <w:t>Probar y validar la aplicación con casos simulados</w:t>
+            </w:r>
+          </w:p>
+          <w:p>
+            <w:pPr>
+              <w:pStyle w:val="Prrafodelista"/>
+              <w:numPr>
+                <w:ilvl w:val="0"/>
+                <w:numId w:val="16"/>
+              </w:numPr>
+              <w:jc w:val="both"/>
+              <w:rPr>
+                <w:iCs/>
+                <w:color w:val="548DD4"/>
+                <w:sz w:val="20"/>
+                <w:szCs w:val="20"/>
+              </w:rPr>
+            </w:pPr>
+            <w:r>
+              <w:rPr>
+                <w:b/>
+                <w:bCs/>
+                <w:iCs/>
+                <w:color w:val="548DD4"/>
+                <w:sz w:val="20"/>
+                <w:szCs w:val="20"/>
+              </w:rPr>
+              <w:t>Acción:</w:t>
+            </w:r>
+            <w:r>
+              <w:rPr>
+                <w:iCs/>
+                <w:color w:val="548DD4"/>
+                <w:sz w:val="20"/>
+                <w:szCs w:val="20"/>
+              </w:rPr>
+              <w:t xml:space="preserve"> Ejecutar pruebas funcionales y de usabilidad con distintos escenarios de uso.</w:t>
+            </w:r>
+          </w:p>
+          <w:p>
+            <w:pPr>
+              <w:pStyle w:val="Prrafodelista"/>
+              <w:numPr>
+                <w:ilvl w:val="0"/>
+                <w:numId w:val="16"/>
+              </w:numPr>
+              <w:jc w:val="both"/>
+              <w:rPr>
+                <w:iCs/>
+                <w:color w:val="548DD4"/>
+                <w:sz w:val="20"/>
+                <w:szCs w:val="20"/>
+              </w:rPr>
+            </w:pPr>
+            <w:r>
+              <w:rPr>
+                <w:b/>
+                <w:bCs/>
+                <w:iCs/>
+                <w:color w:val="548DD4"/>
+                <w:sz w:val="20"/>
+                <w:szCs w:val="20"/>
+              </w:rPr>
+              <w:t>Verificación:</w:t>
+            </w:r>
+            <w:r>
+              <w:rPr>
+                <w:iCs/>
+                <w:color w:val="548DD4"/>
+                <w:sz w:val="20"/>
+                <w:szCs w:val="20"/>
+              </w:rPr>
+              <w:t xml:space="preserve"> Aplicar al menos 5 casos de prueba documentados que aseguren correcto funcionamiento y facilidad de uso.</w:t>
+            </w:r>
+          </w:p>
+          <w:p>
+            <w:pPr>
+              <w:jc w:val="both"/>
+              <w:rPr>
+                <w:b/>
+                <w:bCs/>
+                <w:iCs/>
+                <w:color w:val="548DD4"/>
+                <w:sz w:val="20"/>
+                <w:szCs w:val="20"/>
+              </w:rPr>
+            </w:pPr>
+            <w:r>
+              <w:rPr>
+                <w:b/>
+                <w:bCs/>
+                <w:iCs/>
+                <w:color w:val="548DD4"/>
+                <w:sz w:val="20"/>
+                <w:szCs w:val="20"/>
+              </w:rPr>
+              <w:t xml:space="preserve">6.- </w:t>
+            </w:r>
+            <w:r>
+              <w:rPr>
+                <w:b/>
+                <w:bCs/>
+                <w:iCs/>
+                <w:color w:val="548DD4"/>
+                <w:sz w:val="20"/>
+                <w:szCs w:val="20"/>
+              </w:rPr>
+              <w:t>Documentar el proceso y los resultados obtenidos</w:t>
+            </w:r>
+          </w:p>
+          <w:p>
+            <w:pPr>
+              <w:pStyle w:val="Prrafodelista"/>
+              <w:numPr>
+                <w:ilvl w:val="0"/>
+                <w:numId w:val="17"/>
+              </w:numPr>
+              <w:jc w:val="both"/>
+              <w:rPr>
+                <w:iCs/>
+                <w:color w:val="548DD4"/>
+                <w:sz w:val="20"/>
+                <w:szCs w:val="20"/>
+              </w:rPr>
+            </w:pPr>
+            <w:r>
+              <w:rPr>
+                <w:b/>
+                <w:bCs/>
+                <w:iCs/>
+                <w:color w:val="548DD4"/>
+                <w:sz w:val="20"/>
+                <w:szCs w:val="20"/>
+              </w:rPr>
+              <w:t>Acción:</w:t>
+            </w:r>
+            <w:r>
+              <w:rPr>
+                <w:iCs/>
+                <w:color w:val="548DD4"/>
+                <w:sz w:val="20"/>
+                <w:szCs w:val="20"/>
+              </w:rPr>
+              <w:t xml:space="preserve"> Elaborar un informe con el detalle del desarrollo, pruebas y resultados alcanzados.</w:t>
+            </w:r>
+          </w:p>
+          <w:p>
+            <w:pPr>
+              <w:pStyle w:val="Prrafodelista"/>
+              <w:numPr>
+                <w:ilvl w:val="0"/>
+                <w:numId w:val="17"/>
+              </w:numPr>
+              <w:jc w:val="both"/>
+              <w:rPr>
+                <w:iCs/>
+                <w:color w:val="548DD4"/>
+                <w:sz w:val="20"/>
+                <w:szCs w:val="20"/>
+              </w:rPr>
+            </w:pPr>
+            <w:r>
+              <w:rPr>
+                <w:b/>
+                <w:bCs/>
+                <w:iCs/>
+                <w:color w:val="548DD4"/>
+                <w:sz w:val="20"/>
+                <w:szCs w:val="20"/>
+              </w:rPr>
+              <w:t>Verificación:</w:t>
+            </w:r>
+            <w:r>
+              <w:rPr>
+                <w:iCs/>
+                <w:color w:val="548DD4"/>
+                <w:sz w:val="20"/>
+                <w:szCs w:val="20"/>
+              </w:rPr>
+              <w:t xml:space="preserve"> Entrega del informe final con la comparación entre objetivos planteados y logros obtenidos.</w:t>
             </w:r>
           </w:p>
         </w:tc>
@@ -2098,7 +2672,6 @@
                 <w:sz w:val="20"/>
                 <w:szCs w:val="20"/>
               </w:rPr>
-              <w:lastRenderedPageBreak/>
               <w:t>Para abordar la problemática identificada y cumplir con los objetivos del proyecto, se utilizará una metodología ágil de desarrollo, específicamente Kanban. Esta metodología permitirá organizar y visualizar el flujo de trabajo a través de un tablero, donde se registran las tareas en distintas etapas como Pendiente, En proceso, en revisión y Finalizado. Esto facilitará el control del avance, la priorización de actividades y la detección temprana de posibles obstáculos.</w:t>
             </w:r>
           </w:p>
@@ -2310,23 +2883,13 @@
                 <w:szCs w:val="20"/>
               </w:rPr>
             </w:pPr>
-            <w:proofErr w:type="gramStart"/>
-            <w:r>
-              <w:rPr>
-                <w:color w:val="548DD4"/>
-                <w:sz w:val="20"/>
-                <w:szCs w:val="20"/>
-              </w:rPr>
-              <w:t>Asegurar</w:t>
-            </w:r>
-            <w:proofErr w:type="gramEnd"/>
-            <w:r>
-              <w:rPr>
-                <w:color w:val="548DD4"/>
-                <w:sz w:val="20"/>
-                <w:szCs w:val="20"/>
-              </w:rPr>
-              <w:t xml:space="preserve"> que las historias de usuario estén claras y alineadas al valor de negocio.</w:t>
+            <w:r>
+              <w:rPr>
+                <w:color w:val="548DD4"/>
+                <w:sz w:val="20"/>
+                <w:szCs w:val="20"/>
+              </w:rPr>
+              <w:t>Asegurar que las historias de usuario estén claras y alineadas al valor de negocio.</w:t>
             </w:r>
           </w:p>
           <w:p>
@@ -2372,6 +2935,7 @@
                 <w:sz w:val="20"/>
                 <w:szCs w:val="20"/>
               </w:rPr>
+              <w:lastRenderedPageBreak/>
               <w:t xml:space="preserve">Colaborar con </w:t>
             </w:r>
             <w:proofErr w:type="spellStart"/>
@@ -2449,27 +3013,7 @@
                 <w:sz w:val="20"/>
                 <w:szCs w:val="20"/>
               </w:rPr>
-              <w:t xml:space="preserve">Scrum </w:t>
-            </w:r>
-            <w:proofErr w:type="gramStart"/>
-            <w:r>
-              <w:rPr>
-                <w:b/>
-                <w:color w:val="548DD4"/>
-                <w:sz w:val="20"/>
-                <w:szCs w:val="20"/>
-              </w:rPr>
-              <w:t>Master</w:t>
-            </w:r>
-            <w:proofErr w:type="gramEnd"/>
-            <w:r>
-              <w:rPr>
-                <w:b/>
-                <w:color w:val="548DD4"/>
-                <w:sz w:val="20"/>
-                <w:szCs w:val="20"/>
-              </w:rPr>
-              <w:t xml:space="preserve">: </w:t>
+              <w:t xml:space="preserve">Scrum Master: </w:t>
             </w:r>
             <w:r>
               <w:rPr>
@@ -2953,7 +3497,6 @@
                 <w:sz w:val="20"/>
                 <w:szCs w:val="20"/>
               </w:rPr>
-              <w:lastRenderedPageBreak/>
               <w:t xml:space="preserve">Implementar lógica de negocio, </w:t>
             </w:r>
             <w:proofErr w:type="spellStart"/>
@@ -3168,6 +3711,7 @@
                 <w:sz w:val="28"/>
                 <w:szCs w:val="28"/>
               </w:rPr>
+              <w:lastRenderedPageBreak/>
               <w:t>6. Evidencias</w:t>
             </w:r>
           </w:p>
@@ -3527,27 +4071,7 @@
                 <w:sz w:val="18"/>
                 <w:szCs w:val="18"/>
               </w:rPr>
-              <w:t xml:space="preserve">Respaldo concreto para el desarrollo </w:t>
-            </w:r>
-            <w:proofErr w:type="gramStart"/>
-            <w:r>
-              <w:rPr>
-                <w:i/>
-                <w:color w:val="4472C4"/>
-                <w:sz w:val="18"/>
-                <w:szCs w:val="18"/>
-              </w:rPr>
-              <w:t>de  solución</w:t>
-            </w:r>
-            <w:proofErr w:type="gramEnd"/>
-            <w:r>
-              <w:rPr>
-                <w:i/>
-                <w:color w:val="4472C4"/>
-                <w:sz w:val="18"/>
-                <w:szCs w:val="18"/>
-              </w:rPr>
-              <w:t xml:space="preserve"> propuesta </w:t>
+              <w:t xml:space="preserve">Respaldo concreto para el desarrollo de  solución propuesta </w:t>
             </w:r>
           </w:p>
         </w:tc>
@@ -3654,27 +4178,7 @@
                 <w:sz w:val="18"/>
                 <w:szCs w:val="18"/>
               </w:rPr>
-              <w:t xml:space="preserve"> adaptando los </w:t>
-            </w:r>
-            <w:proofErr w:type="gramStart"/>
-            <w:r>
-              <w:rPr>
-                <w:i/>
-                <w:color w:val="4472C4"/>
-                <w:sz w:val="18"/>
-                <w:szCs w:val="18"/>
-              </w:rPr>
-              <w:t>días lunes</w:t>
-            </w:r>
-            <w:proofErr w:type="gramEnd"/>
-            <w:r>
-              <w:rPr>
-                <w:i/>
-                <w:color w:val="4472C4"/>
-                <w:sz w:val="18"/>
-                <w:szCs w:val="18"/>
-              </w:rPr>
-              <w:t xml:space="preserve"> a viernes, completando las distintas actividades actuales y futuras del proyecto APT</w:t>
+              <w:t xml:space="preserve"> adaptando los días lunes a viernes, completando las distintas actividades actuales y futuras del proyecto APT</w:t>
             </w:r>
           </w:p>
         </w:tc>
@@ -4014,21 +4518,7 @@
               <w:rPr>
                 <w:color w:val="1F3864"/>
               </w:rPr>
-              <w:t xml:space="preserve">En la siguiente tabla define la planificación de tu Proyecto APT </w:t>
-            </w:r>
-            <w:proofErr w:type="gramStart"/>
-            <w:r>
-              <w:rPr>
-                <w:color w:val="1F3864"/>
-              </w:rPr>
-              <w:t>de acuerdo a</w:t>
-            </w:r>
-            <w:proofErr w:type="gramEnd"/>
-            <w:r>
-              <w:rPr>
-                <w:color w:val="1F3864"/>
-              </w:rPr>
-              <w:t xml:space="preserve"> lo requerido.</w:t>
+              <w:t>En la siguiente tabla define la planificación de tu Proyecto APT de acuerdo a lo requerido.</w:t>
             </w:r>
           </w:p>
         </w:tc>
@@ -4140,21 +4630,7 @@
               <w:rPr>
                 <w:color w:val="1F3864"/>
               </w:rPr>
-              <w:t xml:space="preserve">Nombre </w:t>
-            </w:r>
-            <w:proofErr w:type="gramStart"/>
-            <w:r>
-              <w:rPr>
-                <w:color w:val="1F3864"/>
-              </w:rPr>
-              <w:t>de  Actividades</w:t>
-            </w:r>
-            <w:proofErr w:type="gramEnd"/>
-            <w:r>
-              <w:rPr>
-                <w:color w:val="1F3864"/>
-              </w:rPr>
-              <w:t>/Tareas</w:t>
+              <w:t>Nombre de  Actividades/Tareas</w:t>
             </w:r>
           </w:p>
         </w:tc>
@@ -4401,19 +4877,8 @@
                 <w:sz w:val="18"/>
                 <w:szCs w:val="18"/>
               </w:rPr>
-              <w:t xml:space="preserve">1 </w:t>
-            </w:r>
-            <w:proofErr w:type="gramStart"/>
-            <w:r>
-              <w:rPr>
-                <w:i/>
-                <w:color w:val="548DD4"/>
-                <w:sz w:val="18"/>
-                <w:szCs w:val="18"/>
-              </w:rPr>
-              <w:t>Semana</w:t>
-            </w:r>
-            <w:proofErr w:type="gramEnd"/>
+              <w:t>1 Semana</w:t>
+            </w:r>
           </w:p>
           <w:p>
             <w:pPr>
@@ -5068,7 +5533,7 @@
           <w:szCs w:val="24"/>
         </w:rPr>
       </w:pPr>
-      <w:hyperlink r:id="rId9" w:history="1">
+      <w:hyperlink r:id="rId8" w:history="1">
         <w:r>
           <w:rPr>
             <w:rStyle w:val="Hipervnculo"/>
@@ -5082,7 +5547,7 @@
     </w:p>
     <w:p/>
     <w:sectPr>
-      <w:headerReference w:type="default" r:id="rId10"/>
+      <w:headerReference w:type="default" r:id="rId9"/>
       <w:pgSz w:w="11906" w:h="16838"/>
       <w:pgMar w:top="1417" w:right="1701" w:bottom="1417" w:left="1701" w:header="708" w:footer="708" w:gutter="0"/>
       <w:pgNumType w:start="1"/>
@@ -5330,6 +5795,119 @@
 <file path=word/numbering.xml><?xml version="1.0" encoding="utf-8"?>
 <w:numbering xmlns:wpc="http://schemas.microsoft.com/office/word/2010/wordprocessingCanvas" xmlns:cx="http://schemas.microsoft.com/office/drawing/2014/chartex" xmlns:cx1="http://schemas.microsoft.com/office/drawing/2015/9/8/chartex" xmlns:cx2="http://schemas.microsoft.com/office/drawing/2015/10/21/chartex" xmlns:cx3="http://schemas.microsoft.com/office/drawing/2016/5/9/chartex" xmlns:cx4="http://schemas.microsoft.com/office/drawing/2016/5/10/chartex" xmlns:cx5="http://schemas.microsoft.com/office/drawing/2016/5/11/chartex" xmlns:cx6="http://schemas.microsoft.com/office/drawing/2016/5/12/chartex" xmlns:cx7="http://schemas.microsoft.com/office/drawing/2016/5/13/chartex" xmlns:cx8="http://schemas.microsoft.com/office/drawing/2016/5/14/chartex" xmlns:mc="http://schemas.openxmlformats.org/markup-compatibility/2006" xmlns:aink="http://schemas.microsoft.com/office/drawing/2016/ink" xmlns:am3d="http://schemas.microsoft.com/office/drawing/2017/model3d" xmlns:o="urn:schemas-microsoft-com:office:office" xmlns:oel="http://schemas.microsoft.com/office/2019/extlst" xmlns:r="http://schemas.openxmlformats.org/officeDocument/2006/relationships" xmlns:m="http://schemas.openxmlformats.org/officeDocument/2006/math" xmlns:v="urn:schemas-microsoft-com:vml" xmlns:wp14="http://schemas.microsoft.com/office/word/2010/wordprocessingDrawing" xmlns:wp="http://schemas.openxmlformats.org/drawingml/2006/wordprocessingDrawing" xmlns:w10="urn:schemas-microsoft-com:office:word" xmlns:w="http://schemas.openxmlformats.org/wordprocessingml/2006/main" xmlns:w14="http://schemas.microsoft.com/office/word/2010/wordml" xmlns:w15="http://schemas.microsoft.com/office/word/2012/wordml" xmlns:w16cex="http://schemas.microsoft.com/office/word/2018/wordml/cex" xmlns:w16cid="http://schemas.microsoft.com/office/word/2016/wordml/cid" xmlns:w16="http://schemas.microsoft.com/office/word/2018/wordml" xmlns:w16du="http://schemas.microsoft.com/office/word/2023/wordml/word16du" xmlns:w16sdtdh="http://schemas.microsoft.com/office/word/2020/wordml/sdtdatahash" xmlns:w16sdtfl="http://schemas.microsoft.com/office/word/2024/wordml/sdtformatlock" xmlns:w16se="http://schemas.microsoft.com/office/word/2015/wordml/symex" xmlns:wpg="http://schemas.microsoft.com/office/word/2010/wordprocessingGroup" xmlns:wpi="http://schemas.microsoft.com/office/word/2010/wordprocessingInk" xmlns:wne="http://schemas.microsoft.com/office/word/2006/wordml" xmlns:wps="http://schemas.microsoft.com/office/word/2010/wordprocessingShape" mc:Ignorable="w14 w15 w16se w16cid w16 w16cex w16sdtdh w16sdtfl w16du wp14">
   <w:abstractNum w:abstractNumId="0" w15:restartNumberingAfterBreak="0">
+    <w:nsid w:val="2407640C"/>
+    <w:multiLevelType w:val="multilevel"/>
+    <w:tmpl w:val="C77C9C4C"/>
+    <w:lvl w:ilvl="0">
+      <w:start w:val="1"/>
+      <w:numFmt w:val="bullet"/>
+      <w:lvlText w:val="●"/>
+      <w:lvlJc w:val="left"/>
+      <w:pPr>
+        <w:ind w:left="720" w:hanging="360"/>
+      </w:pPr>
+      <w:rPr>
+        <w:u w:val="none"/>
+      </w:rPr>
+    </w:lvl>
+    <w:lvl w:ilvl="1">
+      <w:start w:val="1"/>
+      <w:numFmt w:val="bullet"/>
+      <w:lvlText w:val="○"/>
+      <w:lvlJc w:val="left"/>
+      <w:pPr>
+        <w:ind w:left="1440" w:hanging="360"/>
+      </w:pPr>
+      <w:rPr>
+        <w:u w:val="none"/>
+      </w:rPr>
+    </w:lvl>
+    <w:lvl w:ilvl="2">
+      <w:start w:val="1"/>
+      <w:numFmt w:val="bullet"/>
+      <w:lvlText w:val="■"/>
+      <w:lvlJc w:val="left"/>
+      <w:pPr>
+        <w:ind w:left="2160" w:hanging="360"/>
+      </w:pPr>
+      <w:rPr>
+        <w:u w:val="none"/>
+      </w:rPr>
+    </w:lvl>
+    <w:lvl w:ilvl="3">
+      <w:start w:val="1"/>
+      <w:numFmt w:val="bullet"/>
+      <w:lvlText w:val="●"/>
+      <w:lvlJc w:val="left"/>
+      <w:pPr>
+        <w:ind w:left="2880" w:hanging="360"/>
+      </w:pPr>
+      <w:rPr>
+        <w:u w:val="none"/>
+      </w:rPr>
+    </w:lvl>
+    <w:lvl w:ilvl="4">
+      <w:start w:val="1"/>
+      <w:numFmt w:val="bullet"/>
+      <w:lvlText w:val="○"/>
+      <w:lvlJc w:val="left"/>
+      <w:pPr>
+        <w:ind w:left="3600" w:hanging="360"/>
+      </w:pPr>
+      <w:rPr>
+        <w:u w:val="none"/>
+      </w:rPr>
+    </w:lvl>
+    <w:lvl w:ilvl="5">
+      <w:start w:val="1"/>
+      <w:numFmt w:val="bullet"/>
+      <w:lvlText w:val="■"/>
+      <w:lvlJc w:val="left"/>
+      <w:pPr>
+        <w:ind w:left="4320" w:hanging="360"/>
+      </w:pPr>
+      <w:rPr>
+        <w:u w:val="none"/>
+      </w:rPr>
+    </w:lvl>
+    <w:lvl w:ilvl="6">
+      <w:start w:val="1"/>
+      <w:numFmt w:val="bullet"/>
+      <w:lvlText w:val="●"/>
+      <w:lvlJc w:val="left"/>
+      <w:pPr>
+        <w:ind w:left="5040" w:hanging="360"/>
+      </w:pPr>
+      <w:rPr>
+        <w:u w:val="none"/>
+      </w:rPr>
+    </w:lvl>
+    <w:lvl w:ilvl="7">
+      <w:start w:val="1"/>
+      <w:numFmt w:val="bullet"/>
+      <w:lvlText w:val="○"/>
+      <w:lvlJc w:val="left"/>
+      <w:pPr>
+        <w:ind w:left="5760" w:hanging="360"/>
+      </w:pPr>
+      <w:rPr>
+        <w:u w:val="none"/>
+      </w:rPr>
+    </w:lvl>
+    <w:lvl w:ilvl="8">
+      <w:start w:val="1"/>
+      <w:numFmt w:val="bullet"/>
+      <w:lvlText w:val="■"/>
+      <w:lvlJc w:val="left"/>
+      <w:pPr>
+        <w:ind w:left="6480" w:hanging="360"/>
+      </w:pPr>
+      <w:rPr>
+        <w:u w:val="none"/>
+      </w:rPr>
+    </w:lvl>
+  </w:abstractNum>
+  <w:abstractNum w:abstractNumId="1" w15:restartNumberingAfterBreak="0">
     <w:nsid w:val="252C475D"/>
     <w:multiLevelType w:val="multilevel"/>
     <w:tmpl w:val="E3A6FCC8"/>
@@ -5442,7 +6020,7 @@
       </w:rPr>
     </w:lvl>
   </w:abstractNum>
-  <w:abstractNum w:abstractNumId="1" w15:restartNumberingAfterBreak="0">
+  <w:abstractNum w:abstractNumId="2" w15:restartNumberingAfterBreak="0">
     <w:nsid w:val="26DE5781"/>
     <w:multiLevelType w:val="multilevel"/>
     <w:tmpl w:val="4300D8B4"/>
@@ -5555,7 +6133,120 @@
       </w:rPr>
     </w:lvl>
   </w:abstractNum>
-  <w:abstractNum w:abstractNumId="2" w15:restartNumberingAfterBreak="0">
+  <w:abstractNum w:abstractNumId="3" w15:restartNumberingAfterBreak="0">
+    <w:nsid w:val="2991663B"/>
+    <w:multiLevelType w:val="multilevel"/>
+    <w:tmpl w:val="C77C9C4C"/>
+    <w:lvl w:ilvl="0">
+      <w:start w:val="1"/>
+      <w:numFmt w:val="bullet"/>
+      <w:lvlText w:val="●"/>
+      <w:lvlJc w:val="left"/>
+      <w:pPr>
+        <w:ind w:left="720" w:hanging="360"/>
+      </w:pPr>
+      <w:rPr>
+        <w:u w:val="none"/>
+      </w:rPr>
+    </w:lvl>
+    <w:lvl w:ilvl="1">
+      <w:start w:val="1"/>
+      <w:numFmt w:val="bullet"/>
+      <w:lvlText w:val="○"/>
+      <w:lvlJc w:val="left"/>
+      <w:pPr>
+        <w:ind w:left="1440" w:hanging="360"/>
+      </w:pPr>
+      <w:rPr>
+        <w:u w:val="none"/>
+      </w:rPr>
+    </w:lvl>
+    <w:lvl w:ilvl="2">
+      <w:start w:val="1"/>
+      <w:numFmt w:val="bullet"/>
+      <w:lvlText w:val="■"/>
+      <w:lvlJc w:val="left"/>
+      <w:pPr>
+        <w:ind w:left="2160" w:hanging="360"/>
+      </w:pPr>
+      <w:rPr>
+        <w:u w:val="none"/>
+      </w:rPr>
+    </w:lvl>
+    <w:lvl w:ilvl="3">
+      <w:start w:val="1"/>
+      <w:numFmt w:val="bullet"/>
+      <w:lvlText w:val="●"/>
+      <w:lvlJc w:val="left"/>
+      <w:pPr>
+        <w:ind w:left="2880" w:hanging="360"/>
+      </w:pPr>
+      <w:rPr>
+        <w:u w:val="none"/>
+      </w:rPr>
+    </w:lvl>
+    <w:lvl w:ilvl="4">
+      <w:start w:val="1"/>
+      <w:numFmt w:val="bullet"/>
+      <w:lvlText w:val="○"/>
+      <w:lvlJc w:val="left"/>
+      <w:pPr>
+        <w:ind w:left="3600" w:hanging="360"/>
+      </w:pPr>
+      <w:rPr>
+        <w:u w:val="none"/>
+      </w:rPr>
+    </w:lvl>
+    <w:lvl w:ilvl="5">
+      <w:start w:val="1"/>
+      <w:numFmt w:val="bullet"/>
+      <w:lvlText w:val="■"/>
+      <w:lvlJc w:val="left"/>
+      <w:pPr>
+        <w:ind w:left="4320" w:hanging="360"/>
+      </w:pPr>
+      <w:rPr>
+        <w:u w:val="none"/>
+      </w:rPr>
+    </w:lvl>
+    <w:lvl w:ilvl="6">
+      <w:start w:val="1"/>
+      <w:numFmt w:val="bullet"/>
+      <w:lvlText w:val="●"/>
+      <w:lvlJc w:val="left"/>
+      <w:pPr>
+        <w:ind w:left="5040" w:hanging="360"/>
+      </w:pPr>
+      <w:rPr>
+        <w:u w:val="none"/>
+      </w:rPr>
+    </w:lvl>
+    <w:lvl w:ilvl="7">
+      <w:start w:val="1"/>
+      <w:numFmt w:val="bullet"/>
+      <w:lvlText w:val="○"/>
+      <w:lvlJc w:val="left"/>
+      <w:pPr>
+        <w:ind w:left="5760" w:hanging="360"/>
+      </w:pPr>
+      <w:rPr>
+        <w:u w:val="none"/>
+      </w:rPr>
+    </w:lvl>
+    <w:lvl w:ilvl="8">
+      <w:start w:val="1"/>
+      <w:numFmt w:val="bullet"/>
+      <w:lvlText w:val="■"/>
+      <w:lvlJc w:val="left"/>
+      <w:pPr>
+        <w:ind w:left="6480" w:hanging="360"/>
+      </w:pPr>
+      <w:rPr>
+        <w:u w:val="none"/>
+      </w:rPr>
+    </w:lvl>
+  </w:abstractNum>
+  <w:abstractNum w:abstractNumId="4" w15:restartNumberingAfterBreak="0">
     <w:nsid w:val="2FA93493"/>
     <w:multiLevelType w:val="multilevel"/>
     <w:tmpl w:val="409C2EC4"/>
@@ -5668,7 +6359,120 @@
       </w:rPr>
     </w:lvl>
   </w:abstractNum>
-  <w:abstractNum w:abstractNumId="3" w15:restartNumberingAfterBreak="0">
+  <w:abstractNum w:abstractNumId="5" w15:restartNumberingAfterBreak="0">
+    <w:nsid w:val="320E0D21"/>
+    <w:multiLevelType w:val="multilevel"/>
+    <w:tmpl w:val="C77C9C4C"/>
+    <w:lvl w:ilvl="0">
+      <w:start w:val="1"/>
+      <w:numFmt w:val="bullet"/>
+      <w:lvlText w:val="●"/>
+      <w:lvlJc w:val="left"/>
+      <w:pPr>
+        <w:ind w:left="720" w:hanging="360"/>
+      </w:pPr>
+      <w:rPr>
+        <w:u w:val="none"/>
+      </w:rPr>
+    </w:lvl>
+    <w:lvl w:ilvl="1">
+      <w:start w:val="1"/>
+      <w:numFmt w:val="bullet"/>
+      <w:lvlText w:val="○"/>
+      <w:lvlJc w:val="left"/>
+      <w:pPr>
+        <w:ind w:left="1440" w:hanging="360"/>
+      </w:pPr>
+      <w:rPr>
+        <w:u w:val="none"/>
+      </w:rPr>
+    </w:lvl>
+    <w:lvl w:ilvl="2">
+      <w:start w:val="1"/>
+      <w:numFmt w:val="bullet"/>
+      <w:lvlText w:val="■"/>
+      <w:lvlJc w:val="left"/>
+      <w:pPr>
+        <w:ind w:left="2160" w:hanging="360"/>
+      </w:pPr>
+      <w:rPr>
+        <w:u w:val="none"/>
+      </w:rPr>
+    </w:lvl>
+    <w:lvl w:ilvl="3">
+      <w:start w:val="1"/>
+      <w:numFmt w:val="bullet"/>
+      <w:lvlText w:val="●"/>
+      <w:lvlJc w:val="left"/>
+      <w:pPr>
+        <w:ind w:left="2880" w:hanging="360"/>
+      </w:pPr>
+      <w:rPr>
+        <w:u w:val="none"/>
+      </w:rPr>
+    </w:lvl>
+    <w:lvl w:ilvl="4">
+      <w:start w:val="1"/>
+      <w:numFmt w:val="bullet"/>
+      <w:lvlText w:val="○"/>
+      <w:lvlJc w:val="left"/>
+      <w:pPr>
+        <w:ind w:left="3600" w:hanging="360"/>
+      </w:pPr>
+      <w:rPr>
+        <w:u w:val="none"/>
+      </w:rPr>
+    </w:lvl>
+    <w:lvl w:ilvl="5">
+      <w:start w:val="1"/>
+      <w:numFmt w:val="bullet"/>
+      <w:lvlText w:val="■"/>
+      <w:lvlJc w:val="left"/>
+      <w:pPr>
+        <w:ind w:left="4320" w:hanging="360"/>
+      </w:pPr>
+      <w:rPr>
+        <w:u w:val="none"/>
+      </w:rPr>
+    </w:lvl>
+    <w:lvl w:ilvl="6">
+      <w:start w:val="1"/>
+      <w:numFmt w:val="bullet"/>
+      <w:lvlText w:val="●"/>
+      <w:lvlJc w:val="left"/>
+      <w:pPr>
+        <w:ind w:left="5040" w:hanging="360"/>
+      </w:pPr>
+      <w:rPr>
+        <w:u w:val="none"/>
+      </w:rPr>
+    </w:lvl>
+    <w:lvl w:ilvl="7">
+      <w:start w:val="1"/>
+      <w:numFmt w:val="bullet"/>
+      <w:lvlText w:val="○"/>
+      <w:lvlJc w:val="left"/>
+      <w:pPr>
+        <w:ind w:left="5760" w:hanging="360"/>
+      </w:pPr>
+      <w:rPr>
+        <w:u w:val="none"/>
+      </w:rPr>
+    </w:lvl>
+    <w:lvl w:ilvl="8">
+      <w:start w:val="1"/>
+      <w:numFmt w:val="bullet"/>
+      <w:lvlText w:val="■"/>
+      <w:lvlJc w:val="left"/>
+      <w:pPr>
+        <w:ind w:left="6480" w:hanging="360"/>
+      </w:pPr>
+      <w:rPr>
+        <w:u w:val="none"/>
+      </w:rPr>
+    </w:lvl>
+  </w:abstractNum>
+  <w:abstractNum w:abstractNumId="6" w15:restartNumberingAfterBreak="0">
     <w:nsid w:val="3EC418FA"/>
     <w:multiLevelType w:val="multilevel"/>
     <w:tmpl w:val="DA1C26B4"/>
@@ -5781,7 +6585,233 @@
       </w:rPr>
     </w:lvl>
   </w:abstractNum>
-  <w:abstractNum w:abstractNumId="4" w15:restartNumberingAfterBreak="0">
+  <w:abstractNum w:abstractNumId="7" w15:restartNumberingAfterBreak="0">
+    <w:nsid w:val="48D300E3"/>
+    <w:multiLevelType w:val="multilevel"/>
+    <w:tmpl w:val="C77C9C4C"/>
+    <w:lvl w:ilvl="0">
+      <w:start w:val="1"/>
+      <w:numFmt w:val="bullet"/>
+      <w:lvlText w:val="●"/>
+      <w:lvlJc w:val="left"/>
+      <w:pPr>
+        <w:ind w:left="720" w:hanging="360"/>
+      </w:pPr>
+      <w:rPr>
+        <w:u w:val="none"/>
+      </w:rPr>
+    </w:lvl>
+    <w:lvl w:ilvl="1">
+      <w:start w:val="1"/>
+      <w:numFmt w:val="bullet"/>
+      <w:lvlText w:val="○"/>
+      <w:lvlJc w:val="left"/>
+      <w:pPr>
+        <w:ind w:left="1440" w:hanging="360"/>
+      </w:pPr>
+      <w:rPr>
+        <w:u w:val="none"/>
+      </w:rPr>
+    </w:lvl>
+    <w:lvl w:ilvl="2">
+      <w:start w:val="1"/>
+      <w:numFmt w:val="bullet"/>
+      <w:lvlText w:val="■"/>
+      <w:lvlJc w:val="left"/>
+      <w:pPr>
+        <w:ind w:left="2160" w:hanging="360"/>
+      </w:pPr>
+      <w:rPr>
+        <w:u w:val="none"/>
+      </w:rPr>
+    </w:lvl>
+    <w:lvl w:ilvl="3">
+      <w:start w:val="1"/>
+      <w:numFmt w:val="bullet"/>
+      <w:lvlText w:val="●"/>
+      <w:lvlJc w:val="left"/>
+      <w:pPr>
+        <w:ind w:left="2880" w:hanging="360"/>
+      </w:pPr>
+      <w:rPr>
+        <w:u w:val="none"/>
+      </w:rPr>
+    </w:lvl>
+    <w:lvl w:ilvl="4">
+      <w:start w:val="1"/>
+      <w:numFmt w:val="bullet"/>
+      <w:lvlText w:val="○"/>
+      <w:lvlJc w:val="left"/>
+      <w:pPr>
+        <w:ind w:left="3600" w:hanging="360"/>
+      </w:pPr>
+      <w:rPr>
+        <w:u w:val="none"/>
+      </w:rPr>
+    </w:lvl>
+    <w:lvl w:ilvl="5">
+      <w:start w:val="1"/>
+      <w:numFmt w:val="bullet"/>
+      <w:lvlText w:val="■"/>
+      <w:lvlJc w:val="left"/>
+      <w:pPr>
+        <w:ind w:left="4320" w:hanging="360"/>
+      </w:pPr>
+      <w:rPr>
+        <w:u w:val="none"/>
+      </w:rPr>
+    </w:lvl>
+    <w:lvl w:ilvl="6">
+      <w:start w:val="1"/>
+      <w:numFmt w:val="bullet"/>
+      <w:lvlText w:val="●"/>
+      <w:lvlJc w:val="left"/>
+      <w:pPr>
+        <w:ind w:left="5040" w:hanging="360"/>
+      </w:pPr>
+      <w:rPr>
+        <w:u w:val="none"/>
+      </w:rPr>
+    </w:lvl>
+    <w:lvl w:ilvl="7">
+      <w:start w:val="1"/>
+      <w:numFmt w:val="bullet"/>
+      <w:lvlText w:val="○"/>
+      <w:lvlJc w:val="left"/>
+      <w:pPr>
+        <w:ind w:left="5760" w:hanging="360"/>
+      </w:pPr>
+      <w:rPr>
+        <w:u w:val="none"/>
+      </w:rPr>
+    </w:lvl>
+    <w:lvl w:ilvl="8">
+      <w:start w:val="1"/>
+      <w:numFmt w:val="bullet"/>
+      <w:lvlText w:val="■"/>
+      <w:lvlJc w:val="left"/>
+      <w:pPr>
+        <w:ind w:left="6480" w:hanging="360"/>
+      </w:pPr>
+      <w:rPr>
+        <w:u w:val="none"/>
+      </w:rPr>
+    </w:lvl>
+  </w:abstractNum>
+  <w:abstractNum w:abstractNumId="8" w15:restartNumberingAfterBreak="0">
+    <w:nsid w:val="4A834D08"/>
+    <w:multiLevelType w:val="multilevel"/>
+    <w:tmpl w:val="C77C9C4C"/>
+    <w:lvl w:ilvl="0">
+      <w:start w:val="1"/>
+      <w:numFmt w:val="bullet"/>
+      <w:lvlText w:val="●"/>
+      <w:lvlJc w:val="left"/>
+      <w:pPr>
+        <w:ind w:left="720" w:hanging="360"/>
+      </w:pPr>
+      <w:rPr>
+        <w:u w:val="none"/>
+      </w:rPr>
+    </w:lvl>
+    <w:lvl w:ilvl="1">
+      <w:start w:val="1"/>
+      <w:numFmt w:val="bullet"/>
+      <w:lvlText w:val="○"/>
+      <w:lvlJc w:val="left"/>
+      <w:pPr>
+        <w:ind w:left="1440" w:hanging="360"/>
+      </w:pPr>
+      <w:rPr>
+        <w:u w:val="none"/>
+      </w:rPr>
+    </w:lvl>
+    <w:lvl w:ilvl="2">
+      <w:start w:val="1"/>
+      <w:numFmt w:val="bullet"/>
+      <w:lvlText w:val="■"/>
+      <w:lvlJc w:val="left"/>
+      <w:pPr>
+        <w:ind w:left="2160" w:hanging="360"/>
+      </w:pPr>
+      <w:rPr>
+        <w:u w:val="none"/>
+      </w:rPr>
+    </w:lvl>
+    <w:lvl w:ilvl="3">
+      <w:start w:val="1"/>
+      <w:numFmt w:val="bullet"/>
+      <w:lvlText w:val="●"/>
+      <w:lvlJc w:val="left"/>
+      <w:pPr>
+        <w:ind w:left="2880" w:hanging="360"/>
+      </w:pPr>
+      <w:rPr>
+        <w:u w:val="none"/>
+      </w:rPr>
+    </w:lvl>
+    <w:lvl w:ilvl="4">
+      <w:start w:val="1"/>
+      <w:numFmt w:val="bullet"/>
+      <w:lvlText w:val="○"/>
+      <w:lvlJc w:val="left"/>
+      <w:pPr>
+        <w:ind w:left="3600" w:hanging="360"/>
+      </w:pPr>
+      <w:rPr>
+        <w:u w:val="none"/>
+      </w:rPr>
+    </w:lvl>
+    <w:lvl w:ilvl="5">
+      <w:start w:val="1"/>
+      <w:numFmt w:val="bullet"/>
+      <w:lvlText w:val="■"/>
+      <w:lvlJc w:val="left"/>
+      <w:pPr>
+        <w:ind w:left="4320" w:hanging="360"/>
+      </w:pPr>
+      <w:rPr>
+        <w:u w:val="none"/>
+      </w:rPr>
+    </w:lvl>
+    <w:lvl w:ilvl="6">
+      <w:start w:val="1"/>
+      <w:numFmt w:val="bullet"/>
+      <w:lvlText w:val="●"/>
+      <w:lvlJc w:val="left"/>
+      <w:pPr>
+        <w:ind w:left="5040" w:hanging="360"/>
+      </w:pPr>
+      <w:rPr>
+        <w:u w:val="none"/>
+      </w:rPr>
+    </w:lvl>
+    <w:lvl w:ilvl="7">
+      <w:start w:val="1"/>
+      <w:numFmt w:val="bullet"/>
+      <w:lvlText w:val="○"/>
+      <w:lvlJc w:val="left"/>
+      <w:pPr>
+        <w:ind w:left="5760" w:hanging="360"/>
+      </w:pPr>
+      <w:rPr>
+        <w:u w:val="none"/>
+      </w:rPr>
+    </w:lvl>
+    <w:lvl w:ilvl="8">
+      <w:start w:val="1"/>
+      <w:numFmt w:val="bullet"/>
+      <w:lvlText w:val="■"/>
+      <w:lvlJc w:val="left"/>
+      <w:pPr>
+        <w:ind w:left="6480" w:hanging="360"/>
+      </w:pPr>
+      <w:rPr>
+        <w:u w:val="none"/>
+      </w:rPr>
+    </w:lvl>
+  </w:abstractNum>
+  <w:abstractNum w:abstractNumId="9" w15:restartNumberingAfterBreak="0">
     <w:nsid w:val="52363282"/>
     <w:multiLevelType w:val="multilevel"/>
     <w:tmpl w:val="C77C9C4C"/>
@@ -5894,7 +6924,120 @@
       </w:rPr>
     </w:lvl>
   </w:abstractNum>
-  <w:abstractNum w:abstractNumId="5" w15:restartNumberingAfterBreak="0">
+  <w:abstractNum w:abstractNumId="10" w15:restartNumberingAfterBreak="0">
+    <w:nsid w:val="5EF77D65"/>
+    <w:multiLevelType w:val="multilevel"/>
+    <w:tmpl w:val="C77C9C4C"/>
+    <w:lvl w:ilvl="0">
+      <w:start w:val="1"/>
+      <w:numFmt w:val="bullet"/>
+      <w:lvlText w:val="●"/>
+      <w:lvlJc w:val="left"/>
+      <w:pPr>
+        <w:ind w:left="720" w:hanging="360"/>
+      </w:pPr>
+      <w:rPr>
+        <w:u w:val="none"/>
+      </w:rPr>
+    </w:lvl>
+    <w:lvl w:ilvl="1">
+      <w:start w:val="1"/>
+      <w:numFmt w:val="bullet"/>
+      <w:lvlText w:val="○"/>
+      <w:lvlJc w:val="left"/>
+      <w:pPr>
+        <w:ind w:left="1440" w:hanging="360"/>
+      </w:pPr>
+      <w:rPr>
+        <w:u w:val="none"/>
+      </w:rPr>
+    </w:lvl>
+    <w:lvl w:ilvl="2">
+      <w:start w:val="1"/>
+      <w:numFmt w:val="bullet"/>
+      <w:lvlText w:val="■"/>
+      <w:lvlJc w:val="left"/>
+      <w:pPr>
+        <w:ind w:left="2160" w:hanging="360"/>
+      </w:pPr>
+      <w:rPr>
+        <w:u w:val="none"/>
+      </w:rPr>
+    </w:lvl>
+    <w:lvl w:ilvl="3">
+      <w:start w:val="1"/>
+      <w:numFmt w:val="bullet"/>
+      <w:lvlText w:val="●"/>
+      <w:lvlJc w:val="left"/>
+      <w:pPr>
+        <w:ind w:left="2880" w:hanging="360"/>
+      </w:pPr>
+      <w:rPr>
+        <w:u w:val="none"/>
+      </w:rPr>
+    </w:lvl>
+    <w:lvl w:ilvl="4">
+      <w:start w:val="1"/>
+      <w:numFmt w:val="bullet"/>
+      <w:lvlText w:val="○"/>
+      <w:lvlJc w:val="left"/>
+      <w:pPr>
+        <w:ind w:left="3600" w:hanging="360"/>
+      </w:pPr>
+      <w:rPr>
+        <w:u w:val="none"/>
+      </w:rPr>
+    </w:lvl>
+    <w:lvl w:ilvl="5">
+      <w:start w:val="1"/>
+      <w:numFmt w:val="bullet"/>
+      <w:lvlText w:val="■"/>
+      <w:lvlJc w:val="left"/>
+      <w:pPr>
+        <w:ind w:left="4320" w:hanging="360"/>
+      </w:pPr>
+      <w:rPr>
+        <w:u w:val="none"/>
+      </w:rPr>
+    </w:lvl>
+    <w:lvl w:ilvl="6">
+      <w:start w:val="1"/>
+      <w:numFmt w:val="bullet"/>
+      <w:lvlText w:val="●"/>
+      <w:lvlJc w:val="left"/>
+      <w:pPr>
+        <w:ind w:left="5040" w:hanging="360"/>
+      </w:pPr>
+      <w:rPr>
+        <w:u w:val="none"/>
+      </w:rPr>
+    </w:lvl>
+    <w:lvl w:ilvl="7">
+      <w:start w:val="1"/>
+      <w:numFmt w:val="bullet"/>
+      <w:lvlText w:val="○"/>
+      <w:lvlJc w:val="left"/>
+      <w:pPr>
+        <w:ind w:left="5760" w:hanging="360"/>
+      </w:pPr>
+      <w:rPr>
+        <w:u w:val="none"/>
+      </w:rPr>
+    </w:lvl>
+    <w:lvl w:ilvl="8">
+      <w:start w:val="1"/>
+      <w:numFmt w:val="bullet"/>
+      <w:lvlText w:val="■"/>
+      <w:lvlJc w:val="left"/>
+      <w:pPr>
+        <w:ind w:left="6480" w:hanging="360"/>
+      </w:pPr>
+      <w:rPr>
+        <w:u w:val="none"/>
+      </w:rPr>
+    </w:lvl>
+  </w:abstractNum>
+  <w:abstractNum w:abstractNumId="11" w15:restartNumberingAfterBreak="0">
     <w:nsid w:val="6232626E"/>
     <w:multiLevelType w:val="multilevel"/>
     <w:tmpl w:val="B17EDF36"/>
@@ -5983,7 +7126,233 @@
       </w:pPr>
     </w:lvl>
   </w:abstractNum>
-  <w:abstractNum w:abstractNumId="6" w15:restartNumberingAfterBreak="0">
+  <w:abstractNum w:abstractNumId="12" w15:restartNumberingAfterBreak="0">
+    <w:nsid w:val="623859B1"/>
+    <w:multiLevelType w:val="multilevel"/>
+    <w:tmpl w:val="340A0021"/>
+    <w:lvl w:ilvl="0">
+      <w:start w:val="1"/>
+      <w:numFmt w:val="bullet"/>
+      <w:lvlText w:val=""/>
+      <w:lvlJc w:val="left"/>
+      <w:pPr>
+        <w:ind w:left="360" w:hanging="360"/>
+      </w:pPr>
+      <w:rPr>
+        <w:rFonts w:ascii="Wingdings" w:hAnsi="Wingdings" w:hint="default"/>
+      </w:rPr>
+    </w:lvl>
+    <w:lvl w:ilvl="1">
+      <w:start w:val="1"/>
+      <w:numFmt w:val="bullet"/>
+      <w:lvlText w:val=""/>
+      <w:lvlJc w:val="left"/>
+      <w:pPr>
+        <w:ind w:left="720" w:hanging="360"/>
+      </w:pPr>
+      <w:rPr>
+        <w:rFonts w:ascii="Wingdings" w:hAnsi="Wingdings" w:hint="default"/>
+      </w:rPr>
+    </w:lvl>
+    <w:lvl w:ilvl="2">
+      <w:start w:val="1"/>
+      <w:numFmt w:val="bullet"/>
+      <w:lvlText w:val=""/>
+      <w:lvlJc w:val="left"/>
+      <w:pPr>
+        <w:ind w:left="1080" w:hanging="360"/>
+      </w:pPr>
+      <w:rPr>
+        <w:rFonts w:ascii="Wingdings" w:hAnsi="Wingdings" w:hint="default"/>
+      </w:rPr>
+    </w:lvl>
+    <w:lvl w:ilvl="3">
+      <w:start w:val="1"/>
+      <w:numFmt w:val="bullet"/>
+      <w:lvlText w:val=""/>
+      <w:lvlJc w:val="left"/>
+      <w:pPr>
+        <w:ind w:left="1440" w:hanging="360"/>
+      </w:pPr>
+      <w:rPr>
+        <w:rFonts w:ascii="Symbol" w:hAnsi="Symbol" w:hint="default"/>
+      </w:rPr>
+    </w:lvl>
+    <w:lvl w:ilvl="4">
+      <w:start w:val="1"/>
+      <w:numFmt w:val="bullet"/>
+      <w:lvlText w:val=""/>
+      <w:lvlJc w:val="left"/>
+      <w:pPr>
+        <w:ind w:left="1800" w:hanging="360"/>
+      </w:pPr>
+      <w:rPr>
+        <w:rFonts w:ascii="Symbol" w:hAnsi="Symbol" w:hint="default"/>
+      </w:rPr>
+    </w:lvl>
+    <w:lvl w:ilvl="5">
+      <w:start w:val="1"/>
+      <w:numFmt w:val="bullet"/>
+      <w:lvlText w:val=""/>
+      <w:lvlJc w:val="left"/>
+      <w:pPr>
+        <w:ind w:left="2160" w:hanging="360"/>
+      </w:pPr>
+      <w:rPr>
+        <w:rFonts w:ascii="Wingdings" w:hAnsi="Wingdings" w:hint="default"/>
+      </w:rPr>
+    </w:lvl>
+    <w:lvl w:ilvl="6">
+      <w:start w:val="1"/>
+      <w:numFmt w:val="bullet"/>
+      <w:lvlText w:val=""/>
+      <w:lvlJc w:val="left"/>
+      <w:pPr>
+        <w:ind w:left="2520" w:hanging="360"/>
+      </w:pPr>
+      <w:rPr>
+        <w:rFonts w:ascii="Wingdings" w:hAnsi="Wingdings" w:hint="default"/>
+      </w:rPr>
+    </w:lvl>
+    <w:lvl w:ilvl="7">
+      <w:start w:val="1"/>
+      <w:numFmt w:val="bullet"/>
+      <w:lvlText w:val=""/>
+      <w:lvlJc w:val="left"/>
+      <w:pPr>
+        <w:ind w:left="2880" w:hanging="360"/>
+      </w:pPr>
+      <w:rPr>
+        <w:rFonts w:ascii="Symbol" w:hAnsi="Symbol" w:hint="default"/>
+      </w:rPr>
+    </w:lvl>
+    <w:lvl w:ilvl="8">
+      <w:start w:val="1"/>
+      <w:numFmt w:val="bullet"/>
+      <w:lvlText w:val=""/>
+      <w:lvlJc w:val="left"/>
+      <w:pPr>
+        <w:ind w:left="3240" w:hanging="360"/>
+      </w:pPr>
+      <w:rPr>
+        <w:rFonts w:ascii="Symbol" w:hAnsi="Symbol" w:hint="default"/>
+      </w:rPr>
+    </w:lvl>
+  </w:abstractNum>
+  <w:abstractNum w:abstractNumId="13" w15:restartNumberingAfterBreak="0">
+    <w:nsid w:val="66813452"/>
+    <w:multiLevelType w:val="multilevel"/>
+    <w:tmpl w:val="C77C9C4C"/>
+    <w:lvl w:ilvl="0">
+      <w:start w:val="1"/>
+      <w:numFmt w:val="bullet"/>
+      <w:lvlText w:val="●"/>
+      <w:lvlJc w:val="left"/>
+      <w:pPr>
+        <w:ind w:left="720" w:hanging="360"/>
+      </w:pPr>
+      <w:rPr>
+        <w:u w:val="none"/>
+      </w:rPr>
+    </w:lvl>
+    <w:lvl w:ilvl="1">
+      <w:start w:val="1"/>
+      <w:numFmt w:val="bullet"/>
+      <w:lvlText w:val="○"/>
+      <w:lvlJc w:val="left"/>
+      <w:pPr>
+        <w:ind w:left="1440" w:hanging="360"/>
+      </w:pPr>
+      <w:rPr>
+        <w:u w:val="none"/>
+      </w:rPr>
+    </w:lvl>
+    <w:lvl w:ilvl="2">
+      <w:start w:val="1"/>
+      <w:numFmt w:val="bullet"/>
+      <w:lvlText w:val="■"/>
+      <w:lvlJc w:val="left"/>
+      <w:pPr>
+        <w:ind w:left="2160" w:hanging="360"/>
+      </w:pPr>
+      <w:rPr>
+        <w:u w:val="none"/>
+      </w:rPr>
+    </w:lvl>
+    <w:lvl w:ilvl="3">
+      <w:start w:val="1"/>
+      <w:numFmt w:val="bullet"/>
+      <w:lvlText w:val="●"/>
+      <w:lvlJc w:val="left"/>
+      <w:pPr>
+        <w:ind w:left="2880" w:hanging="360"/>
+      </w:pPr>
+      <w:rPr>
+        <w:u w:val="none"/>
+      </w:rPr>
+    </w:lvl>
+    <w:lvl w:ilvl="4">
+      <w:start w:val="1"/>
+      <w:numFmt w:val="bullet"/>
+      <w:lvlText w:val="○"/>
+      <w:lvlJc w:val="left"/>
+      <w:pPr>
+        <w:ind w:left="3600" w:hanging="360"/>
+      </w:pPr>
+      <w:rPr>
+        <w:u w:val="none"/>
+      </w:rPr>
+    </w:lvl>
+    <w:lvl w:ilvl="5">
+      <w:start w:val="1"/>
+      <w:numFmt w:val="bullet"/>
+      <w:lvlText w:val="■"/>
+      <w:lvlJc w:val="left"/>
+      <w:pPr>
+        <w:ind w:left="4320" w:hanging="360"/>
+      </w:pPr>
+      <w:rPr>
+        <w:u w:val="none"/>
+      </w:rPr>
+    </w:lvl>
+    <w:lvl w:ilvl="6">
+      <w:start w:val="1"/>
+      <w:numFmt w:val="bullet"/>
+      <w:lvlText w:val="●"/>
+      <w:lvlJc w:val="left"/>
+      <w:pPr>
+        <w:ind w:left="5040" w:hanging="360"/>
+      </w:pPr>
+      <w:rPr>
+        <w:u w:val="none"/>
+      </w:rPr>
+    </w:lvl>
+    <w:lvl w:ilvl="7">
+      <w:start w:val="1"/>
+      <w:numFmt w:val="bullet"/>
+      <w:lvlText w:val="○"/>
+      <w:lvlJc w:val="left"/>
+      <w:pPr>
+        <w:ind w:left="5760" w:hanging="360"/>
+      </w:pPr>
+      <w:rPr>
+        <w:u w:val="none"/>
+      </w:rPr>
+    </w:lvl>
+    <w:lvl w:ilvl="8">
+      <w:start w:val="1"/>
+      <w:numFmt w:val="bullet"/>
+      <w:lvlText w:val="■"/>
+      <w:lvlJc w:val="left"/>
+      <w:pPr>
+        <w:ind w:left="6480" w:hanging="360"/>
+      </w:pPr>
+      <w:rPr>
+        <w:u w:val="none"/>
+      </w:rPr>
+    </w:lvl>
+  </w:abstractNum>
+  <w:abstractNum w:abstractNumId="14" w15:restartNumberingAfterBreak="0">
     <w:nsid w:val="69176A08"/>
     <w:multiLevelType w:val="multilevel"/>
     <w:tmpl w:val="23D63FD0"/>
@@ -6096,7 +7465,7 @@
       </w:rPr>
     </w:lvl>
   </w:abstractNum>
-  <w:abstractNum w:abstractNumId="7" w15:restartNumberingAfterBreak="0">
+  <w:abstractNum w:abstractNumId="15" w15:restartNumberingAfterBreak="0">
     <w:nsid w:val="74C57864"/>
     <w:multiLevelType w:val="multilevel"/>
     <w:tmpl w:val="EABCE0DA"/>
@@ -6209,29 +7578,169 @@
       </w:rPr>
     </w:lvl>
   </w:abstractNum>
+  <w:abstractNum w:abstractNumId="16" w15:restartNumberingAfterBreak="0">
+    <w:nsid w:val="7D1A247E"/>
+    <w:multiLevelType w:val="multilevel"/>
+    <w:tmpl w:val="340A0021"/>
+    <w:lvl w:ilvl="0">
+      <w:start w:val="1"/>
+      <w:numFmt w:val="bullet"/>
+      <w:lvlText w:val=""/>
+      <w:lvlJc w:val="left"/>
+      <w:pPr>
+        <w:ind w:left="360" w:hanging="360"/>
+      </w:pPr>
+      <w:rPr>
+        <w:rFonts w:ascii="Wingdings" w:hAnsi="Wingdings" w:hint="default"/>
+      </w:rPr>
+    </w:lvl>
+    <w:lvl w:ilvl="1">
+      <w:start w:val="1"/>
+      <w:numFmt w:val="bullet"/>
+      <w:lvlText w:val=""/>
+      <w:lvlJc w:val="left"/>
+      <w:pPr>
+        <w:ind w:left="720" w:hanging="360"/>
+      </w:pPr>
+      <w:rPr>
+        <w:rFonts w:ascii="Wingdings" w:hAnsi="Wingdings" w:hint="default"/>
+      </w:rPr>
+    </w:lvl>
+    <w:lvl w:ilvl="2">
+      <w:start w:val="1"/>
+      <w:numFmt w:val="bullet"/>
+      <w:lvlText w:val=""/>
+      <w:lvlJc w:val="left"/>
+      <w:pPr>
+        <w:ind w:left="1080" w:hanging="360"/>
+      </w:pPr>
+      <w:rPr>
+        <w:rFonts w:ascii="Wingdings" w:hAnsi="Wingdings" w:hint="default"/>
+      </w:rPr>
+    </w:lvl>
+    <w:lvl w:ilvl="3">
+      <w:start w:val="1"/>
+      <w:numFmt w:val="bullet"/>
+      <w:lvlText w:val=""/>
+      <w:lvlJc w:val="left"/>
+      <w:pPr>
+        <w:ind w:left="1440" w:hanging="360"/>
+      </w:pPr>
+      <w:rPr>
+        <w:rFonts w:ascii="Symbol" w:hAnsi="Symbol" w:hint="default"/>
+      </w:rPr>
+    </w:lvl>
+    <w:lvl w:ilvl="4">
+      <w:start w:val="1"/>
+      <w:numFmt w:val="bullet"/>
+      <w:lvlText w:val=""/>
+      <w:lvlJc w:val="left"/>
+      <w:pPr>
+        <w:ind w:left="1800" w:hanging="360"/>
+      </w:pPr>
+      <w:rPr>
+        <w:rFonts w:ascii="Symbol" w:hAnsi="Symbol" w:hint="default"/>
+      </w:rPr>
+    </w:lvl>
+    <w:lvl w:ilvl="5">
+      <w:start w:val="1"/>
+      <w:numFmt w:val="bullet"/>
+      <w:lvlText w:val=""/>
+      <w:lvlJc w:val="left"/>
+      <w:pPr>
+        <w:ind w:left="2160" w:hanging="360"/>
+      </w:pPr>
+      <w:rPr>
+        <w:rFonts w:ascii="Wingdings" w:hAnsi="Wingdings" w:hint="default"/>
+      </w:rPr>
+    </w:lvl>
+    <w:lvl w:ilvl="6">
+      <w:start w:val="1"/>
+      <w:numFmt w:val="bullet"/>
+      <w:lvlText w:val=""/>
+      <w:lvlJc w:val="left"/>
+      <w:pPr>
+        <w:ind w:left="2520" w:hanging="360"/>
+      </w:pPr>
+      <w:rPr>
+        <w:rFonts w:ascii="Wingdings" w:hAnsi="Wingdings" w:hint="default"/>
+      </w:rPr>
+    </w:lvl>
+    <w:lvl w:ilvl="7">
+      <w:start w:val="1"/>
+      <w:numFmt w:val="bullet"/>
+      <w:lvlText w:val=""/>
+      <w:lvlJc w:val="left"/>
+      <w:pPr>
+        <w:ind w:left="2880" w:hanging="360"/>
+      </w:pPr>
+      <w:rPr>
+        <w:rFonts w:ascii="Symbol" w:hAnsi="Symbol" w:hint="default"/>
+      </w:rPr>
+    </w:lvl>
+    <w:lvl w:ilvl="8">
+      <w:start w:val="1"/>
+      <w:numFmt w:val="bullet"/>
+      <w:lvlText w:val=""/>
+      <w:lvlJc w:val="left"/>
+      <w:pPr>
+        <w:ind w:left="3240" w:hanging="360"/>
+      </w:pPr>
+      <w:rPr>
+        <w:rFonts w:ascii="Symbol" w:hAnsi="Symbol" w:hint="default"/>
+      </w:rPr>
+    </w:lvl>
+  </w:abstractNum>
   <w:num w:numId="1" w16cid:durableId="1059599622">
+    <w:abstractNumId w:val="2"/>
+  </w:num>
+  <w:num w:numId="2" w16cid:durableId="781605635">
+    <w:abstractNumId w:val="9"/>
+  </w:num>
+  <w:num w:numId="3" w16cid:durableId="256642078">
+    <w:abstractNumId w:val="14"/>
+  </w:num>
+  <w:num w:numId="4" w16cid:durableId="1286237161">
+    <w:abstractNumId w:val="6"/>
+  </w:num>
+  <w:num w:numId="5" w16cid:durableId="827986012">
+    <w:abstractNumId w:val="11"/>
+  </w:num>
+  <w:num w:numId="6" w16cid:durableId="1425689647">
     <w:abstractNumId w:val="1"/>
   </w:num>
-  <w:num w:numId="2" w16cid:durableId="781605635">
+  <w:num w:numId="7" w16cid:durableId="4064055">
+    <w:abstractNumId w:val="15"/>
+  </w:num>
+  <w:num w:numId="8" w16cid:durableId="1324310790">
     <w:abstractNumId w:val="4"/>
   </w:num>
-  <w:num w:numId="3" w16cid:durableId="256642078">
-    <w:abstractNumId w:val="6"/>
+  <w:num w:numId="9" w16cid:durableId="1376002948">
+    <w:abstractNumId w:val="5"/>
   </w:num>
-  <w:num w:numId="4" w16cid:durableId="1286237161">
+  <w:num w:numId="10" w16cid:durableId="1295021359">
+    <w:abstractNumId w:val="12"/>
+  </w:num>
+  <w:num w:numId="11" w16cid:durableId="1873760114">
+    <w:abstractNumId w:val="16"/>
+  </w:num>
+  <w:num w:numId="12" w16cid:durableId="1677999035">
     <w:abstractNumId w:val="3"/>
   </w:num>
-  <w:num w:numId="5" w16cid:durableId="827986012">
-    <w:abstractNumId w:val="5"/>
+  <w:num w:numId="13" w16cid:durableId="1964918514">
+    <w:abstractNumId w:val="13"/>
   </w:num>
-  <w:num w:numId="6" w16cid:durableId="1425689647">
-    <w:abstractNumId w:val="0"/>
+  <w:num w:numId="14" w16cid:durableId="1017384348">
+    <w:abstractNumId w:val="10"/>
   </w:num>
-  <w:num w:numId="7" w16cid:durableId="4064055">
+  <w:num w:numId="15" w16cid:durableId="428233551">
+    <w:abstractNumId w:val="8"/>
+  </w:num>
+  <w:num w:numId="16" w16cid:durableId="814835180">
     <w:abstractNumId w:val="7"/>
   </w:num>
-  <w:num w:numId="8" w16cid:durableId="1324310790">
-    <w:abstractNumId w:val="2"/>
+  <w:num w:numId="17" w16cid:durableId="66849632">
+    <w:abstractNumId w:val="0"/>
   </w:num>
 </w:numbering>
 </file>
@@ -6754,7 +8263,6 @@
   <w:style w:type="character" w:default="1" w:styleId="Fuentedeprrafopredeter">
     <w:name w:val="Default Paragraph Font"/>
     <w:uiPriority w:val="1"/>
-    <w:semiHidden/>
     <w:unhideWhenUsed/>
   </w:style>
   <w:style w:type="table" w:default="1" w:styleId="Tablanormal">
@@ -7075,9 +8583,7 @@
       <w:tblStyleRowBandSize w:val="1"/>
       <w:tblStyleColBandSize w:val="1"/>
       <w:tblCellMar>
-        <w:top w:w="0" w:type="dxa"/>
         <w:left w:w="108" w:type="dxa"/>
-        <w:bottom w:w="0" w:type="dxa"/>
         <w:right w:w="108" w:type="dxa"/>
       </w:tblCellMar>
     </w:tblPr>
@@ -7088,9 +8594,7 @@
       <w:tblStyleRowBandSize w:val="1"/>
       <w:tblStyleColBandSize w:val="1"/>
       <w:tblCellMar>
-        <w:top w:w="0" w:type="dxa"/>
         <w:left w:w="108" w:type="dxa"/>
-        <w:bottom w:w="0" w:type="dxa"/>
         <w:right w:w="108" w:type="dxa"/>
       </w:tblCellMar>
     </w:tblPr>
@@ -7101,9 +8605,7 @@
       <w:tblStyleRowBandSize w:val="1"/>
       <w:tblStyleColBandSize w:val="1"/>
       <w:tblCellMar>
-        <w:top w:w="0" w:type="dxa"/>
         <w:left w:w="108" w:type="dxa"/>
-        <w:bottom w:w="0" w:type="dxa"/>
         <w:right w:w="108" w:type="dxa"/>
       </w:tblCellMar>
     </w:tblPr>
@@ -7114,9 +8616,7 @@
       <w:tblStyleRowBandSize w:val="1"/>
       <w:tblStyleColBandSize w:val="1"/>
       <w:tblCellMar>
-        <w:top w:w="0" w:type="dxa"/>
         <w:left w:w="108" w:type="dxa"/>
-        <w:bottom w:w="0" w:type="dxa"/>
         <w:right w:w="108" w:type="dxa"/>
       </w:tblCellMar>
     </w:tblPr>
@@ -7127,9 +8627,7 @@
       <w:tblStyleRowBandSize w:val="1"/>
       <w:tblStyleColBandSize w:val="1"/>
       <w:tblCellMar>
-        <w:top w:w="0" w:type="dxa"/>
         <w:left w:w="108" w:type="dxa"/>
-        <w:bottom w:w="0" w:type="dxa"/>
         <w:right w:w="108" w:type="dxa"/>
       </w:tblCellMar>
     </w:tblPr>
@@ -7140,9 +8638,7 @@
       <w:tblStyleRowBandSize w:val="1"/>
       <w:tblStyleColBandSize w:val="1"/>
       <w:tblCellMar>
-        <w:top w:w="0" w:type="dxa"/>
         <w:left w:w="108" w:type="dxa"/>
-        <w:bottom w:w="0" w:type="dxa"/>
         <w:right w:w="108" w:type="dxa"/>
       </w:tblCellMar>
     </w:tblPr>
@@ -7153,9 +8649,7 @@
       <w:tblStyleRowBandSize w:val="1"/>
       <w:tblStyleColBandSize w:val="1"/>
       <w:tblCellMar>
-        <w:top w:w="0" w:type="dxa"/>
         <w:left w:w="108" w:type="dxa"/>
-        <w:bottom w:w="0" w:type="dxa"/>
         <w:right w:w="108" w:type="dxa"/>
       </w:tblCellMar>
     </w:tblPr>
@@ -7166,9 +8660,7 @@
       <w:tblStyleRowBandSize w:val="1"/>
       <w:tblStyleColBandSize w:val="1"/>
       <w:tblCellMar>
-        <w:top w:w="0" w:type="dxa"/>
         <w:left w:w="108" w:type="dxa"/>
-        <w:bottom w:w="0" w:type="dxa"/>
         <w:right w:w="108" w:type="dxa"/>
       </w:tblCellMar>
     </w:tblPr>
@@ -7179,9 +8671,7 @@
       <w:tblStyleRowBandSize w:val="1"/>
       <w:tblStyleColBandSize w:val="1"/>
       <w:tblCellMar>
-        <w:top w:w="0" w:type="dxa"/>
         <w:left w:w="108" w:type="dxa"/>
-        <w:bottom w:w="0" w:type="dxa"/>
         <w:right w:w="108" w:type="dxa"/>
       </w:tblCellMar>
     </w:tblPr>
@@ -7192,9 +8682,7 @@
       <w:tblStyleRowBandSize w:val="1"/>
       <w:tblStyleColBandSize w:val="1"/>
       <w:tblCellMar>
-        <w:top w:w="0" w:type="dxa"/>
         <w:left w:w="108" w:type="dxa"/>
-        <w:bottom w:w="0" w:type="dxa"/>
         <w:right w:w="108" w:type="dxa"/>
       </w:tblCellMar>
     </w:tblPr>
@@ -7205,9 +8693,7 @@
       <w:tblStyleRowBandSize w:val="1"/>
       <w:tblStyleColBandSize w:val="1"/>
       <w:tblCellMar>
-        <w:top w:w="0" w:type="dxa"/>
         <w:left w:w="108" w:type="dxa"/>
-        <w:bottom w:w="0" w:type="dxa"/>
         <w:right w:w="108" w:type="dxa"/>
       </w:tblCellMar>
     </w:tblPr>
@@ -7218,9 +8704,7 @@
       <w:tblStyleRowBandSize w:val="1"/>
       <w:tblStyleColBandSize w:val="1"/>
       <w:tblCellMar>
-        <w:top w:w="0" w:type="dxa"/>
         <w:left w:w="108" w:type="dxa"/>
-        <w:bottom w:w="0" w:type="dxa"/>
         <w:right w:w="108" w:type="dxa"/>
       </w:tblCellMar>
     </w:tblPr>
@@ -7231,9 +8715,7 @@
       <w:tblStyleRowBandSize w:val="1"/>
       <w:tblStyleColBandSize w:val="1"/>
       <w:tblCellMar>
-        <w:top w:w="0" w:type="dxa"/>
         <w:left w:w="108" w:type="dxa"/>
-        <w:bottom w:w="0" w:type="dxa"/>
         <w:right w:w="108" w:type="dxa"/>
       </w:tblCellMar>
     </w:tblPr>
@@ -7244,9 +8726,7 @@
       <w:tblStyleRowBandSize w:val="1"/>
       <w:tblStyleColBandSize w:val="1"/>
       <w:tblCellMar>
-        <w:top w:w="0" w:type="dxa"/>
         <w:left w:w="108" w:type="dxa"/>
-        <w:bottom w:w="0" w:type="dxa"/>
         <w:right w:w="108" w:type="dxa"/>
       </w:tblCellMar>
     </w:tblPr>
@@ -7257,9 +8737,7 @@
       <w:tblStyleRowBandSize w:val="1"/>
       <w:tblStyleColBandSize w:val="1"/>
       <w:tblCellMar>
-        <w:top w:w="0" w:type="dxa"/>
         <w:left w:w="108" w:type="dxa"/>
-        <w:bottom w:w="0" w:type="dxa"/>
         <w:right w:w="108" w:type="dxa"/>
       </w:tblCellMar>
     </w:tblPr>
@@ -7270,9 +8748,7 @@
       <w:tblStyleRowBandSize w:val="1"/>
       <w:tblStyleColBandSize w:val="1"/>
       <w:tblCellMar>
-        <w:top w:w="0" w:type="dxa"/>
         <w:left w:w="108" w:type="dxa"/>
-        <w:bottom w:w="0" w:type="dxa"/>
         <w:right w:w="108" w:type="dxa"/>
       </w:tblCellMar>
     </w:tblPr>
@@ -7283,9 +8759,7 @@
       <w:tblStyleRowBandSize w:val="1"/>
       <w:tblStyleColBandSize w:val="1"/>
       <w:tblCellMar>
-        <w:top w:w="0" w:type="dxa"/>
         <w:left w:w="108" w:type="dxa"/>
-        <w:bottom w:w="0" w:type="dxa"/>
         <w:right w:w="108" w:type="dxa"/>
       </w:tblCellMar>
     </w:tblPr>
@@ -7315,9 +8789,7 @@
       <w:tblStyleRowBandSize w:val="1"/>
       <w:tblStyleColBandSize w:val="1"/>
       <w:tblCellMar>
-        <w:top w:w="0" w:type="dxa"/>
         <w:left w:w="108" w:type="dxa"/>
-        <w:bottom w:w="0" w:type="dxa"/>
         <w:right w:w="108" w:type="dxa"/>
       </w:tblCellMar>
     </w:tblPr>
@@ -7328,9 +8800,7 @@
       <w:tblStyleRowBandSize w:val="1"/>
       <w:tblStyleColBandSize w:val="1"/>
       <w:tblCellMar>
-        <w:top w:w="0" w:type="dxa"/>
         <w:left w:w="108" w:type="dxa"/>
-        <w:bottom w:w="0" w:type="dxa"/>
         <w:right w:w="108" w:type="dxa"/>
       </w:tblCellMar>
     </w:tblPr>
@@ -7341,9 +8811,7 @@
       <w:tblStyleRowBandSize w:val="1"/>
       <w:tblStyleColBandSize w:val="1"/>
       <w:tblCellMar>
-        <w:top w:w="0" w:type="dxa"/>
         <w:left w:w="108" w:type="dxa"/>
-        <w:bottom w:w="0" w:type="dxa"/>
         <w:right w:w="108" w:type="dxa"/>
       </w:tblCellMar>
     </w:tblPr>
@@ -7354,9 +8822,7 @@
       <w:tblStyleRowBandSize w:val="1"/>
       <w:tblStyleColBandSize w:val="1"/>
       <w:tblCellMar>
-        <w:top w:w="0" w:type="dxa"/>
         <w:left w:w="108" w:type="dxa"/>
-        <w:bottom w:w="0" w:type="dxa"/>
         <w:right w:w="108" w:type="dxa"/>
       </w:tblCellMar>
     </w:tblPr>
@@ -7367,9 +8833,7 @@
       <w:tblStyleRowBandSize w:val="1"/>
       <w:tblStyleColBandSize w:val="1"/>
       <w:tblCellMar>
-        <w:top w:w="0" w:type="dxa"/>
         <w:left w:w="108" w:type="dxa"/>
-        <w:bottom w:w="0" w:type="dxa"/>
         <w:right w:w="108" w:type="dxa"/>
       </w:tblCellMar>
     </w:tblPr>
@@ -7380,9 +8844,7 @@
       <w:tblStyleRowBandSize w:val="1"/>
       <w:tblStyleColBandSize w:val="1"/>
       <w:tblCellMar>
-        <w:top w:w="0" w:type="dxa"/>
         <w:left w:w="108" w:type="dxa"/>
-        <w:bottom w:w="0" w:type="dxa"/>
         <w:right w:w="108" w:type="dxa"/>
       </w:tblCellMar>
     </w:tblPr>
@@ -7393,9 +8855,7 @@
       <w:tblStyleRowBandSize w:val="1"/>
       <w:tblStyleColBandSize w:val="1"/>
       <w:tblCellMar>
-        <w:top w:w="0" w:type="dxa"/>
         <w:left w:w="108" w:type="dxa"/>
-        <w:bottom w:w="0" w:type="dxa"/>
         <w:right w:w="108" w:type="dxa"/>
       </w:tblCellMar>
     </w:tblPr>
@@ -7406,9 +8866,7 @@
       <w:tblStyleRowBandSize w:val="1"/>
       <w:tblStyleColBandSize w:val="1"/>
       <w:tblCellMar>
-        <w:top w:w="0" w:type="dxa"/>
         <w:left w:w="108" w:type="dxa"/>
-        <w:bottom w:w="0" w:type="dxa"/>
         <w:right w:w="108" w:type="dxa"/>
       </w:tblCellMar>
     </w:tblPr>
@@ -7419,9 +8877,7 @@
       <w:tblStyleRowBandSize w:val="1"/>
       <w:tblStyleColBandSize w:val="1"/>
       <w:tblCellMar>
-        <w:top w:w="0" w:type="dxa"/>
         <w:left w:w="108" w:type="dxa"/>
-        <w:bottom w:w="0" w:type="dxa"/>
         <w:right w:w="108" w:type="dxa"/>
       </w:tblCellMar>
     </w:tblPr>
@@ -7432,9 +8888,7 @@
       <w:tblStyleRowBandSize w:val="1"/>
       <w:tblStyleColBandSize w:val="1"/>
       <w:tblCellMar>
-        <w:top w:w="0" w:type="dxa"/>
         <w:left w:w="108" w:type="dxa"/>
-        <w:bottom w:w="0" w:type="dxa"/>
         <w:right w:w="108" w:type="dxa"/>
       </w:tblCellMar>
     </w:tblPr>
@@ -7445,9 +8899,7 @@
       <w:tblStyleRowBandSize w:val="1"/>
       <w:tblStyleColBandSize w:val="1"/>
       <w:tblCellMar>
-        <w:top w:w="0" w:type="dxa"/>
         <w:left w:w="108" w:type="dxa"/>
-        <w:bottom w:w="0" w:type="dxa"/>
         <w:right w:w="108" w:type="dxa"/>
       </w:tblCellMar>
     </w:tblPr>
@@ -7458,9 +8910,7 @@
       <w:tblStyleRowBandSize w:val="1"/>
       <w:tblStyleColBandSize w:val="1"/>
       <w:tblCellMar>
-        <w:top w:w="0" w:type="dxa"/>
         <w:left w:w="108" w:type="dxa"/>
-        <w:bottom w:w="0" w:type="dxa"/>
         <w:right w:w="108" w:type="dxa"/>
       </w:tblCellMar>
     </w:tblPr>
@@ -7471,9 +8921,7 @@
       <w:tblStyleRowBandSize w:val="1"/>
       <w:tblStyleColBandSize w:val="1"/>
       <w:tblCellMar>
-        <w:top w:w="0" w:type="dxa"/>
         <w:left w:w="108" w:type="dxa"/>
-        <w:bottom w:w="0" w:type="dxa"/>
         <w:right w:w="108" w:type="dxa"/>
       </w:tblCellMar>
     </w:tblPr>
@@ -7484,9 +8932,7 @@
       <w:tblStyleRowBandSize w:val="1"/>
       <w:tblStyleColBandSize w:val="1"/>
       <w:tblCellMar>
-        <w:top w:w="0" w:type="dxa"/>
         <w:left w:w="108" w:type="dxa"/>
-        <w:bottom w:w="0" w:type="dxa"/>
         <w:right w:w="108" w:type="dxa"/>
       </w:tblCellMar>
     </w:tblPr>
@@ -7497,9 +8943,7 @@
       <w:tblStyleRowBandSize w:val="1"/>
       <w:tblStyleColBandSize w:val="1"/>
       <w:tblCellMar>
-        <w:top w:w="0" w:type="dxa"/>
         <w:left w:w="108" w:type="dxa"/>
-        <w:bottom w:w="0" w:type="dxa"/>
         <w:right w:w="108" w:type="dxa"/>
       </w:tblCellMar>
     </w:tblPr>
@@ -7510,9 +8954,7 @@
       <w:tblStyleRowBandSize w:val="1"/>
       <w:tblStyleColBandSize w:val="1"/>
       <w:tblCellMar>
-        <w:top w:w="0" w:type="dxa"/>
         <w:left w:w="108" w:type="dxa"/>
-        <w:bottom w:w="0" w:type="dxa"/>
         <w:right w:w="108" w:type="dxa"/>
       </w:tblCellMar>
     </w:tblPr>
@@ -7523,9 +8965,7 @@
       <w:tblStyleRowBandSize w:val="1"/>
       <w:tblStyleColBandSize w:val="1"/>
       <w:tblCellMar>
-        <w:top w:w="0" w:type="dxa"/>
         <w:left w:w="108" w:type="dxa"/>
-        <w:bottom w:w="0" w:type="dxa"/>
         <w:right w:w="108" w:type="dxa"/>
       </w:tblCellMar>
     </w:tblPr>

</xml_diff>

<commit_message>
Modificación Alonso DOC_1.5 / AutoEvaCompetencia Cris
</commit_message>
<xml_diff>
--- a/Capstone/Fase 1/1.5_GuiaEstudiante_Fase 1_Definicion Proyecto APT.docx
+++ b/Capstone/Fase 1/1.5_GuiaEstudiante_Fase 1_Definicion Proyecto APT.docx
@@ -1096,17 +1096,6 @@
     </w:tbl>
     <w:p>
       <w:pPr>
-        <w:spacing w:after="0" w:line="360" w:lineRule="auto"/>
-        <w:jc w:val="both"/>
-        <w:rPr>
-          <w:b/>
-          <w:sz w:val="24"/>
-          <w:szCs w:val="24"/>
-        </w:rPr>
-      </w:pPr>
-    </w:p>
-    <w:p>
-      <w:pPr>
         <w:spacing w:after="0" w:line="240" w:lineRule="auto"/>
         <w:rPr>
           <w:b/>
@@ -1115,7 +1104,6 @@
         </w:rPr>
       </w:pPr>
       <w:r>
-        <w:lastRenderedPageBreak/>
         <w:br w:type="page"/>
       </w:r>
     </w:p>
@@ -1956,18 +1944,7 @@
                 <w:sz w:val="20"/>
                 <w:szCs w:val="20"/>
               </w:rPr>
-              <w:t xml:space="preserve">2.- </w:t>
-            </w:r>
-            <w:r>
-              <w:rPr>
-                <w:b/>
-                <w:bCs/>
-                <w:iCs/>
-                <w:color w:val="548DD4"/>
-                <w:sz w:val="20"/>
-                <w:szCs w:val="20"/>
-              </w:rPr>
-              <w:t>Diseñar la estructura de la base de datos</w:t>
+              <w:t>2.- Diseñar la estructura de la base de datos</w:t>
             </w:r>
           </w:p>
           <w:p>
@@ -2063,18 +2040,7 @@
                 <w:sz w:val="20"/>
                 <w:szCs w:val="20"/>
               </w:rPr>
-              <w:t xml:space="preserve">3.- </w:t>
-            </w:r>
-            <w:r>
-              <w:rPr>
-                <w:b/>
-                <w:bCs/>
-                <w:iCs/>
-                <w:color w:val="548DD4"/>
-                <w:sz w:val="20"/>
-                <w:szCs w:val="20"/>
-              </w:rPr>
-              <w:t>Desarrollar la aplicación móvil con funciones principales</w:t>
+              <w:t>3.- Desarrollar la aplicación móvil con funciones principales</w:t>
             </w:r>
           </w:p>
           <w:p>
@@ -2184,18 +2150,7 @@
                 <w:szCs w:val="20"/>
               </w:rPr>
               <w:lastRenderedPageBreak/>
-              <w:t xml:space="preserve">4.- </w:t>
-            </w:r>
-            <w:r>
-              <w:rPr>
-                <w:b/>
-                <w:bCs/>
-                <w:iCs/>
-                <w:color w:val="548DD4"/>
-                <w:sz w:val="20"/>
-                <w:szCs w:val="20"/>
-              </w:rPr>
-              <w:t>Incorporar alertas a cuidadores o familiares</w:t>
+              <w:t>4.- Incorporar alertas a cuidadores o familiares</w:t>
             </w:r>
           </w:p>
           <w:p>
@@ -2291,18 +2246,7 @@
                 <w:sz w:val="20"/>
                 <w:szCs w:val="20"/>
               </w:rPr>
-              <w:t xml:space="preserve">5.- </w:t>
-            </w:r>
-            <w:r>
-              <w:rPr>
-                <w:b/>
-                <w:bCs/>
-                <w:iCs/>
-                <w:color w:val="548DD4"/>
-                <w:sz w:val="20"/>
-                <w:szCs w:val="20"/>
-              </w:rPr>
-              <w:t>Probar y validar la aplicación con casos simulados</w:t>
+              <w:t>5.- Probar y validar la aplicación con casos simulados</w:t>
             </w:r>
           </w:p>
           <w:p>
@@ -2398,18 +2342,7 @@
                 <w:sz w:val="20"/>
                 <w:szCs w:val="20"/>
               </w:rPr>
-              <w:t xml:space="preserve">6.- </w:t>
-            </w:r>
-            <w:r>
-              <w:rPr>
-                <w:b/>
-                <w:bCs/>
-                <w:iCs/>
-                <w:color w:val="548DD4"/>
-                <w:sz w:val="20"/>
-                <w:szCs w:val="20"/>
-              </w:rPr>
-              <w:t>Documentar el proceso y los resultados obtenidos</w:t>
+              <w:t>6.- Documentar el proceso y los resultados obtenidos</w:t>
             </w:r>
           </w:p>
           <w:p>
@@ -3666,12 +3599,101 @@
         </w:rPr>
       </w:pPr>
     </w:p>
+    <w:p>
+      <w:pPr>
+        <w:spacing w:after="0" w:line="240" w:lineRule="auto"/>
+        <w:rPr>
+          <w:b/>
+          <w:sz w:val="24"/>
+          <w:szCs w:val="24"/>
+        </w:rPr>
+      </w:pPr>
+    </w:p>
+    <w:p>
+      <w:pPr>
+        <w:spacing w:after="0" w:line="240" w:lineRule="auto"/>
+        <w:rPr>
+          <w:b/>
+          <w:sz w:val="24"/>
+          <w:szCs w:val="24"/>
+        </w:rPr>
+      </w:pPr>
+    </w:p>
+    <w:p>
+      <w:pPr>
+        <w:spacing w:after="0" w:line="240" w:lineRule="auto"/>
+        <w:rPr>
+          <w:b/>
+          <w:sz w:val="24"/>
+          <w:szCs w:val="24"/>
+        </w:rPr>
+      </w:pPr>
+    </w:p>
+    <w:p>
+      <w:pPr>
+        <w:spacing w:after="0" w:line="240" w:lineRule="auto"/>
+        <w:rPr>
+          <w:b/>
+          <w:sz w:val="24"/>
+          <w:szCs w:val="24"/>
+        </w:rPr>
+      </w:pPr>
+    </w:p>
+    <w:p>
+      <w:pPr>
+        <w:spacing w:after="0" w:line="240" w:lineRule="auto"/>
+        <w:rPr>
+          <w:b/>
+          <w:sz w:val="24"/>
+          <w:szCs w:val="24"/>
+        </w:rPr>
+      </w:pPr>
+    </w:p>
+    <w:p>
+      <w:pPr>
+        <w:spacing w:after="0" w:line="240" w:lineRule="auto"/>
+        <w:rPr>
+          <w:b/>
+          <w:sz w:val="24"/>
+          <w:szCs w:val="24"/>
+        </w:rPr>
+      </w:pPr>
+    </w:p>
+    <w:p>
+      <w:pPr>
+        <w:spacing w:after="0" w:line="240" w:lineRule="auto"/>
+        <w:rPr>
+          <w:b/>
+          <w:sz w:val="24"/>
+          <w:szCs w:val="24"/>
+        </w:rPr>
+      </w:pPr>
+    </w:p>
+    <w:p>
+      <w:pPr>
+        <w:spacing w:after="0" w:line="240" w:lineRule="auto"/>
+        <w:rPr>
+          <w:b/>
+          <w:sz w:val="24"/>
+          <w:szCs w:val="24"/>
+        </w:rPr>
+      </w:pPr>
+    </w:p>
+    <w:p>
+      <w:pPr>
+        <w:spacing w:after="0" w:line="240" w:lineRule="auto"/>
+        <w:rPr>
+          <w:b/>
+          <w:sz w:val="24"/>
+          <w:szCs w:val="24"/>
+        </w:rPr>
+      </w:pPr>
+    </w:p>
     <w:tbl>
       <w:tblPr>
-        <w:tblStyle w:val="afa"/>
-        <w:tblpPr w:leftFromText="180" w:rightFromText="180" w:topFromText="180" w:bottomFromText="180" w:vertAnchor="text" w:tblpX="-1610" w:tblpY="8851"/>
-        <w:tblW w:w="9640" w:type="dxa"/>
-        <w:tblInd w:w="0" w:type="dxa"/>
+        <w:tblStyle w:val="af6"/>
+        <w:tblW w:w="9498" w:type="dxa"/>
+        <w:tblInd w:w="-714" w:type="dxa"/>
         <w:tblBorders>
           <w:top w:val="single" w:sz="4" w:space="0" w:color="BFBFBF"/>
           <w:left w:val="single" w:sz="4" w:space="0" w:color="BFBFBF"/>
@@ -3684,7 +3706,7 @@
         <w:tblLook w:val="0400" w:firstRow="0" w:lastRow="0" w:firstColumn="0" w:lastColumn="0" w:noHBand="0" w:noVBand="1"/>
       </w:tblPr>
       <w:tblGrid>
-        <w:gridCol w:w="9640"/>
+        <w:gridCol w:w="9498"/>
       </w:tblGrid>
       <w:tr>
         <w:trPr>
@@ -3692,7 +3714,7 @@
         </w:trPr>
         <w:tc>
           <w:tcPr>
-            <w:tcW w:w="9640" w:type="dxa"/>
+            <w:tcW w:w="9498" w:type="dxa"/>
             <w:vAlign w:val="center"/>
           </w:tcPr>
           <w:p>
@@ -3712,7 +3734,25 @@
                 <w:szCs w:val="28"/>
               </w:rPr>
               <w:lastRenderedPageBreak/>
-              <w:t>6. Evidencias</w:t>
+              <w:t>6</w:t>
+            </w:r>
+            <w:r>
+              <w:rPr>
+                <w:b/>
+                <w:color w:val="1F3864"/>
+                <w:sz w:val="28"/>
+                <w:szCs w:val="28"/>
+              </w:rPr>
+              <w:t xml:space="preserve">. </w:t>
+            </w:r>
+            <w:r>
+              <w:rPr>
+                <w:b/>
+                <w:color w:val="1F3864"/>
+                <w:sz w:val="28"/>
+                <w:szCs w:val="28"/>
+              </w:rPr>
+              <w:t>Evidencias</w:t>
             </w:r>
           </w:p>
         </w:tc>
@@ -3723,32 +3763,34 @@
         </w:trPr>
         <w:tc>
           <w:tcPr>
-            <w:tcW w:w="9640" w:type="dxa"/>
+            <w:tcW w:w="9498" w:type="dxa"/>
             <w:shd w:val="clear" w:color="auto" w:fill="D9E2F3"/>
             <w:vAlign w:val="center"/>
           </w:tcPr>
           <w:p>
             <w:pPr>
-              <w:spacing w:after="0"/>
-              <w:jc w:val="both"/>
-              <w:rPr>
-                <w:color w:val="595959"/>
-              </w:rPr>
-            </w:pPr>
-            <w:r>
-              <w:rPr>
-                <w:color w:val="1F3864"/>
-              </w:rPr>
-              <w:t xml:space="preserve">A continuación, describe qué evidencias serán evaluadas en el informe de avance y en el informe final de tu proyecto APT. Estas evidencias deben ser acordadas con tu docente. </w:t>
-            </w:r>
-            <w:r>
-              <w:t xml:space="preserve"> Se entenderá por evidencia los productos que se desarrollen durante el proyecto y cuyo propósito sea visibilizar o documentar cómo se ha implementado el trabajo. </w:t>
-            </w:r>
-            <w:r>
-              <w:rPr>
-                <w:color w:val="595959"/>
-              </w:rPr>
-              <w:t xml:space="preserve"> </w:t>
+              <w:pBdr>
+                <w:top w:val="nil"/>
+                <w:left w:val="nil"/>
+                <w:bottom w:val="nil"/>
+                <w:right w:val="nil"/>
+                <w:between w:val="nil"/>
+              </w:pBdr>
+              <w:tabs>
+                <w:tab w:val="center" w:pos="4419"/>
+                <w:tab w:val="right" w:pos="8838"/>
+              </w:tabs>
+              <w:spacing w:after="0" w:line="240" w:lineRule="auto"/>
+              <w:jc w:val="both"/>
+              <w:rPr>
+                <w:color w:val="1F3864"/>
+              </w:rPr>
+            </w:pPr>
+            <w:r>
+              <w:rPr>
+                <w:color w:val="1F3864"/>
+              </w:rPr>
+              <w:t>A continuación, describe qué evidencias serán evaluadas en el informe de avance y en el informe final de tu proyecto APT. Estas evidencias deben ser acordadas con tu docente.  Se entenderá por evidencia los productos que se desarrollen durante el proyecto y cuyo propósito sea visibilizar o documentar cómo se ha implementado el trabajo.  </w:t>
             </w:r>
           </w:p>
         </w:tc>
@@ -3763,9 +3805,6 @@
           <w:szCs w:val="24"/>
         </w:rPr>
       </w:pPr>
-      <w:r>
-        <w:br w:type="page"/>
-      </w:r>
     </w:p>
     <w:tbl>
       <w:tblPr>
@@ -3823,7 +3862,6 @@
                 <w:b/>
                 <w:color w:val="1F3864"/>
               </w:rPr>
-              <w:lastRenderedPageBreak/>
               <w:t xml:space="preserve">Tipo de evidencia </w:t>
             </w:r>
           </w:p>
@@ -3990,9 +4028,10 @@
             <w:r>
               <w:rPr>
                 <w:b/>
-                <w:color w:val="1F3864"/>
-              </w:rPr>
-              <w:t>Avance</w:t>
+                <w:bCs/>
+                <w:color w:val="1F3864"/>
+              </w:rPr>
+              <w:t>Final</w:t>
             </w:r>
           </w:p>
         </w:tc>
@@ -4023,9 +4062,10 @@
             <w:r>
               <w:rPr>
                 <w:b/>
-                <w:color w:val="1F3864"/>
-              </w:rPr>
-              <w:t>1.5 Definición proyecto APT</w:t>
+                <w:bCs/>
+                <w:color w:val="1F3864"/>
+              </w:rPr>
+              <w:t>1.1.1 Descripción proyecto APT</w:t>
             </w:r>
           </w:p>
         </w:tc>
@@ -4044,11 +4084,12 @@
             <w:r>
               <w:rPr>
                 <w:i/>
+                <w:iCs/>
                 <w:color w:val="4472C4"/>
                 <w:sz w:val="18"/>
                 <w:szCs w:val="18"/>
               </w:rPr>
-              <w:t xml:space="preserve"> Documento avanzado, consolidado la propuesta para avanzar en el documento mencionado (Carta Gantt)</w:t>
+              <w:t xml:space="preserve"> Punto relevante para el documento de definición proyecto APT, describiendo de forma clara la solución a desarrollar</w:t>
             </w:r>
           </w:p>
         </w:tc>
@@ -4067,11 +4108,12 @@
             <w:r>
               <w:rPr>
                 <w:i/>
+                <w:iCs/>
                 <w:color w:val="4472C4"/>
                 <w:sz w:val="18"/>
                 <w:szCs w:val="18"/>
               </w:rPr>
-              <w:t xml:space="preserve">Respaldo concreto para el desarrollo de  solución propuesta </w:t>
+              <w:t>Respaldo concreto para el desarrollo de  solución propuesta </w:t>
             </w:r>
           </w:p>
         </w:tc>
@@ -4100,9 +4142,10 @@
             <w:r>
               <w:rPr>
                 <w:b/>
-                <w:color w:val="1F3864"/>
-              </w:rPr>
-              <w:t>Avance</w:t>
+                <w:bCs/>
+                <w:color w:val="1F3864"/>
+              </w:rPr>
+              <w:t>Final</w:t>
             </w:r>
           </w:p>
         </w:tc>
@@ -4133,9 +4176,10 @@
             <w:r>
               <w:rPr>
                 <w:b/>
-                <w:color w:val="1F3864"/>
-              </w:rPr>
-              <w:t>Carta Gantt</w:t>
+                <w:bCs/>
+                <w:color w:val="1F3864"/>
+              </w:rPr>
+              <w:t>1.1.2 Fundamentación</w:t>
             </w:r>
           </w:p>
         </w:tc>
@@ -4154,54 +4198,36 @@
             <w:r>
               <w:rPr>
                 <w:i/>
+                <w:iCs/>
                 <w:color w:val="4472C4"/>
                 <w:sz w:val="18"/>
                 <w:szCs w:val="18"/>
               </w:rPr>
-              <w:t xml:space="preserve">Se generó la plantilla de carta </w:t>
-            </w:r>
-            <w:proofErr w:type="spellStart"/>
+              <w:t>Evidencia perteneciente al documento de definición proyecto APT, describiendo y explicando la relevancia del proyecto asociando con el perfil de egreso en  conjunto con los intereses profesionales y respaldando la factibilidad de realizar la solución propuesta </w:t>
+            </w:r>
+          </w:p>
+        </w:tc>
+        <w:tc>
+          <w:tcPr>
+            <w:tcW w:w="2550" w:type="dxa"/>
+          </w:tcPr>
+          <w:p>
+            <w:pPr>
+              <w:jc w:val="center"/>
+              <w:rPr>
+                <w:b/>
+                <w:color w:val="1F3864"/>
+              </w:rPr>
+            </w:pPr>
             <w:r>
               <w:rPr>
                 <w:i/>
+                <w:iCs/>
                 <w:color w:val="4472C4"/>
                 <w:sz w:val="18"/>
                 <w:szCs w:val="18"/>
               </w:rPr>
-              <w:t>gantt</w:t>
-            </w:r>
-            <w:proofErr w:type="spellEnd"/>
-            <w:r>
-              <w:rPr>
-                <w:i/>
-                <w:color w:val="4472C4"/>
-                <w:sz w:val="18"/>
-                <w:szCs w:val="18"/>
-              </w:rPr>
-              <w:t xml:space="preserve"> adaptando los días lunes a viernes, completando las distintas actividades actuales y futuras del proyecto APT</w:t>
-            </w:r>
-          </w:p>
-        </w:tc>
-        <w:tc>
-          <w:tcPr>
-            <w:tcW w:w="2550" w:type="dxa"/>
-          </w:tcPr>
-          <w:p>
-            <w:pPr>
-              <w:jc w:val="center"/>
-              <w:rPr>
-                <w:b/>
-                <w:color w:val="1F3864"/>
-              </w:rPr>
-            </w:pPr>
-            <w:r>
-              <w:rPr>
-                <w:i/>
-                <w:color w:val="4472C4"/>
-                <w:sz w:val="18"/>
-                <w:szCs w:val="18"/>
-              </w:rPr>
-              <w:t>Documento de seguimiento para las distintas actividades del proyecto</w:t>
+              <w:t>Punto esencial para respaldar la propuesta sin perder el enfoque y así poder alinear de forma clara la solución para avanzar en el proceso</w:t>
             </w:r>
           </w:p>
         </w:tc>
@@ -4234,6 +4260,14 @@
                 <w:color w:val="1F3864"/>
               </w:rPr>
             </w:pPr>
+            <w:r>
+              <w:rPr>
+                <w:b/>
+                <w:bCs/>
+                <w:color w:val="1F3864"/>
+              </w:rPr>
+              <w:t>Final</w:t>
+            </w:r>
           </w:p>
         </w:tc>
         <w:tc>
@@ -4260,6 +4294,14 @@
                 <w:color w:val="1F3864"/>
               </w:rPr>
             </w:pPr>
+            <w:r>
+              <w:rPr>
+                <w:b/>
+                <w:bCs/>
+                <w:color w:val="1F3864"/>
+              </w:rPr>
+              <w:t>1.1.5 Acta de reunión</w:t>
+            </w:r>
           </w:p>
         </w:tc>
         <w:tc>
@@ -4286,6 +4328,16 @@
                 <w:color w:val="1F3864"/>
               </w:rPr>
             </w:pPr>
+            <w:r>
+              <w:rPr>
+                <w:i/>
+                <w:iCs/>
+                <w:color w:val="4472C4"/>
+                <w:sz w:val="18"/>
+                <w:szCs w:val="18"/>
+              </w:rPr>
+              <w:t>Evidencia semanal para aclarar temas a desarrollar, como resolver temas pendientes. Así complementando el trabajo en equipo, reforzando los roles de cada uno para llevar a cabo los avances del proyecto</w:t>
+            </w:r>
           </w:p>
         </w:tc>
         <w:tc>
@@ -4312,6 +4364,16 @@
                 <w:color w:val="1F3864"/>
               </w:rPr>
             </w:pPr>
+            <w:r>
+              <w:rPr>
+                <w:i/>
+                <w:iCs/>
+                <w:color w:val="4472C4"/>
+                <w:sz w:val="18"/>
+                <w:szCs w:val="18"/>
+              </w:rPr>
+              <w:t>Respaldo de reuniones realizadas con los distintos puntos hablados, así aclarando los temas pendientes, dudas como también  informando los puntos importantes a desarrollar para avanzar en el proceso</w:t>
+            </w:r>
           </w:p>
         </w:tc>
       </w:tr>
@@ -4343,6 +4405,14 @@
                 <w:color w:val="1F3864"/>
               </w:rPr>
             </w:pPr>
+            <w:r>
+              <w:rPr>
+                <w:b/>
+                <w:bCs/>
+                <w:color w:val="1F3864"/>
+              </w:rPr>
+              <w:t>Final</w:t>
+            </w:r>
           </w:p>
         </w:tc>
         <w:tc>
@@ -4369,6 +4439,14 @@
                 <w:color w:val="1F3864"/>
               </w:rPr>
             </w:pPr>
+            <w:r>
+              <w:rPr>
+                <w:b/>
+                <w:bCs/>
+                <w:color w:val="1F3864"/>
+              </w:rPr>
+              <w:t>1.4 Creación de historias de usuarios</w:t>
+            </w:r>
           </w:p>
         </w:tc>
         <w:tc>
@@ -4395,6 +4473,16 @@
                 <w:color w:val="1F3864"/>
               </w:rPr>
             </w:pPr>
+            <w:r>
+              <w:rPr>
+                <w:i/>
+                <w:iCs/>
+                <w:color w:val="4472C4"/>
+                <w:sz w:val="18"/>
+                <w:szCs w:val="18"/>
+              </w:rPr>
+              <w:t>Respaldo de las distintas actividades para el desarrollo de la solución, siendo de forma clara las distintas tareas que se debe cumplir</w:t>
+            </w:r>
           </w:p>
         </w:tc>
         <w:tc>
@@ -4421,10 +4509,414 @@
                 <w:color w:val="1F3864"/>
               </w:rPr>
             </w:pPr>
+            <w:r>
+              <w:rPr>
+                <w:i/>
+                <w:iCs/>
+                <w:color w:val="4472C4"/>
+                <w:sz w:val="18"/>
+                <w:szCs w:val="18"/>
+              </w:rPr>
+              <w:t>Enfoque claro de los requerimientos y tareas a desarrollar durante el proceso del proyecto</w:t>
+            </w:r>
+          </w:p>
+        </w:tc>
+      </w:tr>
+      <w:tr>
+        <w:trPr>
+          <w:trHeight w:val="362"/>
+        </w:trPr>
+        <w:tc>
+          <w:tcPr>
+            <w:tcW w:w="1740" w:type="dxa"/>
+          </w:tcPr>
+          <w:p>
+            <w:pPr>
+              <w:pBdr>
+                <w:top w:val="nil"/>
+                <w:left w:val="nil"/>
+                <w:bottom w:val="nil"/>
+                <w:right w:val="nil"/>
+                <w:between w:val="nil"/>
+              </w:pBdr>
+              <w:tabs>
+                <w:tab w:val="center" w:pos="4419"/>
+                <w:tab w:val="right" w:pos="8838"/>
+              </w:tabs>
+              <w:spacing w:after="0" w:line="240" w:lineRule="auto"/>
+              <w:jc w:val="center"/>
+              <w:rPr>
+                <w:b/>
+                <w:bCs/>
+                <w:color w:val="1F3864"/>
+              </w:rPr>
+            </w:pPr>
+            <w:r>
+              <w:rPr>
+                <w:b/>
+                <w:bCs/>
+                <w:color w:val="1F3864"/>
+              </w:rPr>
+              <w:t>Avance</w:t>
+            </w:r>
+          </w:p>
+        </w:tc>
+        <w:tc>
+          <w:tcPr>
+            <w:tcW w:w="2355" w:type="dxa"/>
+          </w:tcPr>
+          <w:p>
+            <w:pPr>
+              <w:pBdr>
+                <w:top w:val="nil"/>
+                <w:left w:val="nil"/>
+                <w:bottom w:val="nil"/>
+                <w:right w:val="nil"/>
+                <w:between w:val="nil"/>
+              </w:pBdr>
+              <w:tabs>
+                <w:tab w:val="center" w:pos="4419"/>
+                <w:tab w:val="right" w:pos="8838"/>
+              </w:tabs>
+              <w:spacing w:after="0" w:line="240" w:lineRule="auto"/>
+              <w:jc w:val="center"/>
+              <w:rPr>
+                <w:b/>
+                <w:bCs/>
+                <w:color w:val="1F3864"/>
+              </w:rPr>
+            </w:pPr>
+            <w:r>
+              <w:rPr>
+                <w:b/>
+                <w:bCs/>
+                <w:color w:val="1F3864"/>
+              </w:rPr>
+              <w:t>1.7.3 Diseño Mockups</w:t>
+            </w:r>
+          </w:p>
+        </w:tc>
+        <w:tc>
+          <w:tcPr>
+            <w:tcW w:w="3420" w:type="dxa"/>
+          </w:tcPr>
+          <w:p>
+            <w:pPr>
+              <w:pBdr>
+                <w:top w:val="nil"/>
+                <w:left w:val="nil"/>
+                <w:bottom w:val="nil"/>
+                <w:right w:val="nil"/>
+                <w:between w:val="nil"/>
+              </w:pBdr>
+              <w:tabs>
+                <w:tab w:val="center" w:pos="4419"/>
+                <w:tab w:val="right" w:pos="8838"/>
+              </w:tabs>
+              <w:spacing w:after="0" w:line="240" w:lineRule="auto"/>
+              <w:jc w:val="center"/>
+              <w:rPr>
+                <w:i/>
+                <w:iCs/>
+                <w:color w:val="4472C4"/>
+                <w:sz w:val="18"/>
+                <w:szCs w:val="18"/>
+              </w:rPr>
+            </w:pPr>
+            <w:r>
+              <w:rPr>
+                <w:i/>
+                <w:iCs/>
+                <w:color w:val="4472C4"/>
+                <w:sz w:val="18"/>
+                <w:szCs w:val="18"/>
+              </w:rPr>
+              <w:t>Evidencia de las interfaces a desarrollar cumpliendo con los requerimientos para tener  una referencia inicial  al resultado que se debe llegar como producto final</w:t>
+            </w:r>
+          </w:p>
+        </w:tc>
+        <w:tc>
+          <w:tcPr>
+            <w:tcW w:w="2550" w:type="dxa"/>
+          </w:tcPr>
+          <w:p>
+            <w:pPr>
+              <w:pBdr>
+                <w:top w:val="nil"/>
+                <w:left w:val="nil"/>
+                <w:bottom w:val="nil"/>
+                <w:right w:val="nil"/>
+                <w:between w:val="nil"/>
+              </w:pBdr>
+              <w:tabs>
+                <w:tab w:val="center" w:pos="4419"/>
+                <w:tab w:val="right" w:pos="8838"/>
+              </w:tabs>
+              <w:spacing w:after="0" w:line="240" w:lineRule="auto"/>
+              <w:jc w:val="center"/>
+              <w:rPr>
+                <w:i/>
+                <w:iCs/>
+                <w:color w:val="4472C4"/>
+                <w:sz w:val="18"/>
+                <w:szCs w:val="18"/>
+              </w:rPr>
+            </w:pPr>
+            <w:r>
+              <w:rPr>
+                <w:i/>
+                <w:iCs/>
+                <w:color w:val="4472C4"/>
+                <w:sz w:val="18"/>
+                <w:szCs w:val="18"/>
+              </w:rPr>
+              <w:t>Referencia inicial para cumplir con los requerimientos y el objetivo principal, sin perder el enfoque durante el proceso de desarrollo de la aplicación</w:t>
+            </w:r>
+          </w:p>
+        </w:tc>
+      </w:tr>
+      <w:tr>
+        <w:trPr>
+          <w:trHeight w:val="362"/>
+        </w:trPr>
+        <w:tc>
+          <w:tcPr>
+            <w:tcW w:w="1740" w:type="dxa"/>
+          </w:tcPr>
+          <w:p>
+            <w:pPr>
+              <w:pBdr>
+                <w:top w:val="nil"/>
+                <w:left w:val="nil"/>
+                <w:bottom w:val="nil"/>
+                <w:right w:val="nil"/>
+                <w:between w:val="nil"/>
+              </w:pBdr>
+              <w:tabs>
+                <w:tab w:val="center" w:pos="4419"/>
+                <w:tab w:val="right" w:pos="8838"/>
+              </w:tabs>
+              <w:spacing w:after="0" w:line="240" w:lineRule="auto"/>
+              <w:jc w:val="center"/>
+              <w:rPr>
+                <w:b/>
+                <w:bCs/>
+                <w:color w:val="1F3864"/>
+              </w:rPr>
+            </w:pPr>
+            <w:r>
+              <w:rPr>
+                <w:b/>
+                <w:bCs/>
+                <w:color w:val="1F3864"/>
+              </w:rPr>
+              <w:t>Avance</w:t>
+            </w:r>
+          </w:p>
+        </w:tc>
+        <w:tc>
+          <w:tcPr>
+            <w:tcW w:w="2355" w:type="dxa"/>
+          </w:tcPr>
+          <w:p>
+            <w:pPr>
+              <w:pBdr>
+                <w:top w:val="nil"/>
+                <w:left w:val="nil"/>
+                <w:bottom w:val="nil"/>
+                <w:right w:val="nil"/>
+                <w:between w:val="nil"/>
+              </w:pBdr>
+              <w:tabs>
+                <w:tab w:val="center" w:pos="4419"/>
+                <w:tab w:val="right" w:pos="8838"/>
+              </w:tabs>
+              <w:spacing w:after="0" w:line="240" w:lineRule="auto"/>
+              <w:jc w:val="center"/>
+              <w:rPr>
+                <w:b/>
+                <w:bCs/>
+                <w:color w:val="1F3864"/>
+              </w:rPr>
+            </w:pPr>
+            <w:r>
+              <w:rPr>
+                <w:b/>
+                <w:bCs/>
+                <w:color w:val="1F3864"/>
+              </w:rPr>
+              <w:t>1.1.7 Carta Gantt</w:t>
+            </w:r>
+          </w:p>
+        </w:tc>
+        <w:tc>
+          <w:tcPr>
+            <w:tcW w:w="3420" w:type="dxa"/>
+          </w:tcPr>
+          <w:p>
+            <w:pPr>
+              <w:pBdr>
+                <w:top w:val="nil"/>
+                <w:left w:val="nil"/>
+                <w:bottom w:val="nil"/>
+                <w:right w:val="nil"/>
+                <w:between w:val="nil"/>
+              </w:pBdr>
+              <w:tabs>
+                <w:tab w:val="center" w:pos="4419"/>
+                <w:tab w:val="right" w:pos="8838"/>
+              </w:tabs>
+              <w:spacing w:after="0" w:line="240" w:lineRule="auto"/>
+              <w:jc w:val="center"/>
+              <w:rPr>
+                <w:i/>
+                <w:iCs/>
+                <w:color w:val="4472C4"/>
+                <w:sz w:val="18"/>
+                <w:szCs w:val="18"/>
+              </w:rPr>
+            </w:pPr>
+            <w:r>
+              <w:rPr>
+                <w:i/>
+                <w:iCs/>
+                <w:color w:val="4472C4"/>
+                <w:sz w:val="18"/>
+                <w:szCs w:val="18"/>
+              </w:rPr>
+              <w:t xml:space="preserve">Se generó la plantilla de carta </w:t>
+            </w:r>
+            <w:proofErr w:type="spellStart"/>
+            <w:r>
+              <w:rPr>
+                <w:i/>
+                <w:iCs/>
+                <w:color w:val="4472C4"/>
+                <w:sz w:val="18"/>
+                <w:szCs w:val="18"/>
+              </w:rPr>
+              <w:t>gantt</w:t>
+            </w:r>
+            <w:proofErr w:type="spellEnd"/>
+            <w:r>
+              <w:rPr>
+                <w:i/>
+                <w:iCs/>
+                <w:color w:val="4472C4"/>
+                <w:sz w:val="18"/>
+                <w:szCs w:val="18"/>
+              </w:rPr>
+              <w:t xml:space="preserve"> adaptando los días lunes a viernes, completando las distintas actividades actuales y futuras del proyecto APT</w:t>
+            </w:r>
+          </w:p>
+        </w:tc>
+        <w:tc>
+          <w:tcPr>
+            <w:tcW w:w="2550" w:type="dxa"/>
+          </w:tcPr>
+          <w:p>
+            <w:pPr>
+              <w:pBdr>
+                <w:top w:val="nil"/>
+                <w:left w:val="nil"/>
+                <w:bottom w:val="nil"/>
+                <w:right w:val="nil"/>
+                <w:between w:val="nil"/>
+              </w:pBdr>
+              <w:tabs>
+                <w:tab w:val="center" w:pos="4419"/>
+                <w:tab w:val="right" w:pos="8838"/>
+              </w:tabs>
+              <w:spacing w:after="0" w:line="240" w:lineRule="auto"/>
+              <w:jc w:val="center"/>
+              <w:rPr>
+                <w:i/>
+                <w:iCs/>
+                <w:color w:val="4472C4"/>
+                <w:sz w:val="18"/>
+                <w:szCs w:val="18"/>
+              </w:rPr>
+            </w:pPr>
+            <w:r>
+              <w:rPr>
+                <w:i/>
+                <w:iCs/>
+                <w:color w:val="4472C4"/>
+                <w:sz w:val="18"/>
+                <w:szCs w:val="18"/>
+              </w:rPr>
+              <w:t>Documento de seguimiento para las distintas actividades del proyecto</w:t>
+            </w:r>
           </w:p>
         </w:tc>
       </w:tr>
     </w:tbl>
+    <w:p>
+      <w:pPr>
+        <w:spacing w:after="0" w:line="360" w:lineRule="auto"/>
+        <w:jc w:val="both"/>
+        <w:rPr>
+          <w:b/>
+          <w:sz w:val="24"/>
+          <w:szCs w:val="24"/>
+        </w:rPr>
+      </w:pPr>
+    </w:p>
+    <w:p>
+      <w:pPr>
+        <w:spacing w:after="0" w:line="360" w:lineRule="auto"/>
+        <w:jc w:val="both"/>
+        <w:rPr>
+          <w:b/>
+          <w:sz w:val="24"/>
+          <w:szCs w:val="24"/>
+        </w:rPr>
+      </w:pPr>
+    </w:p>
+    <w:p>
+      <w:pPr>
+        <w:spacing w:after="0" w:line="360" w:lineRule="auto"/>
+        <w:jc w:val="both"/>
+        <w:rPr>
+          <w:b/>
+          <w:sz w:val="24"/>
+          <w:szCs w:val="24"/>
+        </w:rPr>
+      </w:pPr>
+    </w:p>
+    <w:p>
+      <w:pPr>
+        <w:spacing w:after="0" w:line="360" w:lineRule="auto"/>
+        <w:jc w:val="both"/>
+        <w:rPr>
+          <w:b/>
+          <w:sz w:val="24"/>
+          <w:szCs w:val="24"/>
+        </w:rPr>
+      </w:pPr>
+    </w:p>
+    <w:p>
+      <w:pPr>
+        <w:spacing w:after="0" w:line="360" w:lineRule="auto"/>
+        <w:jc w:val="both"/>
+        <w:rPr>
+          <w:b/>
+          <w:sz w:val="24"/>
+          <w:szCs w:val="24"/>
+        </w:rPr>
+      </w:pPr>
+    </w:p>
+    <w:p>
+      <w:pPr>
+        <w:spacing w:after="0" w:line="360" w:lineRule="auto"/>
+        <w:jc w:val="both"/>
+        <w:rPr>
+          <w:b/>
+          <w:sz w:val="24"/>
+          <w:szCs w:val="24"/>
+        </w:rPr>
+      </w:pPr>
+    </w:p>
     <w:p>
       <w:pPr>
         <w:spacing w:after="0" w:line="360" w:lineRule="auto"/>
@@ -4480,6 +4972,7 @@
                 <w:sz w:val="28"/>
                 <w:szCs w:val="28"/>
               </w:rPr>
+              <w:lastRenderedPageBreak/>
               <w:t>7. Plan de Trabajo</w:t>
             </w:r>
           </w:p>
@@ -4772,6 +5265,7 @@
             <w:r>
               <w:rPr>
                 <w:i/>
+                <w:iCs/>
                 <w:color w:val="548DD4"/>
                 <w:sz w:val="18"/>
                 <w:szCs w:val="18"/>
@@ -4796,6 +5290,7 @@
             <w:r>
               <w:rPr>
                 <w:i/>
+                <w:iCs/>
                 <w:color w:val="548DD4"/>
                 <w:sz w:val="18"/>
                 <w:szCs w:val="18"/>
@@ -4820,11 +5315,12 @@
             <w:r>
               <w:rPr>
                 <w:i/>
+                <w:iCs/>
                 <w:color w:val="548DD4"/>
                 <w:sz w:val="18"/>
                 <w:szCs w:val="18"/>
               </w:rPr>
-              <w:t>Documento que permite respaldar la solución con sus objetivos y características principales</w:t>
+              <w:t>Definir objetivos y recursos</w:t>
             </w:r>
           </w:p>
         </w:tc>
@@ -4845,6 +5341,7 @@
             <w:r>
               <w:rPr>
                 <w:i/>
+                <w:iCs/>
                 <w:color w:val="548DD4"/>
                 <w:sz w:val="18"/>
                 <w:szCs w:val="18"/>
@@ -4862,17 +5359,15 @@
           </w:tcPr>
           <w:p>
             <w:pPr>
-              <w:jc w:val="both"/>
-              <w:rPr>
+              <w:pStyle w:val="NormalWeb"/>
+              <w:spacing w:before="0" w:beforeAutospacing="0" w:after="160" w:afterAutospacing="0"/>
+              <w:jc w:val="both"/>
+            </w:pPr>
+            <w:r>
+              <w:rPr>
+                <w:rFonts w:ascii="Calibri" w:hAnsi="Calibri" w:cs="Calibri"/>
                 <w:i/>
-                <w:color w:val="548DD4"/>
-                <w:sz w:val="18"/>
-                <w:szCs w:val="18"/>
-              </w:rPr>
-            </w:pPr>
-            <w:r>
-              <w:rPr>
-                <w:i/>
+                <w:iCs/>
                 <w:color w:val="548DD4"/>
                 <w:sz w:val="18"/>
                 <w:szCs w:val="18"/>
@@ -4912,6 +5407,7 @@
             <w:r>
               <w:rPr>
                 <w:i/>
+                <w:iCs/>
                 <w:color w:val="548DD4"/>
                 <w:sz w:val="18"/>
                 <w:szCs w:val="18"/>
@@ -4936,11 +5432,12 @@
             <w:r>
               <w:rPr>
                 <w:i/>
+                <w:iCs/>
                 <w:color w:val="548DD4"/>
                 <w:sz w:val="18"/>
                 <w:szCs w:val="18"/>
               </w:rPr>
-              <w:t xml:space="preserve">Se desarrolló anticipado los puntos para resolver dudas  </w:t>
+              <w:t>Se desarrolló anticipado los puntos para resolver dudas  </w:t>
             </w:r>
           </w:p>
         </w:tc>
@@ -4963,31 +5460,32 @@
                 <w:szCs w:val="18"/>
               </w:rPr>
             </w:pPr>
-          </w:p>
-        </w:tc>
-        <w:tc>
-          <w:tcPr>
-            <w:tcW w:w="1580" w:type="dxa"/>
-          </w:tcPr>
-          <w:p>
-            <w:pPr>
-              <w:jc w:val="both"/>
+            <w:r>
               <w:rPr>
                 <w:i/>
+                <w:iCs/>
                 <w:color w:val="548DD4"/>
                 <w:sz w:val="18"/>
                 <w:szCs w:val="18"/>
               </w:rPr>
-            </w:pPr>
-            <w:r>
+              <w:t>Análisis</w:t>
+            </w:r>
+          </w:p>
+        </w:tc>
+        <w:tc>
+          <w:tcPr>
+            <w:tcW w:w="1580" w:type="dxa"/>
+          </w:tcPr>
+          <w:p>
+            <w:pPr>
+              <w:jc w:val="both"/>
               <w:rPr>
                 <w:i/>
                 <w:color w:val="548DD4"/>
                 <w:sz w:val="18"/>
                 <w:szCs w:val="18"/>
               </w:rPr>
-              <w:t>Creación de Backlog</w:t>
-            </w:r>
+            </w:pPr>
           </w:p>
         </w:tc>
         <w:tc>
@@ -5004,6 +5502,16 @@
                 <w:szCs w:val="18"/>
               </w:rPr>
             </w:pPr>
+            <w:r>
+              <w:rPr>
+                <w:i/>
+                <w:iCs/>
+                <w:color w:val="548DD4"/>
+                <w:sz w:val="18"/>
+                <w:szCs w:val="18"/>
+              </w:rPr>
+              <w:t>Comprender las necesidades del cliente</w:t>
+            </w:r>
           </w:p>
         </w:tc>
         <w:tc>
@@ -5096,22 +5604,16 @@
                 <w:szCs w:val="18"/>
               </w:rPr>
             </w:pPr>
-          </w:p>
-        </w:tc>
-        <w:tc>
-          <w:tcPr>
-            <w:tcW w:w="1580" w:type="dxa"/>
-          </w:tcPr>
-          <w:p>
-            <w:pPr>
-              <w:jc w:val="both"/>
+            <w:r>
               <w:rPr>
                 <w:i/>
+                <w:iCs/>
                 <w:color w:val="548DD4"/>
                 <w:sz w:val="18"/>
                 <w:szCs w:val="18"/>
               </w:rPr>
-            </w:pPr>
+              <w:t>Diseño</w:t>
+            </w:r>
           </w:p>
         </w:tc>
         <w:tc>
@@ -5128,6 +5630,32 @@
                 <w:szCs w:val="18"/>
               </w:rPr>
             </w:pPr>
+          </w:p>
+        </w:tc>
+        <w:tc>
+          <w:tcPr>
+            <w:tcW w:w="1580" w:type="dxa"/>
+          </w:tcPr>
+          <w:p>
+            <w:pPr>
+              <w:jc w:val="both"/>
+              <w:rPr>
+                <w:i/>
+                <w:color w:val="548DD4"/>
+                <w:sz w:val="18"/>
+                <w:szCs w:val="18"/>
+              </w:rPr>
+            </w:pPr>
+            <w:r>
+              <w:rPr>
+                <w:i/>
+                <w:iCs/>
+                <w:color w:val="548DD4"/>
+                <w:sz w:val="18"/>
+                <w:szCs w:val="18"/>
+              </w:rPr>
+              <w:t>creación de la arquitectura y detalles técnicos</w:t>
+            </w:r>
           </w:p>
         </w:tc>
         <w:tc>
@@ -5220,22 +5748,16 @@
                 <w:szCs w:val="18"/>
               </w:rPr>
             </w:pPr>
-          </w:p>
-        </w:tc>
-        <w:tc>
-          <w:tcPr>
-            <w:tcW w:w="1580" w:type="dxa"/>
-          </w:tcPr>
-          <w:p>
-            <w:pPr>
-              <w:jc w:val="both"/>
+            <w:r>
               <w:rPr>
                 <w:i/>
+                <w:iCs/>
                 <w:color w:val="548DD4"/>
                 <w:sz w:val="18"/>
                 <w:szCs w:val="18"/>
               </w:rPr>
-            </w:pPr>
+              <w:t>Desarrollar</w:t>
+            </w:r>
           </w:p>
         </w:tc>
         <w:tc>
@@ -5252,6 +5774,32 @@
                 <w:szCs w:val="18"/>
               </w:rPr>
             </w:pPr>
+          </w:p>
+        </w:tc>
+        <w:tc>
+          <w:tcPr>
+            <w:tcW w:w="1580" w:type="dxa"/>
+          </w:tcPr>
+          <w:p>
+            <w:pPr>
+              <w:jc w:val="both"/>
+              <w:rPr>
+                <w:i/>
+                <w:color w:val="548DD4"/>
+                <w:sz w:val="18"/>
+                <w:szCs w:val="18"/>
+              </w:rPr>
+            </w:pPr>
+            <w:r>
+              <w:rPr>
+                <w:i/>
+                <w:iCs/>
+                <w:color w:val="548DD4"/>
+                <w:sz w:val="18"/>
+                <w:szCs w:val="18"/>
+              </w:rPr>
+              <w:t>Realizar codificación de la solución</w:t>
+            </w:r>
           </w:p>
         </w:tc>
         <w:tc>
@@ -5326,18 +5874,295 @@
           </w:p>
         </w:tc>
       </w:tr>
+      <w:tr>
+        <w:trPr>
+          <w:jc w:val="center"/>
+        </w:trPr>
+        <w:tc>
+          <w:tcPr>
+            <w:tcW w:w="1580" w:type="dxa"/>
+          </w:tcPr>
+          <w:p>
+            <w:pPr>
+              <w:jc w:val="both"/>
+              <w:rPr>
+                <w:i/>
+                <w:color w:val="548DD4"/>
+                <w:sz w:val="18"/>
+                <w:szCs w:val="18"/>
+              </w:rPr>
+            </w:pPr>
+            <w:r>
+              <w:rPr>
+                <w:i/>
+                <w:iCs/>
+                <w:color w:val="548DD4"/>
+                <w:sz w:val="18"/>
+                <w:szCs w:val="18"/>
+              </w:rPr>
+              <w:t>Pruebas</w:t>
+            </w:r>
+          </w:p>
+        </w:tc>
+        <w:tc>
+          <w:tcPr>
+            <w:tcW w:w="1580" w:type="dxa"/>
+          </w:tcPr>
+          <w:p>
+            <w:pPr>
+              <w:jc w:val="both"/>
+              <w:rPr>
+                <w:i/>
+                <w:color w:val="548DD4"/>
+                <w:sz w:val="18"/>
+                <w:szCs w:val="18"/>
+              </w:rPr>
+            </w:pPr>
+          </w:p>
+        </w:tc>
+        <w:tc>
+          <w:tcPr>
+            <w:tcW w:w="1580" w:type="dxa"/>
+          </w:tcPr>
+          <w:p>
+            <w:pPr>
+              <w:jc w:val="both"/>
+              <w:rPr>
+                <w:i/>
+                <w:color w:val="548DD4"/>
+                <w:sz w:val="18"/>
+                <w:szCs w:val="18"/>
+              </w:rPr>
+            </w:pPr>
+            <w:r>
+              <w:rPr>
+                <w:i/>
+                <w:iCs/>
+                <w:color w:val="548DD4"/>
+                <w:sz w:val="18"/>
+                <w:szCs w:val="18"/>
+              </w:rPr>
+              <w:t>Asegurar la calidad y detectar errores; Implementación, para lanzar el software al mercado</w:t>
+            </w:r>
+          </w:p>
+        </w:tc>
+        <w:tc>
+          <w:tcPr>
+            <w:tcW w:w="1580" w:type="dxa"/>
+          </w:tcPr>
+          <w:p>
+            <w:pPr>
+              <w:jc w:val="both"/>
+              <w:rPr>
+                <w:i/>
+                <w:color w:val="548DD4"/>
+                <w:sz w:val="18"/>
+                <w:szCs w:val="18"/>
+              </w:rPr>
+            </w:pPr>
+          </w:p>
+        </w:tc>
+        <w:tc>
+          <w:tcPr>
+            <w:tcW w:w="1580" w:type="dxa"/>
+            <w:tcBorders>
+              <w:right w:val="single" w:sz="4" w:space="0" w:color="CCCCCC"/>
+            </w:tcBorders>
+          </w:tcPr>
+          <w:p>
+            <w:pPr>
+              <w:jc w:val="both"/>
+              <w:rPr>
+                <w:i/>
+                <w:color w:val="548DD4"/>
+                <w:sz w:val="18"/>
+                <w:szCs w:val="18"/>
+              </w:rPr>
+            </w:pPr>
+          </w:p>
+        </w:tc>
+        <w:tc>
+          <w:tcPr>
+            <w:tcW w:w="1580" w:type="dxa"/>
+            <w:tcBorders>
+              <w:left w:val="single" w:sz="4" w:space="0" w:color="CCCCCC"/>
+            </w:tcBorders>
+            <w:shd w:val="clear" w:color="auto" w:fill="FFFFFF"/>
+          </w:tcPr>
+          <w:p>
+            <w:pPr>
+              <w:jc w:val="both"/>
+              <w:rPr>
+                <w:i/>
+                <w:color w:val="548DD4"/>
+                <w:sz w:val="18"/>
+                <w:szCs w:val="18"/>
+              </w:rPr>
+            </w:pPr>
+          </w:p>
+        </w:tc>
+        <w:tc>
+          <w:tcPr>
+            <w:tcW w:w="1581" w:type="dxa"/>
+          </w:tcPr>
+          <w:p>
+            <w:pPr>
+              <w:jc w:val="both"/>
+              <w:rPr>
+                <w:i/>
+                <w:color w:val="548DD4"/>
+                <w:sz w:val="18"/>
+                <w:szCs w:val="18"/>
+              </w:rPr>
+            </w:pPr>
+          </w:p>
+        </w:tc>
+      </w:tr>
+      <w:tr>
+        <w:trPr>
+          <w:jc w:val="center"/>
+        </w:trPr>
+        <w:tc>
+          <w:tcPr>
+            <w:tcW w:w="1580" w:type="dxa"/>
+          </w:tcPr>
+          <w:p>
+            <w:pPr>
+              <w:jc w:val="both"/>
+              <w:rPr>
+                <w:i/>
+                <w:color w:val="548DD4"/>
+                <w:sz w:val="18"/>
+                <w:szCs w:val="18"/>
+              </w:rPr>
+            </w:pPr>
+            <w:r>
+              <w:rPr>
+                <w:i/>
+                <w:iCs/>
+                <w:color w:val="548DD4"/>
+                <w:sz w:val="18"/>
+                <w:szCs w:val="18"/>
+              </w:rPr>
+              <w:t>Mantención</w:t>
+            </w:r>
+          </w:p>
+        </w:tc>
+        <w:tc>
+          <w:tcPr>
+            <w:tcW w:w="1580" w:type="dxa"/>
+          </w:tcPr>
+          <w:p>
+            <w:pPr>
+              <w:jc w:val="both"/>
+              <w:rPr>
+                <w:i/>
+                <w:color w:val="548DD4"/>
+                <w:sz w:val="18"/>
+                <w:szCs w:val="18"/>
+              </w:rPr>
+            </w:pPr>
+          </w:p>
+        </w:tc>
+        <w:tc>
+          <w:tcPr>
+            <w:tcW w:w="1580" w:type="dxa"/>
+          </w:tcPr>
+          <w:p>
+            <w:pPr>
+              <w:jc w:val="both"/>
+              <w:rPr>
+                <w:i/>
+                <w:color w:val="548DD4"/>
+                <w:sz w:val="18"/>
+                <w:szCs w:val="18"/>
+              </w:rPr>
+            </w:pPr>
+            <w:r>
+              <w:rPr>
+                <w:i/>
+                <w:iCs/>
+                <w:color w:val="548DD4"/>
+                <w:sz w:val="18"/>
+                <w:szCs w:val="18"/>
+              </w:rPr>
+              <w:t>Soporte a la solución siendo capaces de mantener y solucionar futuros inconvenientes</w:t>
+            </w:r>
+          </w:p>
+        </w:tc>
+        <w:tc>
+          <w:tcPr>
+            <w:tcW w:w="1580" w:type="dxa"/>
+          </w:tcPr>
+          <w:p>
+            <w:pPr>
+              <w:jc w:val="both"/>
+              <w:rPr>
+                <w:i/>
+                <w:color w:val="548DD4"/>
+                <w:sz w:val="18"/>
+                <w:szCs w:val="18"/>
+              </w:rPr>
+            </w:pPr>
+          </w:p>
+        </w:tc>
+        <w:tc>
+          <w:tcPr>
+            <w:tcW w:w="1580" w:type="dxa"/>
+            <w:tcBorders>
+              <w:right w:val="single" w:sz="4" w:space="0" w:color="CCCCCC"/>
+            </w:tcBorders>
+          </w:tcPr>
+          <w:p>
+            <w:pPr>
+              <w:jc w:val="both"/>
+              <w:rPr>
+                <w:i/>
+                <w:color w:val="548DD4"/>
+                <w:sz w:val="18"/>
+                <w:szCs w:val="18"/>
+              </w:rPr>
+            </w:pPr>
+          </w:p>
+        </w:tc>
+        <w:tc>
+          <w:tcPr>
+            <w:tcW w:w="1580" w:type="dxa"/>
+            <w:tcBorders>
+              <w:left w:val="single" w:sz="4" w:space="0" w:color="CCCCCC"/>
+            </w:tcBorders>
+            <w:shd w:val="clear" w:color="auto" w:fill="FFFFFF"/>
+          </w:tcPr>
+          <w:p>
+            <w:pPr>
+              <w:jc w:val="both"/>
+              <w:rPr>
+                <w:i/>
+                <w:color w:val="548DD4"/>
+                <w:sz w:val="18"/>
+                <w:szCs w:val="18"/>
+              </w:rPr>
+            </w:pPr>
+          </w:p>
+        </w:tc>
+        <w:tc>
+          <w:tcPr>
+            <w:tcW w:w="1581" w:type="dxa"/>
+          </w:tcPr>
+          <w:p>
+            <w:pPr>
+              <w:jc w:val="both"/>
+              <w:rPr>
+                <w:i/>
+                <w:color w:val="548DD4"/>
+                <w:sz w:val="18"/>
+                <w:szCs w:val="18"/>
+              </w:rPr>
+            </w:pPr>
+          </w:p>
+        </w:tc>
+      </w:tr>
     </w:tbl>
-    <w:p>
-      <w:pPr>
-        <w:spacing w:after="0" w:line="360" w:lineRule="auto"/>
-        <w:jc w:val="both"/>
-        <w:rPr>
-          <w:b/>
-          <w:sz w:val="24"/>
-          <w:szCs w:val="24"/>
-        </w:rPr>
-      </w:pPr>
-    </w:p>
     <w:p>
       <w:pPr>
         <w:spacing w:after="0" w:line="360" w:lineRule="auto"/>
@@ -8993,6 +9818,22 @@
       <w:shd w:val="clear" w:color="auto" w:fill="E1DFDD"/>
     </w:rPr>
   </w:style>
+  <w:style w:type="paragraph" w:styleId="NormalWeb">
+    <w:name w:val="Normal (Web)"/>
+    <w:basedOn w:val="Normal"/>
+    <w:uiPriority w:val="99"/>
+    <w:semiHidden/>
+    <w:unhideWhenUsed/>
+    <w:rsid w:val="00A824C4"/>
+    <w:pPr>
+      <w:spacing w:before="100" w:beforeAutospacing="1" w:after="100" w:afterAutospacing="1" w:line="240" w:lineRule="auto"/>
+    </w:pPr>
+    <w:rPr>
+      <w:rFonts w:ascii="Times New Roman" w:eastAsia="Times New Roman" w:hAnsi="Times New Roman" w:cs="Times New Roman"/>
+      <w:sz w:val="24"/>
+      <w:szCs w:val="24"/>
+    </w:rPr>
+  </w:style>
 </w:styles>
 </file>
 

</xml_diff>

<commit_message>
Actualización de info y Nuevos documentos
</commit_message>
<xml_diff>
--- a/Capstone/Fase 1/1.5_GuiaEstudiante_Fase 1_Definicion Proyecto APT.docx
+++ b/Capstone/Fase 1/1.5_GuiaEstudiante_Fase 1_Definicion Proyecto APT.docx
@@ -169,18 +169,8 @@
                                       <w:color w:val="1F3864"/>
                                       <w:sz w:val="48"/>
                                     </w:rPr>
-                                    <w:t xml:space="preserve">Asignatura </w:t>
+                                    <w:t>Asignatura Capstone</w:t>
                                   </w:r>
-                                  <w:proofErr w:type="spellStart"/>
-                                  <w:r>
-                                    <w:rPr>
-                                      <w:b/>
-                                      <w:color w:val="1F3864"/>
-                                      <w:sz w:val="48"/>
-                                    </w:rPr>
-                                    <w:t>Capstone</w:t>
-                                  </w:r>
-                                  <w:proofErr w:type="spellEnd"/>
                                 </w:p>
                               </w:txbxContent>
                             </wps:txbx>
@@ -291,18 +281,8 @@
                                 <w:color w:val="1F3864"/>
                                 <w:sz w:val="48"/>
                               </w:rPr>
-                              <w:t xml:space="preserve">Asignatura </w:t>
+                              <w:t>Asignatura Capstone</w:t>
                             </w:r>
-                            <w:proofErr w:type="spellStart"/>
-                            <w:r>
-                              <w:rPr>
-                                <w:b/>
-                                <w:color w:val="1F3864"/>
-                                <w:sz w:val="48"/>
-                              </w:rPr>
-                              <w:t>Capstone</w:t>
-                            </w:r>
-                            <w:proofErr w:type="spellEnd"/>
                           </w:p>
                         </w:txbxContent>
                       </v:textbox>
@@ -851,7 +831,6 @@
                 <w:b/>
               </w:rPr>
             </w:pPr>
-            <w:proofErr w:type="spellStart"/>
             <w:r>
               <w:rPr>
                 <w:i/>
@@ -861,7 +840,6 @@
               </w:rPr>
               <w:t>YourMeds</w:t>
             </w:r>
-            <w:proofErr w:type="spellEnd"/>
           </w:p>
         </w:tc>
       </w:tr>
@@ -886,23 +864,7 @@
                 <w:color w:val="1F3864"/>
                 <w:lang w:val="pt-BR"/>
               </w:rPr>
-              <w:t xml:space="preserve">Área (s) de </w:t>
-            </w:r>
-            <w:proofErr w:type="spellStart"/>
-            <w:r>
-              <w:rPr>
-                <w:color w:val="1F3864"/>
-                <w:lang w:val="pt-BR"/>
-              </w:rPr>
-              <w:t>desempeño</w:t>
-            </w:r>
-            <w:proofErr w:type="spellEnd"/>
-            <w:r>
-              <w:rPr>
-                <w:color w:val="1F3864"/>
-                <w:lang w:val="pt-BR"/>
-              </w:rPr>
-              <w:t>(s)</w:t>
+              <w:t>Área (s) de desempeño(s)</w:t>
             </w:r>
           </w:p>
         </w:tc>
@@ -924,59 +886,8 @@
                 <w:sz w:val="20"/>
                 <w:szCs w:val="20"/>
               </w:rPr>
-              <w:t xml:space="preserve">Programación </w:t>
-            </w:r>
-            <w:proofErr w:type="spellStart"/>
-            <w:r>
-              <w:rPr>
-                <w:i/>
-                <w:color w:val="548DD4"/>
-                <w:sz w:val="20"/>
-                <w:szCs w:val="20"/>
-              </w:rPr>
-              <w:t>Frontend</w:t>
-            </w:r>
-            <w:proofErr w:type="spellEnd"/>
-            <w:r>
-              <w:rPr>
-                <w:i/>
-                <w:color w:val="548DD4"/>
-                <w:sz w:val="20"/>
-                <w:szCs w:val="20"/>
-              </w:rPr>
-              <w:t xml:space="preserve"> (Programación </w:t>
-            </w:r>
-            <w:proofErr w:type="spellStart"/>
-            <w:r>
-              <w:rPr>
-                <w:i/>
-                <w:color w:val="548DD4"/>
-                <w:sz w:val="20"/>
-                <w:szCs w:val="20"/>
-              </w:rPr>
-              <w:t>mobile</w:t>
-            </w:r>
-            <w:proofErr w:type="spellEnd"/>
-            <w:r>
-              <w:rPr>
-                <w:i/>
-                <w:color w:val="548DD4"/>
-                <w:sz w:val="20"/>
-                <w:szCs w:val="20"/>
-              </w:rPr>
-              <w:t xml:space="preserve">) y Programación </w:t>
-            </w:r>
-            <w:proofErr w:type="spellStart"/>
-            <w:r>
-              <w:rPr>
-                <w:i/>
-                <w:color w:val="548DD4"/>
-                <w:sz w:val="20"/>
-                <w:szCs w:val="20"/>
-              </w:rPr>
-              <w:t>Backend</w:t>
-            </w:r>
-            <w:proofErr w:type="spellEnd"/>
+              <w:t>Programación Frontend (Programación mobile) y Programación Backend</w:t>
+            </w:r>
           </w:p>
         </w:tc>
       </w:tr>
@@ -1031,27 +942,7 @@
                 <w:sz w:val="20"/>
                 <w:szCs w:val="20"/>
               </w:rPr>
-              <w:t xml:space="preserve">En el marco del desarrollo de </w:t>
-            </w:r>
-            <w:proofErr w:type="spellStart"/>
-            <w:r>
-              <w:rPr>
-                <w:iCs/>
-                <w:color w:val="548DD4"/>
-                <w:sz w:val="20"/>
-                <w:szCs w:val="20"/>
-              </w:rPr>
-              <w:t>YourMeds</w:t>
-            </w:r>
-            <w:proofErr w:type="spellEnd"/>
-            <w:r>
-              <w:rPr>
-                <w:iCs/>
-                <w:color w:val="548DD4"/>
-                <w:sz w:val="20"/>
-                <w:szCs w:val="20"/>
-              </w:rPr>
-              <w:t>, abordaremos las siguientes competencias relacionadas a nuestro perfil de egreso:</w:t>
+              <w:t>En el marco del desarrollo de YourMeds, abordaremos las siguientes competencias relacionadas a nuestro perfil de egreso:</w:t>
             </w:r>
           </w:p>
           <w:p>
@@ -2831,45 +2722,14 @@
                 <w:szCs w:val="20"/>
               </w:rPr>
             </w:pPr>
-            <w:proofErr w:type="spellStart"/>
-            <w:r>
-              <w:rPr>
-                <w:b/>
-                <w:color w:val="548DD4"/>
-                <w:sz w:val="20"/>
-                <w:szCs w:val="20"/>
-              </w:rPr>
-              <w:t>Product</w:t>
-            </w:r>
-            <w:proofErr w:type="spellEnd"/>
-            <w:r>
-              <w:rPr>
-                <w:b/>
-                <w:color w:val="548DD4"/>
-                <w:sz w:val="20"/>
-                <w:szCs w:val="20"/>
-              </w:rPr>
-              <w:t xml:space="preserve"> </w:t>
-            </w:r>
-            <w:proofErr w:type="spellStart"/>
-            <w:r>
-              <w:rPr>
-                <w:b/>
-                <w:color w:val="548DD4"/>
-                <w:sz w:val="20"/>
-                <w:szCs w:val="20"/>
-              </w:rPr>
-              <w:t>Owner</w:t>
-            </w:r>
-            <w:proofErr w:type="spellEnd"/>
-            <w:r>
-              <w:rPr>
-                <w:b/>
-                <w:color w:val="548DD4"/>
-                <w:sz w:val="20"/>
-                <w:szCs w:val="20"/>
-              </w:rPr>
-              <w:t>:</w:t>
+            <w:r>
+              <w:rPr>
+                <w:b/>
+                <w:color w:val="548DD4"/>
+                <w:sz w:val="20"/>
+                <w:szCs w:val="20"/>
+              </w:rPr>
+              <w:t>Product Owner:</w:t>
             </w:r>
             <w:r>
               <w:rPr>
@@ -2944,25 +2804,7 @@
                 <w:sz w:val="20"/>
                 <w:szCs w:val="20"/>
               </w:rPr>
-              <w:t xml:space="preserve">Gestionar y priorizar el </w:t>
-            </w:r>
-            <w:proofErr w:type="spellStart"/>
-            <w:r>
-              <w:rPr>
-                <w:color w:val="548DD4"/>
-                <w:sz w:val="20"/>
-                <w:szCs w:val="20"/>
-              </w:rPr>
-              <w:t>Product</w:t>
-            </w:r>
-            <w:proofErr w:type="spellEnd"/>
-            <w:r>
-              <w:rPr>
-                <w:color w:val="548DD4"/>
-                <w:sz w:val="20"/>
-                <w:szCs w:val="20"/>
-              </w:rPr>
-              <w:t xml:space="preserve"> Backlog.</w:t>
+              <w:t>Gestionar y priorizar el Product Backlog.</w:t>
             </w:r>
           </w:p>
           <w:p>
@@ -2979,23 +2821,13 @@
                 <w:szCs w:val="20"/>
               </w:rPr>
             </w:pPr>
-            <w:proofErr w:type="gramStart"/>
-            <w:r>
-              <w:rPr>
-                <w:color w:val="548DD4"/>
-                <w:sz w:val="20"/>
-                <w:szCs w:val="20"/>
-              </w:rPr>
-              <w:t>Asegurar</w:t>
-            </w:r>
-            <w:proofErr w:type="gramEnd"/>
-            <w:r>
-              <w:rPr>
-                <w:color w:val="548DD4"/>
-                <w:sz w:val="20"/>
-                <w:szCs w:val="20"/>
-              </w:rPr>
-              <w:t xml:space="preserve"> que las historias de usuario estén claras y alineadas al valor de negocio.</w:t>
+            <w:r>
+              <w:rPr>
+                <w:color w:val="548DD4"/>
+                <w:sz w:val="20"/>
+                <w:szCs w:val="20"/>
+              </w:rPr>
+              <w:t>Asegurar que las historias de usuario estén claras y alineadas al valor de negocio.</w:t>
             </w:r>
           </w:p>
           <w:p>
@@ -3041,25 +2873,7 @@
                 <w:sz w:val="20"/>
                 <w:szCs w:val="20"/>
               </w:rPr>
-              <w:t xml:space="preserve">Colaborar con </w:t>
-            </w:r>
-            <w:proofErr w:type="spellStart"/>
-            <w:r>
-              <w:rPr>
-                <w:color w:val="548DD4"/>
-                <w:sz w:val="20"/>
-                <w:szCs w:val="20"/>
-              </w:rPr>
-              <w:t>stakeholders</w:t>
-            </w:r>
-            <w:proofErr w:type="spellEnd"/>
-            <w:r>
-              <w:rPr>
-                <w:color w:val="548DD4"/>
-                <w:sz w:val="20"/>
-                <w:szCs w:val="20"/>
-              </w:rPr>
-              <w:t xml:space="preserve"> y clientes para entender necesidades.</w:t>
+              <w:t>Colaborar con stakeholders y clientes para entender necesidades.</w:t>
             </w:r>
           </w:p>
           <w:p>
@@ -3118,27 +2932,7 @@
                 <w:sz w:val="20"/>
                 <w:szCs w:val="20"/>
               </w:rPr>
-              <w:t xml:space="preserve">Scrum </w:t>
-            </w:r>
-            <w:proofErr w:type="gramStart"/>
-            <w:r>
-              <w:rPr>
-                <w:b/>
-                <w:color w:val="548DD4"/>
-                <w:sz w:val="20"/>
-                <w:szCs w:val="20"/>
-              </w:rPr>
-              <w:t>Master</w:t>
-            </w:r>
-            <w:proofErr w:type="gramEnd"/>
-            <w:r>
-              <w:rPr>
-                <w:b/>
-                <w:color w:val="548DD4"/>
-                <w:sz w:val="20"/>
-                <w:szCs w:val="20"/>
-              </w:rPr>
-              <w:t xml:space="preserve">: </w:t>
+              <w:t xml:space="preserve">Scrum Master: </w:t>
             </w:r>
             <w:r>
               <w:rPr>
@@ -3208,7 +3002,6 @@
                 <w:lang w:val="en-US"/>
               </w:rPr>
             </w:pPr>
-            <w:proofErr w:type="spellStart"/>
             <w:r>
               <w:rPr>
                 <w:color w:val="548DD4"/>
@@ -3216,37 +3009,7 @@
                 <w:szCs w:val="20"/>
                 <w:lang w:val="en-US"/>
               </w:rPr>
-              <w:t>Facilitar</w:t>
-            </w:r>
-            <w:proofErr w:type="spellEnd"/>
-            <w:r>
-              <w:rPr>
-                <w:color w:val="548DD4"/>
-                <w:sz w:val="20"/>
-                <w:szCs w:val="20"/>
-                <w:lang w:val="en-US"/>
-              </w:rPr>
-              <w:t xml:space="preserve"> las </w:t>
-            </w:r>
-            <w:proofErr w:type="spellStart"/>
-            <w:r>
-              <w:rPr>
-                <w:color w:val="548DD4"/>
-                <w:sz w:val="20"/>
-                <w:szCs w:val="20"/>
-                <w:lang w:val="en-US"/>
-              </w:rPr>
-              <w:t>ceremonias</w:t>
-            </w:r>
-            <w:proofErr w:type="spellEnd"/>
-            <w:r>
-              <w:rPr>
-                <w:color w:val="548DD4"/>
-                <w:sz w:val="20"/>
-                <w:szCs w:val="20"/>
-                <w:lang w:val="en-US"/>
-              </w:rPr>
-              <w:t>:</w:t>
+              <w:t>Facilitar las ceremonias:</w:t>
             </w:r>
             <w:r>
               <w:rPr>
@@ -3325,43 +3088,7 @@
                 <w:sz w:val="20"/>
                 <w:szCs w:val="20"/>
               </w:rPr>
-              <w:t xml:space="preserve">Actuar como coach del equipo y del </w:t>
-            </w:r>
-            <w:proofErr w:type="spellStart"/>
-            <w:r>
-              <w:rPr>
-                <w:color w:val="548DD4"/>
-                <w:sz w:val="20"/>
-                <w:szCs w:val="20"/>
-              </w:rPr>
-              <w:t>Product</w:t>
-            </w:r>
-            <w:proofErr w:type="spellEnd"/>
-            <w:r>
-              <w:rPr>
-                <w:color w:val="548DD4"/>
-                <w:sz w:val="20"/>
-                <w:szCs w:val="20"/>
-              </w:rPr>
-              <w:t xml:space="preserve"> </w:t>
-            </w:r>
-            <w:proofErr w:type="spellStart"/>
-            <w:r>
-              <w:rPr>
-                <w:color w:val="548DD4"/>
-                <w:sz w:val="20"/>
-                <w:szCs w:val="20"/>
-              </w:rPr>
-              <w:t>Owner</w:t>
-            </w:r>
-            <w:proofErr w:type="spellEnd"/>
-            <w:r>
-              <w:rPr>
-                <w:color w:val="548DD4"/>
-                <w:sz w:val="20"/>
-                <w:szCs w:val="20"/>
-              </w:rPr>
-              <w:t xml:space="preserve"> en prácticas ágiles.</w:t>
+              <w:t>Actuar como coach del equipo y del Product Owner en prácticas ágiles.</w:t>
             </w:r>
           </w:p>
           <w:p>
@@ -3432,71 +3159,15 @@
                 <w:sz w:val="20"/>
                 <w:szCs w:val="20"/>
               </w:rPr>
-              <w:t xml:space="preserve">Desarrollador Full </w:t>
-            </w:r>
-            <w:proofErr w:type="spellStart"/>
-            <w:r>
-              <w:rPr>
-                <w:b/>
-                <w:color w:val="548DD4"/>
-                <w:sz w:val="20"/>
-                <w:szCs w:val="20"/>
-              </w:rPr>
-              <w:t>Stack</w:t>
-            </w:r>
-            <w:proofErr w:type="spellEnd"/>
-            <w:r>
-              <w:rPr>
-                <w:b/>
-                <w:color w:val="548DD4"/>
-                <w:sz w:val="20"/>
-                <w:szCs w:val="20"/>
-              </w:rPr>
-              <w:t xml:space="preserve">: </w:t>
-            </w:r>
-            <w:r>
-              <w:rPr>
-                <w:color w:val="548DD4"/>
-                <w:sz w:val="20"/>
-                <w:szCs w:val="20"/>
-              </w:rPr>
-              <w:t xml:space="preserve">Profesional capaz de trabajar tanto en el </w:t>
-            </w:r>
-            <w:proofErr w:type="spellStart"/>
-            <w:r>
-              <w:rPr>
-                <w:color w:val="548DD4"/>
-                <w:sz w:val="20"/>
-                <w:szCs w:val="20"/>
-              </w:rPr>
-              <w:t>frontend</w:t>
-            </w:r>
-            <w:proofErr w:type="spellEnd"/>
-            <w:r>
-              <w:rPr>
-                <w:color w:val="548DD4"/>
-                <w:sz w:val="20"/>
-                <w:szCs w:val="20"/>
-              </w:rPr>
-              <w:t xml:space="preserve"> (interfaz de usuario) como en el </w:t>
-            </w:r>
-            <w:proofErr w:type="spellStart"/>
-            <w:r>
-              <w:rPr>
-                <w:color w:val="548DD4"/>
-                <w:sz w:val="20"/>
-                <w:szCs w:val="20"/>
-              </w:rPr>
-              <w:t>backend</w:t>
-            </w:r>
-            <w:proofErr w:type="spellEnd"/>
-            <w:r>
-              <w:rPr>
-                <w:color w:val="548DD4"/>
-                <w:sz w:val="20"/>
-                <w:szCs w:val="20"/>
-              </w:rPr>
-              <w:t xml:space="preserve"> (lógica de negocio, base de datos, servidores).</w:t>
+              <w:t xml:space="preserve">Desarrollador Full Stack: </w:t>
+            </w:r>
+            <w:r>
+              <w:rPr>
+                <w:color w:val="548DD4"/>
+                <w:sz w:val="20"/>
+                <w:szCs w:val="20"/>
+              </w:rPr>
+              <w:t>Profesional capaz de trabajar tanto en el frontend (interfaz de usuario) como en el backend (lógica de negocio, base de datos, servidores).</w:t>
             </w:r>
           </w:p>
           <w:p>
@@ -3540,25 +3211,7 @@
                 <w:sz w:val="20"/>
                 <w:szCs w:val="20"/>
               </w:rPr>
-              <w:t xml:space="preserve">Diseñar, desarrollar y mantener aplicaciones completas </w:t>
-            </w:r>
-            <w:proofErr w:type="spellStart"/>
-            <w:r>
-              <w:rPr>
-                <w:color w:val="548DD4"/>
-                <w:sz w:val="20"/>
-                <w:szCs w:val="20"/>
-              </w:rPr>
-              <w:t>end-to-end</w:t>
-            </w:r>
-            <w:proofErr w:type="spellEnd"/>
-            <w:r>
-              <w:rPr>
-                <w:color w:val="548DD4"/>
-                <w:sz w:val="20"/>
-                <w:szCs w:val="20"/>
-              </w:rPr>
-              <w:t>.</w:t>
+              <w:t>Diseñar, desarrollar y mantener aplicaciones completas end-to-end.</w:t>
             </w:r>
           </w:p>
           <w:p>
@@ -3581,25 +3234,7 @@
                 <w:sz w:val="20"/>
                 <w:szCs w:val="20"/>
               </w:rPr>
-              <w:t>Construir interfaces de usuario atractivas y accesibles (</w:t>
-            </w:r>
-            <w:proofErr w:type="spellStart"/>
-            <w:r>
-              <w:rPr>
-                <w:color w:val="548DD4"/>
-                <w:sz w:val="20"/>
-                <w:szCs w:val="20"/>
-              </w:rPr>
-              <w:t>frontend</w:t>
-            </w:r>
-            <w:proofErr w:type="spellEnd"/>
-            <w:r>
-              <w:rPr>
-                <w:color w:val="548DD4"/>
-                <w:sz w:val="20"/>
-                <w:szCs w:val="20"/>
-              </w:rPr>
-              <w:t>).</w:t>
+              <w:t>Construir interfaces de usuario atractivas y accesibles (frontend).</w:t>
             </w:r>
           </w:p>
           <w:p>
@@ -3622,43 +3257,7 @@
                 <w:sz w:val="20"/>
                 <w:szCs w:val="20"/>
               </w:rPr>
-              <w:t xml:space="preserve">Implementar lógica de negocio, </w:t>
-            </w:r>
-            <w:proofErr w:type="spellStart"/>
-            <w:r>
-              <w:rPr>
-                <w:color w:val="548DD4"/>
-                <w:sz w:val="20"/>
-                <w:szCs w:val="20"/>
-              </w:rPr>
-              <w:t>APIs</w:t>
-            </w:r>
-            <w:proofErr w:type="spellEnd"/>
-            <w:r>
-              <w:rPr>
-                <w:color w:val="548DD4"/>
-                <w:sz w:val="20"/>
-                <w:szCs w:val="20"/>
-              </w:rPr>
-              <w:t xml:space="preserve"> y gestión de datos (</w:t>
-            </w:r>
-            <w:proofErr w:type="spellStart"/>
-            <w:r>
-              <w:rPr>
-                <w:color w:val="548DD4"/>
-                <w:sz w:val="20"/>
-                <w:szCs w:val="20"/>
-              </w:rPr>
-              <w:t>backend</w:t>
-            </w:r>
-            <w:proofErr w:type="spellEnd"/>
-            <w:r>
-              <w:rPr>
-                <w:color w:val="548DD4"/>
-                <w:sz w:val="20"/>
-                <w:szCs w:val="20"/>
-              </w:rPr>
-              <w:t>).</w:t>
+              <w:t>Implementar lógica de negocio, APIs y gestión de datos (backend).</w:t>
             </w:r>
           </w:p>
           <w:p>
@@ -4176,29 +3775,7 @@
                 <w:sz w:val="18"/>
                 <w:szCs w:val="18"/>
               </w:rPr>
-              <w:t xml:space="preserve">Respaldo concreto para el desarrollo </w:t>
-            </w:r>
-            <w:proofErr w:type="gramStart"/>
-            <w:r>
-              <w:rPr>
-                <w:i/>
-                <w:iCs/>
-                <w:color w:val="4472C4"/>
-                <w:sz w:val="18"/>
-                <w:szCs w:val="18"/>
-              </w:rPr>
-              <w:t>de  solución</w:t>
-            </w:r>
-            <w:proofErr w:type="gramEnd"/>
-            <w:r>
-              <w:rPr>
-                <w:i/>
-                <w:iCs/>
-                <w:color w:val="4472C4"/>
-                <w:sz w:val="18"/>
-                <w:szCs w:val="18"/>
-              </w:rPr>
-              <w:t xml:space="preserve"> propuesta </w:t>
+              <w:t>Respaldo concreto para el desarrollo de  solución propuesta </w:t>
             </w:r>
           </w:p>
         </w:tc>
@@ -4288,29 +3865,7 @@
                 <w:sz w:val="18"/>
                 <w:szCs w:val="18"/>
               </w:rPr>
-              <w:t xml:space="preserve">Evidencia perteneciente al documento de definición proyecto APT, describiendo y explicando la relevancia del proyecto asociando con el perfil de egreso </w:t>
-            </w:r>
-            <w:proofErr w:type="gramStart"/>
-            <w:r>
-              <w:rPr>
-                <w:i/>
-                <w:iCs/>
-                <w:color w:val="4472C4"/>
-                <w:sz w:val="18"/>
-                <w:szCs w:val="18"/>
-              </w:rPr>
-              <w:t>en  conjunto</w:t>
-            </w:r>
-            <w:proofErr w:type="gramEnd"/>
-            <w:r>
-              <w:rPr>
-                <w:i/>
-                <w:iCs/>
-                <w:color w:val="4472C4"/>
-                <w:sz w:val="18"/>
-                <w:szCs w:val="18"/>
-              </w:rPr>
-              <w:t xml:space="preserve"> con los intereses profesionales y respaldando la factibilidad de realizar la solución propuesta </w:t>
+              <w:t>Evidencia perteneciente al documento de definición proyecto APT, describiendo y explicando la relevancia del proyecto asociando con el perfil de egreso en  conjunto con los intereses profesionales y respaldando la factibilidad de realizar la solución propuesta </w:t>
             </w:r>
           </w:p>
         </w:tc>
@@ -4481,7 +4036,6 @@
               </w:rPr>
               <w:t xml:space="preserve">Respaldo de reuniones realizadas con los distintos puntos hablados, así aclarando los temas pendientes, dudas como </w:t>
             </w:r>
-            <w:proofErr w:type="gramStart"/>
             <w:r>
               <w:rPr>
                 <w:i/>
@@ -4490,9 +4044,8 @@
                 <w:sz w:val="18"/>
                 <w:szCs w:val="18"/>
               </w:rPr>
-              <w:t>también  informando</w:t>
-            </w:r>
-            <w:proofErr w:type="gramEnd"/>
+              <w:t>también informando</w:t>
+            </w:r>
             <w:r>
               <w:rPr>
                 <w:i/>
@@ -4762,7 +4315,6 @@
               </w:rPr>
               <w:t xml:space="preserve">Evidencia de las interfaces a desarrollar cumpliendo con los requerimientos para </w:t>
             </w:r>
-            <w:proofErr w:type="gramStart"/>
             <w:r>
               <w:rPr>
                 <w:i/>
@@ -4771,9 +4323,8 @@
                 <w:sz w:val="18"/>
                 <w:szCs w:val="18"/>
               </w:rPr>
-              <w:t>tener  una</w:t>
-            </w:r>
-            <w:proofErr w:type="gramEnd"/>
+              <w:t>tener una</w:t>
+            </w:r>
             <w:r>
               <w:rPr>
                 <w:i/>
@@ -4782,29 +4333,7 @@
                 <w:sz w:val="18"/>
                 <w:szCs w:val="18"/>
               </w:rPr>
-              <w:t xml:space="preserve"> referencia </w:t>
-            </w:r>
-            <w:proofErr w:type="gramStart"/>
-            <w:r>
-              <w:rPr>
-                <w:i/>
-                <w:iCs/>
-                <w:color w:val="4472C4"/>
-                <w:sz w:val="18"/>
-                <w:szCs w:val="18"/>
-              </w:rPr>
-              <w:t>inicial  al</w:t>
-            </w:r>
-            <w:proofErr w:type="gramEnd"/>
-            <w:r>
-              <w:rPr>
-                <w:i/>
-                <w:iCs/>
-                <w:color w:val="4472C4"/>
-                <w:sz w:val="18"/>
-                <w:szCs w:val="18"/>
-              </w:rPr>
-              <w:t xml:space="preserve"> resultado que se debe llegar como producto final</w:t>
+              <w:t xml:space="preserve"> referencia inicial  al resultado que se debe llegar como producto final</w:t>
             </w:r>
           </w:p>
         </w:tc>
@@ -4959,7 +4488,6 @@
               </w:rPr>
               <w:t xml:space="preserve">Se generó la plantilla de carta </w:t>
             </w:r>
-            <w:proofErr w:type="spellStart"/>
             <w:r>
               <w:rPr>
                 <w:i/>
@@ -4968,9 +4496,8 @@
                 <w:sz w:val="18"/>
                 <w:szCs w:val="18"/>
               </w:rPr>
-              <w:t>gantt</w:t>
-            </w:r>
-            <w:proofErr w:type="spellEnd"/>
+              <w:t>Gantt</w:t>
+            </w:r>
             <w:r>
               <w:rPr>
                 <w:i/>
@@ -4981,7 +4508,6 @@
               </w:rPr>
               <w:t xml:space="preserve"> adaptando los </w:t>
             </w:r>
-            <w:proofErr w:type="gramStart"/>
             <w:r>
               <w:rPr>
                 <w:i/>
@@ -4990,9 +4516,8 @@
                 <w:sz w:val="18"/>
                 <w:szCs w:val="18"/>
               </w:rPr>
-              <w:t>días lunes</w:t>
-            </w:r>
-            <w:proofErr w:type="gramEnd"/>
+              <w:t>lunes</w:t>
+            </w:r>
             <w:r>
               <w:rPr>
                 <w:i/>
@@ -5205,21 +4730,7 @@
               <w:rPr>
                 <w:color w:val="1F3864"/>
               </w:rPr>
-              <w:t xml:space="preserve">En la siguiente tabla define la planificación de tu Proyecto APT </w:t>
-            </w:r>
-            <w:proofErr w:type="gramStart"/>
-            <w:r>
-              <w:rPr>
-                <w:color w:val="1F3864"/>
-              </w:rPr>
-              <w:t>de acuerdo a</w:t>
-            </w:r>
-            <w:proofErr w:type="gramEnd"/>
-            <w:r>
-              <w:rPr>
-                <w:color w:val="1F3864"/>
-              </w:rPr>
-              <w:t xml:space="preserve"> lo requerido.</w:t>
+              <w:t>En la siguiente tabla define la planificación de tu Proyecto APT de acuerdo a lo requerido.</w:t>
             </w:r>
           </w:p>
         </w:tc>
@@ -5236,1189 +4747,32 @@
         </w:rPr>
       </w:pPr>
     </w:p>
-    <w:tbl>
-      <w:tblPr>
-        <w:tblStyle w:val="afd"/>
-        <w:tblW w:w="11061" w:type="dxa"/>
-        <w:jc w:val="center"/>
-        <w:tblInd w:w="0" w:type="dxa"/>
-        <w:tblBorders>
-          <w:top w:val="single" w:sz="4" w:space="0" w:color="BFBFBF"/>
-          <w:left w:val="single" w:sz="4" w:space="0" w:color="BFBFBF"/>
-          <w:bottom w:val="single" w:sz="4" w:space="0" w:color="BFBFBF"/>
-          <w:right w:val="single" w:sz="4" w:space="0" w:color="BFBFBF"/>
-          <w:insideH w:val="single" w:sz="4" w:space="0" w:color="BFBFBF"/>
-          <w:insideV w:val="single" w:sz="4" w:space="0" w:color="BFBFBF"/>
-        </w:tblBorders>
-        <w:tblLayout w:type="fixed"/>
-        <w:tblLook w:val="0400" w:firstRow="0" w:lastRow="0" w:firstColumn="0" w:lastColumn="0" w:noHBand="0" w:noVBand="1"/>
-      </w:tblPr>
-      <w:tblGrid>
-        <w:gridCol w:w="1580"/>
-        <w:gridCol w:w="1580"/>
-        <w:gridCol w:w="1580"/>
-        <w:gridCol w:w="1580"/>
-        <w:gridCol w:w="1580"/>
-        <w:gridCol w:w="1580"/>
-        <w:gridCol w:w="1581"/>
-      </w:tblGrid>
-      <w:tr>
-        <w:trPr>
-          <w:jc w:val="center"/>
-        </w:trPr>
-        <w:tc>
-          <w:tcPr>
-            <w:tcW w:w="11061" w:type="dxa"/>
-            <w:gridSpan w:val="7"/>
-          </w:tcPr>
-          <w:p>
-            <w:pPr>
-              <w:jc w:val="center"/>
-              <w:rPr>
-                <w:color w:val="1F3864"/>
-              </w:rPr>
-            </w:pPr>
-            <w:r>
-              <w:rPr>
-                <w:b/>
-                <w:color w:val="1F3864"/>
-              </w:rPr>
-              <w:t>Plan de Trabajo Proyecto APT</w:t>
-            </w:r>
-          </w:p>
-        </w:tc>
-      </w:tr>
-      <w:tr>
-        <w:trPr>
-          <w:jc w:val="center"/>
-        </w:trPr>
-        <w:tc>
-          <w:tcPr>
-            <w:tcW w:w="1580" w:type="dxa"/>
-          </w:tcPr>
-          <w:p>
-            <w:pPr>
-              <w:jc w:val="center"/>
-              <w:rPr>
-                <w:color w:val="1F3864"/>
-                <w:sz w:val="18"/>
-                <w:szCs w:val="18"/>
-              </w:rPr>
-            </w:pPr>
-            <w:r>
-              <w:rPr>
-                <w:color w:val="1F3864"/>
-                <w:sz w:val="18"/>
-                <w:szCs w:val="18"/>
-              </w:rPr>
-              <w:t>Competencia o unidades de competencias</w:t>
-            </w:r>
-          </w:p>
-        </w:tc>
-        <w:tc>
-          <w:tcPr>
-            <w:tcW w:w="1580" w:type="dxa"/>
-            <w:vAlign w:val="center"/>
-          </w:tcPr>
-          <w:p>
-            <w:pPr>
-              <w:jc w:val="center"/>
-              <w:rPr>
-                <w:color w:val="1F3864"/>
-              </w:rPr>
-            </w:pPr>
-            <w:r>
-              <w:rPr>
-                <w:color w:val="1F3864"/>
-              </w:rPr>
-              <w:t xml:space="preserve">Nombre </w:t>
-            </w:r>
-            <w:proofErr w:type="gramStart"/>
-            <w:r>
-              <w:rPr>
-                <w:color w:val="1F3864"/>
-              </w:rPr>
-              <w:t>de  Actividades</w:t>
-            </w:r>
-            <w:proofErr w:type="gramEnd"/>
-            <w:r>
-              <w:rPr>
-                <w:color w:val="1F3864"/>
-              </w:rPr>
-              <w:t>/Tareas</w:t>
-            </w:r>
-          </w:p>
-        </w:tc>
-        <w:tc>
-          <w:tcPr>
-            <w:tcW w:w="1580" w:type="dxa"/>
-            <w:vAlign w:val="center"/>
-          </w:tcPr>
-          <w:p>
-            <w:pPr>
-              <w:jc w:val="center"/>
-              <w:rPr>
-                <w:color w:val="1F3864"/>
-              </w:rPr>
-            </w:pPr>
-            <w:r>
-              <w:rPr>
-                <w:color w:val="1F3864"/>
-              </w:rPr>
-              <w:t>Descripción Actividades/Tareas</w:t>
-            </w:r>
-          </w:p>
-        </w:tc>
-        <w:tc>
-          <w:tcPr>
-            <w:tcW w:w="1580" w:type="dxa"/>
-            <w:vAlign w:val="center"/>
-          </w:tcPr>
-          <w:p>
-            <w:pPr>
-              <w:jc w:val="center"/>
-              <w:rPr>
-                <w:color w:val="1F3864"/>
-              </w:rPr>
-            </w:pPr>
-            <w:r>
-              <w:rPr>
-                <w:color w:val="1F3864"/>
-              </w:rPr>
-              <w:t>Recursos</w:t>
-            </w:r>
-          </w:p>
-        </w:tc>
-        <w:tc>
-          <w:tcPr>
-            <w:tcW w:w="1580" w:type="dxa"/>
-            <w:tcBorders>
-              <w:right w:val="single" w:sz="4" w:space="0" w:color="CCCCCC"/>
-            </w:tcBorders>
-            <w:vAlign w:val="center"/>
-          </w:tcPr>
-          <w:p>
-            <w:pPr>
-              <w:jc w:val="center"/>
-              <w:rPr>
-                <w:color w:val="1F3864"/>
-              </w:rPr>
-            </w:pPr>
-            <w:r>
-              <w:rPr>
-                <w:color w:val="1F3864"/>
-              </w:rPr>
-              <w:t>Duración de la actividad</w:t>
-            </w:r>
-          </w:p>
-          <w:p>
-            <w:pPr>
-              <w:jc w:val="center"/>
-              <w:rPr>
-                <w:color w:val="1F3864"/>
-              </w:rPr>
-            </w:pPr>
-          </w:p>
-        </w:tc>
-        <w:tc>
-          <w:tcPr>
-            <w:tcW w:w="1580" w:type="dxa"/>
-            <w:tcBorders>
-              <w:left w:val="single" w:sz="4" w:space="0" w:color="CCCCCC"/>
-            </w:tcBorders>
-            <w:shd w:val="clear" w:color="auto" w:fill="FFFFFF"/>
-            <w:vAlign w:val="center"/>
-          </w:tcPr>
-          <w:p>
-            <w:pPr>
-              <w:jc w:val="center"/>
-              <w:rPr>
-                <w:color w:val="1F3864"/>
-              </w:rPr>
-            </w:pPr>
-            <w:r>
-              <w:rPr>
-                <w:color w:val="1F3864"/>
-              </w:rPr>
-              <w:t>Responsable</w:t>
-            </w:r>
-          </w:p>
-        </w:tc>
-        <w:tc>
-          <w:tcPr>
-            <w:tcW w:w="1581" w:type="dxa"/>
-            <w:vAlign w:val="center"/>
-          </w:tcPr>
-          <w:p>
-            <w:pPr>
-              <w:jc w:val="center"/>
-              <w:rPr>
-                <w:color w:val="1F3864"/>
-              </w:rPr>
-            </w:pPr>
-            <w:r>
-              <w:rPr>
-                <w:color w:val="1F3864"/>
-              </w:rPr>
-              <w:t>Observaciones</w:t>
-            </w:r>
-          </w:p>
-        </w:tc>
-      </w:tr>
-      <w:tr>
-        <w:trPr>
-          <w:trHeight w:val="1342"/>
-          <w:jc w:val="center"/>
-        </w:trPr>
-        <w:tc>
-          <w:tcPr>
-            <w:tcW w:w="1580" w:type="dxa"/>
-          </w:tcPr>
-          <w:p>
-            <w:pPr>
-              <w:jc w:val="both"/>
-              <w:rPr>
-                <w:i/>
-                <w:color w:val="548DD4"/>
-                <w:sz w:val="18"/>
-                <w:szCs w:val="18"/>
-              </w:rPr>
-            </w:pPr>
-            <w:r>
-              <w:rPr>
-                <w:i/>
-                <w:iCs/>
-                <w:color w:val="548DD4"/>
-                <w:sz w:val="18"/>
-                <w:szCs w:val="18"/>
-              </w:rPr>
-              <w:t>Planificación</w:t>
-            </w:r>
-          </w:p>
-        </w:tc>
-        <w:tc>
-          <w:tcPr>
-            <w:tcW w:w="1580" w:type="dxa"/>
-          </w:tcPr>
-          <w:p>
-            <w:pPr>
-              <w:jc w:val="both"/>
-              <w:rPr>
-                <w:b/>
-                <w:sz w:val="18"/>
-                <w:szCs w:val="18"/>
-              </w:rPr>
-            </w:pPr>
-            <w:r>
-              <w:rPr>
-                <w:i/>
-                <w:iCs/>
-                <w:color w:val="548DD4"/>
-                <w:sz w:val="18"/>
-                <w:szCs w:val="18"/>
-              </w:rPr>
-              <w:t>Definición del proyecto APT</w:t>
-            </w:r>
-          </w:p>
-        </w:tc>
-        <w:tc>
-          <w:tcPr>
-            <w:tcW w:w="1580" w:type="dxa"/>
-          </w:tcPr>
-          <w:p>
-            <w:pPr>
-              <w:jc w:val="both"/>
-              <w:rPr>
-                <w:b/>
-                <w:sz w:val="18"/>
-                <w:szCs w:val="18"/>
-              </w:rPr>
-            </w:pPr>
-            <w:r>
-              <w:rPr>
-                <w:i/>
-                <w:iCs/>
-                <w:color w:val="548DD4"/>
-                <w:sz w:val="18"/>
-                <w:szCs w:val="18"/>
-              </w:rPr>
-              <w:t>Definir objetivos y recursos</w:t>
-            </w:r>
-          </w:p>
-        </w:tc>
-        <w:tc>
-          <w:tcPr>
-            <w:tcW w:w="1580" w:type="dxa"/>
-          </w:tcPr>
-          <w:p>
-            <w:pPr>
-              <w:jc w:val="both"/>
-              <w:rPr>
-                <w:i/>
-                <w:color w:val="548DD4"/>
-                <w:sz w:val="18"/>
-                <w:szCs w:val="18"/>
-              </w:rPr>
-            </w:pPr>
-            <w:r>
-              <w:rPr>
-                <w:i/>
-                <w:iCs/>
-                <w:color w:val="548DD4"/>
-                <w:sz w:val="18"/>
-                <w:szCs w:val="18"/>
-              </w:rPr>
-              <w:t>Un computador, internet y cuenta en Office</w:t>
-            </w:r>
-          </w:p>
-        </w:tc>
-        <w:tc>
-          <w:tcPr>
-            <w:tcW w:w="1580" w:type="dxa"/>
-            <w:tcBorders>
-              <w:right w:val="single" w:sz="4" w:space="0" w:color="CCCCCC"/>
-            </w:tcBorders>
-          </w:tcPr>
-          <w:p>
-            <w:pPr>
-              <w:pStyle w:val="NormalWeb"/>
-              <w:spacing w:before="0" w:beforeAutospacing="0" w:after="160" w:afterAutospacing="0"/>
-              <w:jc w:val="both"/>
-            </w:pPr>
-            <w:r>
-              <w:rPr>
-                <w:rFonts w:ascii="Calibri" w:hAnsi="Calibri" w:cs="Calibri"/>
-                <w:i/>
-                <w:iCs/>
-                <w:color w:val="548DD4"/>
-                <w:sz w:val="18"/>
-                <w:szCs w:val="18"/>
-              </w:rPr>
-              <w:t xml:space="preserve">1 </w:t>
-            </w:r>
-            <w:proofErr w:type="gramStart"/>
-            <w:r>
-              <w:rPr>
-                <w:rFonts w:ascii="Calibri" w:hAnsi="Calibri" w:cs="Calibri"/>
-                <w:i/>
-                <w:iCs/>
-                <w:color w:val="548DD4"/>
-                <w:sz w:val="18"/>
-                <w:szCs w:val="18"/>
-              </w:rPr>
-              <w:t>Semana</w:t>
-            </w:r>
-            <w:proofErr w:type="gramEnd"/>
-          </w:p>
-          <w:p>
-            <w:pPr>
-              <w:jc w:val="both"/>
-              <w:rPr>
-                <w:i/>
-                <w:color w:val="548DD4"/>
-                <w:sz w:val="18"/>
-                <w:szCs w:val="18"/>
-              </w:rPr>
-            </w:pPr>
-          </w:p>
-        </w:tc>
-        <w:tc>
-          <w:tcPr>
-            <w:tcW w:w="1580" w:type="dxa"/>
-            <w:tcBorders>
-              <w:left w:val="single" w:sz="4" w:space="0" w:color="CCCCCC"/>
-            </w:tcBorders>
-            <w:shd w:val="clear" w:color="auto" w:fill="FFFFFF"/>
-          </w:tcPr>
-          <w:p>
-            <w:pPr>
-              <w:jc w:val="both"/>
-              <w:rPr>
-                <w:b/>
-                <w:sz w:val="18"/>
-                <w:szCs w:val="18"/>
-              </w:rPr>
-            </w:pPr>
-            <w:r>
-              <w:rPr>
-                <w:i/>
-                <w:iCs/>
-                <w:color w:val="548DD4"/>
-                <w:sz w:val="18"/>
-                <w:szCs w:val="18"/>
-              </w:rPr>
-              <w:t>Alonso Gómez</w:t>
-            </w:r>
-          </w:p>
-        </w:tc>
-        <w:tc>
-          <w:tcPr>
-            <w:tcW w:w="1581" w:type="dxa"/>
-          </w:tcPr>
-          <w:p>
-            <w:pPr>
-              <w:jc w:val="both"/>
-              <w:rPr>
-                <w:b/>
-                <w:sz w:val="18"/>
-                <w:szCs w:val="18"/>
-              </w:rPr>
-            </w:pPr>
-            <w:r>
-              <w:rPr>
-                <w:i/>
-                <w:iCs/>
-                <w:color w:val="548DD4"/>
-                <w:sz w:val="18"/>
-                <w:szCs w:val="18"/>
-              </w:rPr>
-              <w:t>Se desarrolló anticipado los puntos para resolver dudas  </w:t>
-            </w:r>
-          </w:p>
-        </w:tc>
-      </w:tr>
-      <w:tr>
-        <w:trPr>
-          <w:jc w:val="center"/>
-        </w:trPr>
-        <w:tc>
-          <w:tcPr>
-            <w:tcW w:w="1580" w:type="dxa"/>
-          </w:tcPr>
-          <w:p>
-            <w:pPr>
-              <w:jc w:val="both"/>
-              <w:rPr>
-                <w:i/>
-                <w:color w:val="548DD4"/>
-                <w:sz w:val="18"/>
-                <w:szCs w:val="18"/>
-              </w:rPr>
-            </w:pPr>
-            <w:r>
-              <w:rPr>
-                <w:i/>
-                <w:iCs/>
-                <w:color w:val="548DD4"/>
-                <w:sz w:val="18"/>
-                <w:szCs w:val="18"/>
-              </w:rPr>
-              <w:t>Análisis</w:t>
-            </w:r>
-          </w:p>
-        </w:tc>
-        <w:tc>
-          <w:tcPr>
-            <w:tcW w:w="1580" w:type="dxa"/>
-          </w:tcPr>
-          <w:p>
-            <w:pPr>
-              <w:jc w:val="both"/>
-              <w:rPr>
-                <w:i/>
-                <w:color w:val="548DD4"/>
-                <w:sz w:val="18"/>
-                <w:szCs w:val="18"/>
-              </w:rPr>
-            </w:pPr>
-          </w:p>
-        </w:tc>
-        <w:tc>
-          <w:tcPr>
-            <w:tcW w:w="1580" w:type="dxa"/>
-          </w:tcPr>
-          <w:p>
-            <w:pPr>
-              <w:jc w:val="both"/>
-              <w:rPr>
-                <w:i/>
-                <w:color w:val="548DD4"/>
-                <w:sz w:val="18"/>
-                <w:szCs w:val="18"/>
-              </w:rPr>
-            </w:pPr>
-            <w:r>
-              <w:rPr>
-                <w:i/>
-                <w:iCs/>
-                <w:color w:val="548DD4"/>
-                <w:sz w:val="18"/>
-                <w:szCs w:val="18"/>
-              </w:rPr>
-              <w:t>Comprender las necesidades del cliente</w:t>
-            </w:r>
-          </w:p>
-        </w:tc>
-        <w:tc>
-          <w:tcPr>
-            <w:tcW w:w="1580" w:type="dxa"/>
-          </w:tcPr>
-          <w:p>
-            <w:pPr>
-              <w:jc w:val="both"/>
-              <w:rPr>
-                <w:i/>
-                <w:color w:val="548DD4"/>
-                <w:sz w:val="18"/>
-                <w:szCs w:val="18"/>
-              </w:rPr>
-            </w:pPr>
-          </w:p>
-        </w:tc>
-        <w:tc>
-          <w:tcPr>
-            <w:tcW w:w="1580" w:type="dxa"/>
-            <w:tcBorders>
-              <w:right w:val="single" w:sz="4" w:space="0" w:color="CCCCCC"/>
-            </w:tcBorders>
-          </w:tcPr>
-          <w:p>
-            <w:pPr>
-              <w:jc w:val="both"/>
-              <w:rPr>
-                <w:i/>
-                <w:color w:val="548DD4"/>
-                <w:sz w:val="18"/>
-                <w:szCs w:val="18"/>
-              </w:rPr>
-            </w:pPr>
-          </w:p>
-        </w:tc>
-        <w:tc>
-          <w:tcPr>
-            <w:tcW w:w="1580" w:type="dxa"/>
-            <w:tcBorders>
-              <w:left w:val="single" w:sz="4" w:space="0" w:color="CCCCCC"/>
-            </w:tcBorders>
-            <w:shd w:val="clear" w:color="auto" w:fill="FFFFFF"/>
-          </w:tcPr>
-          <w:p>
-            <w:pPr>
-              <w:jc w:val="both"/>
-              <w:rPr>
-                <w:i/>
-                <w:color w:val="548DD4"/>
-                <w:sz w:val="18"/>
-                <w:szCs w:val="18"/>
-              </w:rPr>
-            </w:pPr>
-          </w:p>
-        </w:tc>
-        <w:tc>
-          <w:tcPr>
-            <w:tcW w:w="1581" w:type="dxa"/>
-          </w:tcPr>
-          <w:p>
-            <w:pPr>
-              <w:jc w:val="both"/>
-              <w:rPr>
-                <w:i/>
-                <w:color w:val="548DD4"/>
-                <w:sz w:val="18"/>
-                <w:szCs w:val="18"/>
-              </w:rPr>
-            </w:pPr>
-          </w:p>
-        </w:tc>
-      </w:tr>
-      <w:tr>
-        <w:trPr>
-          <w:jc w:val="center"/>
-        </w:trPr>
-        <w:tc>
-          <w:tcPr>
-            <w:tcW w:w="1580" w:type="dxa"/>
-          </w:tcPr>
-          <w:p>
-            <w:pPr>
-              <w:jc w:val="both"/>
-              <w:rPr>
-                <w:i/>
-                <w:color w:val="548DD4"/>
-                <w:sz w:val="18"/>
-                <w:szCs w:val="18"/>
-              </w:rPr>
-            </w:pPr>
-            <w:r>
-              <w:rPr>
-                <w:i/>
-                <w:iCs/>
-                <w:color w:val="548DD4"/>
-                <w:sz w:val="18"/>
-                <w:szCs w:val="18"/>
-              </w:rPr>
-              <w:t>Diseño</w:t>
-            </w:r>
-          </w:p>
-        </w:tc>
-        <w:tc>
-          <w:tcPr>
-            <w:tcW w:w="1580" w:type="dxa"/>
-          </w:tcPr>
-          <w:p>
-            <w:pPr>
-              <w:jc w:val="both"/>
-              <w:rPr>
-                <w:i/>
-                <w:color w:val="548DD4"/>
-                <w:sz w:val="18"/>
-                <w:szCs w:val="18"/>
-              </w:rPr>
-            </w:pPr>
-          </w:p>
-        </w:tc>
-        <w:tc>
-          <w:tcPr>
-            <w:tcW w:w="1580" w:type="dxa"/>
-          </w:tcPr>
-          <w:p>
-            <w:pPr>
-              <w:jc w:val="both"/>
-              <w:rPr>
-                <w:i/>
-                <w:color w:val="548DD4"/>
-                <w:sz w:val="18"/>
-                <w:szCs w:val="18"/>
-              </w:rPr>
-            </w:pPr>
-            <w:r>
-              <w:rPr>
-                <w:i/>
-                <w:iCs/>
-                <w:color w:val="548DD4"/>
-                <w:sz w:val="18"/>
-                <w:szCs w:val="18"/>
-              </w:rPr>
-              <w:t>creación de la arquitectura y detalles técnicos</w:t>
-            </w:r>
-          </w:p>
-        </w:tc>
-        <w:tc>
-          <w:tcPr>
-            <w:tcW w:w="1580" w:type="dxa"/>
-          </w:tcPr>
-          <w:p>
-            <w:pPr>
-              <w:jc w:val="both"/>
-              <w:rPr>
-                <w:i/>
-                <w:color w:val="548DD4"/>
-                <w:sz w:val="18"/>
-                <w:szCs w:val="18"/>
-              </w:rPr>
-            </w:pPr>
-          </w:p>
-        </w:tc>
-        <w:tc>
-          <w:tcPr>
-            <w:tcW w:w="1580" w:type="dxa"/>
-            <w:tcBorders>
-              <w:right w:val="single" w:sz="4" w:space="0" w:color="CCCCCC"/>
-            </w:tcBorders>
-          </w:tcPr>
-          <w:p>
-            <w:pPr>
-              <w:jc w:val="both"/>
-              <w:rPr>
-                <w:i/>
-                <w:color w:val="548DD4"/>
-                <w:sz w:val="18"/>
-                <w:szCs w:val="18"/>
-              </w:rPr>
-            </w:pPr>
-          </w:p>
-        </w:tc>
-        <w:tc>
-          <w:tcPr>
-            <w:tcW w:w="1580" w:type="dxa"/>
-            <w:tcBorders>
-              <w:left w:val="single" w:sz="4" w:space="0" w:color="CCCCCC"/>
-            </w:tcBorders>
-            <w:shd w:val="clear" w:color="auto" w:fill="FFFFFF"/>
-          </w:tcPr>
-          <w:p>
-            <w:pPr>
-              <w:jc w:val="both"/>
-              <w:rPr>
-                <w:i/>
-                <w:color w:val="548DD4"/>
-                <w:sz w:val="18"/>
-                <w:szCs w:val="18"/>
-              </w:rPr>
-            </w:pPr>
-          </w:p>
-        </w:tc>
-        <w:tc>
-          <w:tcPr>
-            <w:tcW w:w="1581" w:type="dxa"/>
-          </w:tcPr>
-          <w:p>
-            <w:pPr>
-              <w:jc w:val="both"/>
-              <w:rPr>
-                <w:i/>
-                <w:color w:val="548DD4"/>
-                <w:sz w:val="18"/>
-                <w:szCs w:val="18"/>
-              </w:rPr>
-            </w:pPr>
-          </w:p>
-        </w:tc>
-      </w:tr>
-      <w:tr>
-        <w:trPr>
-          <w:jc w:val="center"/>
-        </w:trPr>
-        <w:tc>
-          <w:tcPr>
-            <w:tcW w:w="1580" w:type="dxa"/>
-          </w:tcPr>
-          <w:p>
-            <w:pPr>
-              <w:jc w:val="both"/>
-              <w:rPr>
-                <w:i/>
-                <w:color w:val="548DD4"/>
-                <w:sz w:val="18"/>
-                <w:szCs w:val="18"/>
-              </w:rPr>
-            </w:pPr>
-            <w:r>
-              <w:rPr>
-                <w:i/>
-                <w:iCs/>
-                <w:color w:val="548DD4"/>
-                <w:sz w:val="18"/>
-                <w:szCs w:val="18"/>
-              </w:rPr>
-              <w:t>Desarrollar</w:t>
-            </w:r>
-          </w:p>
-        </w:tc>
-        <w:tc>
-          <w:tcPr>
-            <w:tcW w:w="1580" w:type="dxa"/>
-          </w:tcPr>
-          <w:p>
-            <w:pPr>
-              <w:jc w:val="both"/>
-              <w:rPr>
-                <w:i/>
-                <w:color w:val="548DD4"/>
-                <w:sz w:val="18"/>
-                <w:szCs w:val="18"/>
-              </w:rPr>
-            </w:pPr>
-          </w:p>
-        </w:tc>
-        <w:tc>
-          <w:tcPr>
-            <w:tcW w:w="1580" w:type="dxa"/>
-          </w:tcPr>
-          <w:p>
-            <w:pPr>
-              <w:jc w:val="both"/>
-              <w:rPr>
-                <w:i/>
-                <w:color w:val="548DD4"/>
-                <w:sz w:val="18"/>
-                <w:szCs w:val="18"/>
-              </w:rPr>
-            </w:pPr>
-            <w:r>
-              <w:rPr>
-                <w:i/>
-                <w:iCs/>
-                <w:color w:val="548DD4"/>
-                <w:sz w:val="18"/>
-                <w:szCs w:val="18"/>
-              </w:rPr>
-              <w:t>Realizar codificación de la solución</w:t>
-            </w:r>
-          </w:p>
-        </w:tc>
-        <w:tc>
-          <w:tcPr>
-            <w:tcW w:w="1580" w:type="dxa"/>
-          </w:tcPr>
-          <w:p>
-            <w:pPr>
-              <w:jc w:val="both"/>
-              <w:rPr>
-                <w:i/>
-                <w:color w:val="548DD4"/>
-                <w:sz w:val="18"/>
-                <w:szCs w:val="18"/>
-              </w:rPr>
-            </w:pPr>
-          </w:p>
-        </w:tc>
-        <w:tc>
-          <w:tcPr>
-            <w:tcW w:w="1580" w:type="dxa"/>
-            <w:tcBorders>
-              <w:right w:val="single" w:sz="4" w:space="0" w:color="CCCCCC"/>
-            </w:tcBorders>
-          </w:tcPr>
-          <w:p>
-            <w:pPr>
-              <w:jc w:val="both"/>
-              <w:rPr>
-                <w:i/>
-                <w:color w:val="548DD4"/>
-                <w:sz w:val="18"/>
-                <w:szCs w:val="18"/>
-              </w:rPr>
-            </w:pPr>
-          </w:p>
-        </w:tc>
-        <w:tc>
-          <w:tcPr>
-            <w:tcW w:w="1580" w:type="dxa"/>
-            <w:tcBorders>
-              <w:left w:val="single" w:sz="4" w:space="0" w:color="CCCCCC"/>
-            </w:tcBorders>
-            <w:shd w:val="clear" w:color="auto" w:fill="FFFFFF"/>
-          </w:tcPr>
-          <w:p>
-            <w:pPr>
-              <w:jc w:val="both"/>
-              <w:rPr>
-                <w:i/>
-                <w:color w:val="548DD4"/>
-                <w:sz w:val="18"/>
-                <w:szCs w:val="18"/>
-              </w:rPr>
-            </w:pPr>
-          </w:p>
-        </w:tc>
-        <w:tc>
-          <w:tcPr>
-            <w:tcW w:w="1581" w:type="dxa"/>
-          </w:tcPr>
-          <w:p>
-            <w:pPr>
-              <w:jc w:val="both"/>
-              <w:rPr>
-                <w:i/>
-                <w:color w:val="548DD4"/>
-                <w:sz w:val="18"/>
-                <w:szCs w:val="18"/>
-              </w:rPr>
-            </w:pPr>
-          </w:p>
-        </w:tc>
-      </w:tr>
-      <w:tr>
-        <w:trPr>
-          <w:jc w:val="center"/>
-        </w:trPr>
-        <w:tc>
-          <w:tcPr>
-            <w:tcW w:w="1580" w:type="dxa"/>
-          </w:tcPr>
-          <w:p>
-            <w:pPr>
-              <w:jc w:val="both"/>
-              <w:rPr>
-                <w:i/>
-                <w:color w:val="548DD4"/>
-                <w:sz w:val="18"/>
-                <w:szCs w:val="18"/>
-              </w:rPr>
-            </w:pPr>
-            <w:r>
-              <w:rPr>
-                <w:i/>
-                <w:iCs/>
-                <w:color w:val="548DD4"/>
-                <w:sz w:val="18"/>
-                <w:szCs w:val="18"/>
-              </w:rPr>
-              <w:t>Pruebas</w:t>
-            </w:r>
-          </w:p>
-        </w:tc>
-        <w:tc>
-          <w:tcPr>
-            <w:tcW w:w="1580" w:type="dxa"/>
-          </w:tcPr>
-          <w:p>
-            <w:pPr>
-              <w:jc w:val="both"/>
-              <w:rPr>
-                <w:i/>
-                <w:color w:val="548DD4"/>
-                <w:sz w:val="18"/>
-                <w:szCs w:val="18"/>
-              </w:rPr>
-            </w:pPr>
-          </w:p>
-        </w:tc>
-        <w:tc>
-          <w:tcPr>
-            <w:tcW w:w="1580" w:type="dxa"/>
-          </w:tcPr>
-          <w:p>
-            <w:pPr>
-              <w:jc w:val="both"/>
-              <w:rPr>
-                <w:i/>
-                <w:color w:val="548DD4"/>
-                <w:sz w:val="18"/>
-                <w:szCs w:val="18"/>
-              </w:rPr>
-            </w:pPr>
-            <w:r>
-              <w:rPr>
-                <w:i/>
-                <w:iCs/>
-                <w:color w:val="548DD4"/>
-                <w:sz w:val="18"/>
-                <w:szCs w:val="18"/>
-              </w:rPr>
-              <w:t>Asegurar la calidad y detectar errores; Implementación, para lanzar el software al mercado</w:t>
-            </w:r>
-          </w:p>
-        </w:tc>
-        <w:tc>
-          <w:tcPr>
-            <w:tcW w:w="1580" w:type="dxa"/>
-          </w:tcPr>
-          <w:p>
-            <w:pPr>
-              <w:jc w:val="both"/>
-              <w:rPr>
-                <w:i/>
-                <w:color w:val="548DD4"/>
-                <w:sz w:val="18"/>
-                <w:szCs w:val="18"/>
-              </w:rPr>
-            </w:pPr>
-          </w:p>
-        </w:tc>
-        <w:tc>
-          <w:tcPr>
-            <w:tcW w:w="1580" w:type="dxa"/>
-            <w:tcBorders>
-              <w:right w:val="single" w:sz="4" w:space="0" w:color="CCCCCC"/>
-            </w:tcBorders>
-          </w:tcPr>
-          <w:p>
-            <w:pPr>
-              <w:jc w:val="both"/>
-              <w:rPr>
-                <w:i/>
-                <w:color w:val="548DD4"/>
-                <w:sz w:val="18"/>
-                <w:szCs w:val="18"/>
-              </w:rPr>
-            </w:pPr>
-          </w:p>
-        </w:tc>
-        <w:tc>
-          <w:tcPr>
-            <w:tcW w:w="1580" w:type="dxa"/>
-            <w:tcBorders>
-              <w:left w:val="single" w:sz="4" w:space="0" w:color="CCCCCC"/>
-            </w:tcBorders>
-            <w:shd w:val="clear" w:color="auto" w:fill="FFFFFF"/>
-          </w:tcPr>
-          <w:p>
-            <w:pPr>
-              <w:jc w:val="both"/>
-              <w:rPr>
-                <w:i/>
-                <w:color w:val="548DD4"/>
-                <w:sz w:val="18"/>
-                <w:szCs w:val="18"/>
-              </w:rPr>
-            </w:pPr>
-          </w:p>
-        </w:tc>
-        <w:tc>
-          <w:tcPr>
-            <w:tcW w:w="1581" w:type="dxa"/>
-          </w:tcPr>
-          <w:p>
-            <w:pPr>
-              <w:jc w:val="both"/>
-              <w:rPr>
-                <w:i/>
-                <w:color w:val="548DD4"/>
-                <w:sz w:val="18"/>
-                <w:szCs w:val="18"/>
-              </w:rPr>
-            </w:pPr>
-          </w:p>
-        </w:tc>
-      </w:tr>
-      <w:tr>
-        <w:trPr>
-          <w:jc w:val="center"/>
-        </w:trPr>
-        <w:tc>
-          <w:tcPr>
-            <w:tcW w:w="1580" w:type="dxa"/>
-          </w:tcPr>
-          <w:p>
-            <w:pPr>
-              <w:jc w:val="both"/>
-              <w:rPr>
-                <w:i/>
-                <w:color w:val="548DD4"/>
-                <w:sz w:val="18"/>
-                <w:szCs w:val="18"/>
-              </w:rPr>
-            </w:pPr>
-            <w:r>
-              <w:rPr>
-                <w:i/>
-                <w:iCs/>
-                <w:color w:val="548DD4"/>
-                <w:sz w:val="18"/>
-                <w:szCs w:val="18"/>
-              </w:rPr>
-              <w:t>Mantención</w:t>
-            </w:r>
-          </w:p>
-        </w:tc>
-        <w:tc>
-          <w:tcPr>
-            <w:tcW w:w="1580" w:type="dxa"/>
-          </w:tcPr>
-          <w:p>
-            <w:pPr>
-              <w:jc w:val="both"/>
-              <w:rPr>
-                <w:i/>
-                <w:color w:val="548DD4"/>
-                <w:sz w:val="18"/>
-                <w:szCs w:val="18"/>
-              </w:rPr>
-            </w:pPr>
-          </w:p>
-        </w:tc>
-        <w:tc>
-          <w:tcPr>
-            <w:tcW w:w="1580" w:type="dxa"/>
-          </w:tcPr>
-          <w:p>
-            <w:pPr>
-              <w:jc w:val="both"/>
-              <w:rPr>
-                <w:i/>
-                <w:color w:val="548DD4"/>
-                <w:sz w:val="18"/>
-                <w:szCs w:val="18"/>
-              </w:rPr>
-            </w:pPr>
-            <w:r>
-              <w:rPr>
-                <w:i/>
-                <w:iCs/>
-                <w:color w:val="548DD4"/>
-                <w:sz w:val="18"/>
-                <w:szCs w:val="18"/>
-              </w:rPr>
-              <w:t>Soporte a la solución siendo capaces de mantener y solucionar futuros inconvenientes</w:t>
-            </w:r>
-          </w:p>
-        </w:tc>
-        <w:tc>
-          <w:tcPr>
-            <w:tcW w:w="1580" w:type="dxa"/>
-          </w:tcPr>
-          <w:p>
-            <w:pPr>
-              <w:jc w:val="both"/>
-              <w:rPr>
-                <w:i/>
-                <w:color w:val="548DD4"/>
-                <w:sz w:val="18"/>
-                <w:szCs w:val="18"/>
-              </w:rPr>
-            </w:pPr>
-          </w:p>
-        </w:tc>
-        <w:tc>
-          <w:tcPr>
-            <w:tcW w:w="1580" w:type="dxa"/>
-            <w:tcBorders>
-              <w:right w:val="single" w:sz="4" w:space="0" w:color="CCCCCC"/>
-            </w:tcBorders>
-          </w:tcPr>
-          <w:p>
-            <w:pPr>
-              <w:jc w:val="both"/>
-              <w:rPr>
-                <w:i/>
-                <w:color w:val="548DD4"/>
-                <w:sz w:val="18"/>
-                <w:szCs w:val="18"/>
-              </w:rPr>
-            </w:pPr>
-          </w:p>
-        </w:tc>
-        <w:tc>
-          <w:tcPr>
-            <w:tcW w:w="1580" w:type="dxa"/>
-            <w:tcBorders>
-              <w:left w:val="single" w:sz="4" w:space="0" w:color="CCCCCC"/>
-            </w:tcBorders>
-            <w:shd w:val="clear" w:color="auto" w:fill="FFFFFF"/>
-          </w:tcPr>
-          <w:p>
-            <w:pPr>
-              <w:jc w:val="both"/>
-              <w:rPr>
-                <w:i/>
-                <w:color w:val="548DD4"/>
-                <w:sz w:val="18"/>
-                <w:szCs w:val="18"/>
-              </w:rPr>
-            </w:pPr>
-          </w:p>
-        </w:tc>
-        <w:tc>
-          <w:tcPr>
-            <w:tcW w:w="1581" w:type="dxa"/>
-          </w:tcPr>
-          <w:p>
-            <w:pPr>
-              <w:jc w:val="both"/>
-              <w:rPr>
-                <w:i/>
-                <w:color w:val="548DD4"/>
-                <w:sz w:val="18"/>
-                <w:szCs w:val="18"/>
-              </w:rPr>
-            </w:pPr>
-          </w:p>
-        </w:tc>
-      </w:tr>
-    </w:tbl>
     <w:p>
       <w:pPr>
         <w:spacing w:after="0" w:line="360" w:lineRule="auto"/>
         <w:jc w:val="both"/>
+        <w:rPr>
+          <w:bCs/>
+          <w:sz w:val="24"/>
+          <w:szCs w:val="24"/>
+        </w:rPr>
+      </w:pPr>
+      <w:r>
         <w:rPr>
           <w:b/>
           <w:sz w:val="24"/>
           <w:szCs w:val="24"/>
         </w:rPr>
-      </w:pPr>
-    </w:p>
-    <w:p>
-      <w:pPr>
-        <w:spacing w:after="0" w:line="360" w:lineRule="auto"/>
-        <w:jc w:val="both"/>
+        <w:t xml:space="preserve">Nota: </w:t>
+      </w:r>
+      <w:r>
         <w:rPr>
-          <w:b/>
+          <w:bCs/>
           <w:sz w:val="24"/>
           <w:szCs w:val="24"/>
         </w:rPr>
-      </w:pPr>
+        <w:t>Documento se adjunta en el punto 9. Anexo</w:t>
+      </w:r>
     </w:p>
     <w:p>
       <w:pPr>
@@ -6568,18 +4922,26 @@
         <w:spacing w:after="0" w:line="360" w:lineRule="auto"/>
         <w:jc w:val="both"/>
         <w:rPr>
-          <w:b/>
-          <w:sz w:val="44"/>
-          <w:szCs w:val="44"/>
+          <w:bCs/>
+          <w:sz w:val="24"/>
+          <w:szCs w:val="24"/>
         </w:rPr>
       </w:pPr>
       <w:r>
         <w:rPr>
           <w:b/>
-          <w:sz w:val="44"/>
-          <w:szCs w:val="44"/>
+          <w:sz w:val="24"/>
+          <w:szCs w:val="24"/>
         </w:rPr>
-        <w:t>Anexo</w:t>
+        <w:t xml:space="preserve">Nota: </w:t>
+      </w:r>
+      <w:r>
+        <w:rPr>
+          <w:bCs/>
+          <w:sz w:val="24"/>
+          <w:szCs w:val="24"/>
+        </w:rPr>
+        <w:t>Documento se adjunta en el punto 9. Anexo</w:t>
       </w:r>
     </w:p>
     <w:p>
@@ -6592,21 +4954,175 @@
           <w:szCs w:val="24"/>
         </w:rPr>
       </w:pPr>
-      <w:hyperlink r:id="rId8" w:history="1">
-        <w:r>
-          <w:rPr>
-            <w:rStyle w:val="Hipervnculo"/>
-            <w:b/>
-            <w:sz w:val="24"/>
-            <w:szCs w:val="24"/>
-          </w:rPr>
-          <w:t>Carta Gantt.xlsx</w:t>
-        </w:r>
-      </w:hyperlink>
+    </w:p>
+    <w:p>
+      <w:pPr>
+        <w:spacing w:after="0" w:line="360" w:lineRule="auto"/>
+        <w:jc w:val="both"/>
+        <w:rPr>
+          <w:b/>
+          <w:sz w:val="24"/>
+          <w:szCs w:val="24"/>
+        </w:rPr>
+      </w:pPr>
+    </w:p>
+    <w:tbl>
+      <w:tblPr>
+        <w:tblStyle w:val="afe"/>
+        <w:tblW w:w="9640" w:type="dxa"/>
+        <w:tblInd w:w="-714" w:type="dxa"/>
+        <w:tblBorders>
+          <w:top w:val="single" w:sz="4" w:space="0" w:color="BFBFBF"/>
+          <w:left w:val="single" w:sz="4" w:space="0" w:color="BFBFBF"/>
+          <w:bottom w:val="single" w:sz="4" w:space="0" w:color="BFBFBF"/>
+          <w:right w:val="single" w:sz="4" w:space="0" w:color="BFBFBF"/>
+          <w:insideH w:val="single" w:sz="4" w:space="0" w:color="BFBFBF"/>
+          <w:insideV w:val="single" w:sz="4" w:space="0" w:color="BFBFBF"/>
+        </w:tblBorders>
+        <w:tblLayout w:type="fixed"/>
+        <w:tblLook w:val="0400" w:firstRow="0" w:lastRow="0" w:firstColumn="0" w:lastColumn="0" w:noHBand="0" w:noVBand="1"/>
+      </w:tblPr>
+      <w:tblGrid>
+        <w:gridCol w:w="9640"/>
+      </w:tblGrid>
+      <w:tr>
+        <w:trPr>
+          <w:trHeight w:val="440"/>
+        </w:trPr>
+        <w:tc>
+          <w:tcPr>
+            <w:tcW w:w="9640" w:type="dxa"/>
+            <w:vAlign w:val="center"/>
+          </w:tcPr>
+          <w:p>
+            <w:pPr>
+              <w:rPr>
+                <w:b/>
+                <w:color w:val="1F3864"/>
+                <w:sz w:val="28"/>
+                <w:szCs w:val="28"/>
+              </w:rPr>
+            </w:pPr>
+            <w:r>
+              <w:rPr>
+                <w:b/>
+                <w:color w:val="1F3864"/>
+                <w:sz w:val="28"/>
+                <w:szCs w:val="28"/>
+              </w:rPr>
+              <w:t>9</w:t>
+            </w:r>
+            <w:r>
+              <w:rPr>
+                <w:b/>
+                <w:color w:val="1F3864"/>
+                <w:sz w:val="28"/>
+                <w:szCs w:val="28"/>
+              </w:rPr>
+              <w:t xml:space="preserve">. </w:t>
+            </w:r>
+            <w:r>
+              <w:rPr>
+                <w:b/>
+                <w:color w:val="1F3864"/>
+                <w:sz w:val="28"/>
+                <w:szCs w:val="28"/>
+              </w:rPr>
+              <w:t>Anexo</w:t>
+            </w:r>
+            <w:r>
+              <w:rPr>
+                <w:b/>
+                <w:color w:val="1F3864"/>
+                <w:sz w:val="28"/>
+                <w:szCs w:val="28"/>
+              </w:rPr>
+              <w:t xml:space="preserve"> </w:t>
+            </w:r>
+          </w:p>
+        </w:tc>
+      </w:tr>
+      <w:tr>
+        <w:trPr>
+          <w:trHeight w:val="440"/>
+        </w:trPr>
+        <w:tc>
+          <w:tcPr>
+            <w:tcW w:w="9640" w:type="dxa"/>
+            <w:vAlign w:val="center"/>
+          </w:tcPr>
+          <w:p>
+            <w:pPr>
+              <w:spacing w:after="0" w:line="360" w:lineRule="auto"/>
+              <w:jc w:val="both"/>
+            </w:pPr>
+            <w:r>
+              <w:rPr>
+                <w:color w:val="1F3864"/>
+              </w:rPr>
+              <w:t xml:space="preserve"> </w:t>
+            </w:r>
+            <w:hyperlink r:id="rId8" w:history="1">
+              <w:r>
+                <w:rPr>
+                  <w:rStyle w:val="Hipervnculo"/>
+                  <w:b/>
+                  <w:sz w:val="24"/>
+                  <w:szCs w:val="24"/>
+                </w:rPr>
+                <w:t>Carta Gantt.xlsx</w:t>
+              </w:r>
+            </w:hyperlink>
+          </w:p>
+          <w:p>
+            <w:pPr>
+              <w:spacing w:after="0" w:line="360" w:lineRule="auto"/>
+              <w:jc w:val="both"/>
+              <w:rPr>
+                <w:b/>
+                <w:sz w:val="24"/>
+                <w:szCs w:val="24"/>
+              </w:rPr>
+            </w:pPr>
+            <w:hyperlink r:id="rId9" w:history="1">
+              <w:r>
+                <w:rPr>
+                  <w:rStyle w:val="Hipervnculo"/>
+                  <w:b/>
+                  <w:sz w:val="24"/>
+                  <w:szCs w:val="24"/>
+                </w:rPr>
+                <w:t>Plan de trabajo.xlsx</w:t>
+              </w:r>
+            </w:hyperlink>
+          </w:p>
+          <w:p>
+            <w:pPr>
+              <w:rPr>
+                <w:b/>
+                <w:color w:val="1F3864"/>
+                <w:sz w:val="28"/>
+                <w:szCs w:val="28"/>
+              </w:rPr>
+            </w:pPr>
+          </w:p>
+        </w:tc>
+      </w:tr>
+    </w:tbl>
+    <w:p>
+      <w:pPr>
+        <w:spacing w:after="0" w:line="360" w:lineRule="auto"/>
+        <w:jc w:val="both"/>
+        <w:rPr>
+          <w:b/>
+          <w:sz w:val="44"/>
+          <w:szCs w:val="44"/>
+        </w:rPr>
+      </w:pPr>
     </w:p>
     <w:p/>
     <w:sectPr>
-      <w:headerReference w:type="default" r:id="rId9"/>
+      <w:headerReference w:type="default" r:id="rId10"/>
       <w:pgSz w:w="11906" w:h="16838"/>
       <w:pgMar w:top="1417" w:right="1701" w:bottom="1417" w:left="1701" w:header="708" w:footer="708" w:gutter="0"/>
       <w:pgNumType w:start="1"/>
@@ -9438,6 +7954,7 @@
   <w:style w:type="character" w:default="1" w:styleId="Fuentedeprrafopredeter">
     <w:name w:val="Default Paragraph Font"/>
     <w:uiPriority w:val="1"/>
+    <w:semiHidden/>
     <w:unhideWhenUsed/>
   </w:style>
   <w:style w:type="table" w:default="1" w:styleId="Tablanormal">

</xml_diff>